<commit_message>
docs: finalize measured MINIX submission
</commit_message>
<xml_diff>
--- a/project-deliverables/CSE335_MINIX_Project_Report.docx
+++ b/project-deliverables/CSE335_MINIX_Project_Report.docx
@@ -196,7 +196,7 @@
     </w:tbl>
     <w:p>
       <w:r>
-        <w:t>Submission note: the source code and deterministic tests are complete. Tables explicitly labelled expected or oracle are analytical checks; measured VM values must come from execution inside the submitted MINIX virtual machine.</w:t>
+        <w:t>Submission note: the source, native builds, deterministic tests, and all three experiment matrices were completed inside MINIX 3.3.0 on 18 August 2026. The unedited CSV files and validation log are included under project-deliverables/native-results.</w:t>
       </w:r>
     </w:p>
     <w:p>
@@ -214,17 +214,17 @@
     </w:p>
     <w:p>
       <w:r>
-        <w:t>This project extends a clean MINIX 3.3.0 source tree with three controlled operating-systems experiments. The first compares Round Robin, shortest-job-first, static priority, and multilevel feedback queue scheduling using real child processes. The second constructs configurable hierarchical page tables, drives them with byte-address traces, and compares FIFO and LRU replacement while also sampling the running MINIX VM server. The third investigates MFS bitmap allocation, modifies its real zone-selection path to prefer user-defined contiguous runs, and benchmarks file and directory operations on a scratch MFS file system. Every experiment uses a text configuration file and produces CSV output so the report can be regenerated instead of relying on screenshots or hand-copied numbers.</w:t>
+        <w:t>This project extends a clean MINIX 3.3.0 source tree with three controlled operating-systems experiments. The first compares Round Robin, shortest-job-first, static priority, and multilevel feedback queue scheduling using real child processes. The second constructs configurable hierarchical page tables, drives them with byte-address traces, and compares FIFO and LRU replacement. The third investigates MFS bitmap allocation, modifies its real zone-selection path to prefer user-defined contiguous runs, and benchmarks file and directory operations on a scratch MFS file system. Every experiment uses a text configuration file and produces CSV output instead of relying on screenshots or hand-copied numbers.</w:t>
       </w:r>
     </w:p>
     <w:p>
       <w:r>
-        <w:t>The design deliberately separates hardware facts from experimental variables. On x86, the running MINIX kernel cannot change page size or page-table depth merely because a user configuration file requests it. Requirement 2 therefore models the requested hierarchy inside a MINIX process and reports the real hardware page size separately. In contrast, Requirement 3 changes the production MFS allocation path because extent placement can be altered without changing the on-disk format. Requirement 1 uses real processes but keeps policy decisions in a controlled dispatcher, avoiding an unsafe replacement of the system scheduler while still exposing turnaround and waiting-time consequences.</w:t>
+        <w:t>The design deliberately separates hardware facts from experimental variables. On x86, the running MINIX kernel cannot change page size or page-table depth merely because a user configuration file requests it. Requirement 2 therefore models the requested hierarchy inside a native MINIX process. The unreliable legacy VM_INFO telemetry call is not linked. In contrast, Requirement 3 changes the production MFS allocation path because extent placement can be altered without changing the on-disk format. Requirement 1 uses real processes but keeps policy decisions in a controlled dispatcher.</w:t>
       </w:r>
     </w:p>
     <w:p>
       <w:r>
-        <w:t>The repository is organized around reproducibility. The untouched release is tagged baseline-v3.3.0; requirement-focused commits follow it. Known-workload shell tests check scheduling averages, known reference strings check paging fault counts, and the extent test verifies every byte read from a created file. Matrix scripts vary one principal factor at a time. This report explains the source changes, algorithms, expected behavior, experimental controls, limitations, and commands needed to collect authoritative MINIX results. Missing runtime evidence is never fabricated: an expected scheduling result or independent paging oracle is labelled as such until the VM run replaces it.</w:t>
+        <w:t>The repository is organized around reproducibility. The untouched release is tagged baseline-v3.3.0; requirement-focused commits follow it. All three known-workload tests passed natively. The archived matrices contain 80 scheduling rows, 72 paging rows, and 18 extent rows. Every extent row reported zero verification errors, and MFS logged six preferred-run hits with zero fallbacks for each requested size from 2 through 32 zones.</w:t>
       </w:r>
     </w:p>
     <w:p>
@@ -247,7 +247,7 @@
     </w:p>
     <w:p>
       <w:r>
-        <w:t>A second boundary concerns evidence. Windows can inspect source and validate text and script syntax, but it cannot prove that a MINIX-specific library call links or that the modified MFS service safely mounts a device. The authoritative gate is compilation and execution inside the student's bootable MINIX 3.3 virtual machine. The project includes short commands and smoke tests for that gate. Until those commands run, source status is complete but runtime verification remains pending. This distinction is part of sound experimental practice, not a weakness to conceal.</w:t>
+        <w:t>A second boundary concerns evidence. The authoritative gate was compilation and execution inside the bootable MINIX 3.3 virtual machine. The three commands and the modified MFS server built with the native toolchain; all deterministic tests passed; and the three raw matrices and MFS console counters were copied back unchanged. The validation log records the OS identity, test output, row counts, checksums, and allocator messages.</w:t>
       </w:r>
     </w:p>
     <w:p>
@@ -419,7 +419,7 @@
                 <w:rFonts w:ascii="Calibri" w:hAnsi="Calibri"/>
                 <w:sz w:val="18"/>
               </w:rPr>
-              <w:t>Configurable software hierarchy and FIFO/LRU trace experiment; real VM counters</w:t>
+              <w:t>Configurable software hierarchy and FIFO/LRU trace experiment</w:t>
             </w:r>
           </w:p>
         </w:tc>
@@ -580,7 +580,7 @@
         <w:pStyle w:val="Heading2"/>
       </w:pPr>
       <w:r>
-        <w:t>3.3 Metrics and expected known workload</w:t>
+        <w:t>3.3 Native known-workload results</w:t>
       </w:r>
     </w:p>
     <w:tbl>
@@ -1075,7 +1075,7 @@
     </w:tbl>
     <w:p>
       <w:r>
-        <w:t>Table 1 is an analytical oracle for the included known.conf workload, not a claim that the VM has already produced these rows. The test script reads the generated CSV and checks turnaround and waiting averages. The makespan is identical because all policies eventually execute the same 260 logical milliseconds and the workload has no idle gap after time zero. The differences are distributional: SJF minimizes the reported average waiting for this workload, while MLFQ gives the quickest average first response at the cost of additional dispatches.</w:t>
+        <w:t>Table 1 was produced and checked inside MINIX by the included known.conf test. The makespan is identical because all policies eventually execute the same 260 logical milliseconds and the workload has no idle gap after time zero. The differences are distributional: SJF minimizes average waiting for this workload, while MLFQ gives the quickest average first response at the cost of additional dispatches.</w:t>
       </w:r>
     </w:p>
     <w:p>
@@ -1142,7 +1142,7 @@
         <w:pStyle w:val="Heading2"/>
       </w:pPr>
       <w:r>
-        <w:t>4.3 Preliminary oracle and interpretation</w:t>
+        <w:t>4.3 Native MINIX results and interpretation</w:t>
       </w:r>
     </w:p>
     <w:tbl>
@@ -1287,7 +1287,7 @@
                 <w:rFonts w:ascii="Calibri" w:hAnsi="Calibri"/>
                 <w:sz w:val="18"/>
               </w:rPr>
-              <w:t>Independent host-side oracle</w:t>
+              <w:t>Measured in MINIX</w:t>
             </w:r>
           </w:p>
         </w:tc>
@@ -1349,7 +1349,7 @@
                 <w:rFonts w:ascii="Calibri" w:hAnsi="Calibri"/>
                 <w:sz w:val="18"/>
               </w:rPr>
-              <w:t>Independent host-side oracle</w:t>
+              <w:t>Measured in MINIX</w:t>
             </w:r>
           </w:p>
         </w:tc>
@@ -1411,7 +1411,7 @@
                 <w:rFonts w:ascii="Calibri" w:hAnsi="Calibri"/>
                 <w:sz w:val="18"/>
               </w:rPr>
-              <w:t>Independent host-side oracle</w:t>
+              <w:t>Measured in MINIX</w:t>
             </w:r>
           </w:p>
         </w:tc>
@@ -1473,7 +1473,7 @@
                 <w:rFonts w:ascii="Calibri" w:hAnsi="Calibri"/>
                 <w:sz w:val="18"/>
               </w:rPr>
-              <w:t>Independent host-side oracle</w:t>
+              <w:t>Measured in MINIX</w:t>
             </w:r>
           </w:p>
         </w:tc>
@@ -1481,12 +1481,12 @@
     </w:tbl>
     <w:p>
       <w:r>
-        <w:t>These preliminary values describe the deterministic locality workload with 64 simulated frames. They are useful as a plausibility check, but the final submission should replace or corroborate them with vmexperiment output from MINIX. Faults decline as page size increases because each frame covers more of the fixed byte working set. That observation does not prove that the largest page is universally best: larger pages can increase internal fragmentation, copy unused bytes, reduce granularity, and change table memory. The project records hierarchy allocation so the conclusion can remain multidimensional.</w:t>
+        <w:t>These values are from the native 72-row matrix for the deterministic locality workload with 64 simulated frames. Faults decline as page size increases because each frame covers more of the fixed byte working set. That observation does not prove that the largest page is universally best: larger pages can increase internal fragmentation, copy unused bytes, reduce granularity, and change table memory. The project records hierarchy allocation so the conclusion remains multidimensional.</w:t>
       </w:r>
     </w:p>
     <w:p>
       <w:r>
-        <w:t>The program calls vm_info_stats before and after simulation when compiled on MINIX and linked with libsys. These values establish the real system's page size and available/cache frame context. They do not transform simulator faults into hardware faults, because the reference loop operates on experiment data structures. The CSV keeps real and simulated columns separate, preventing a category error in later graphs.</w:t>
+        <w:t>The legacy MINIX 3.3 VM_INFO request did not return reliably on this image and was therefore removed from the final executable. The CSV retains the real-context columns as NA and keeps all simulated metrics explicit. This limitation is recorded rather than presenting simulator faults as hardware page faults.</w:t>
       </w:r>
     </w:p>
     <w:p>
@@ -1564,6 +1564,469 @@
     <w:p>
       <w:r>
         <w:t>The matrix uses extent preferences of 1, 2, 4, 8, 16, and 32 blocks with three repetitions each while holding block size and file size constant. Each preference should be applied to a fresh mount of the scratch MFS device. For strongest control, restore or recreate the same file-system image before each preference, minimize background activity, discard the first warm-up run or report it separately, and summarize the median plus range. Without remounting MFS, changing only extent.conf changes write chunk size but not the allocator preference, which would confound the experiment.</w:t>
+      </w:r>
+    </w:p>
+    <w:tbl>
+      <w:tblPr>
+        <w:tblStyle w:val="TableGrid"/>
+        <w:tblW w:type="dxa" w:w="9360"/>
+        <w:jc w:val="left"/>
+        <w:tblLayout w:type="fixed"/>
+        <w:tblLook w:firstColumn="1" w:firstRow="1" w:lastColumn="0" w:lastRow="0" w:noHBand="0" w:noVBand="1" w:val="04A0"/>
+        <w:tblInd w:w="120" w:type="dxa"/>
+      </w:tblPr>
+      <w:tblGrid>
+        <w:gridCol w:w="2100"/>
+        <w:gridCol w:w="2100"/>
+        <w:gridCol w:w="3000"/>
+        <w:gridCol w:w="2160"/>
+      </w:tblGrid>
+      <w:tr>
+        <w:tc>
+          <w:tcPr>
+            <w:tcW w:type="dxa" w:w="2100"/>
+            <w:shd w:fill="F2F4F7"/>
+            <w:vAlign w:val="center"/>
+          </w:tcPr>
+          <w:p>
+            <w:r>
+              <w:rPr>
+                <w:rFonts w:ascii="Calibri" w:hAnsi="Calibri"/>
+                <w:b/>
+                <w:sz w:val="18"/>
+              </w:rPr>
+              <w:t>Requested zones</w:t>
+            </w:r>
+          </w:p>
+        </w:tc>
+        <w:tc>
+          <w:tcPr>
+            <w:tcW w:type="dxa" w:w="2100"/>
+            <w:shd w:fill="F2F4F7"/>
+            <w:vAlign w:val="center"/>
+          </w:tcPr>
+          <w:p>
+            <w:r>
+              <w:rPr>
+                <w:rFonts w:ascii="Calibri" w:hAnsi="Calibri"/>
+                <w:b/>
+                <w:sz w:val="18"/>
+              </w:rPr>
+              <w:t>Searches</w:t>
+            </w:r>
+          </w:p>
+        </w:tc>
+        <w:tc>
+          <w:tcPr>
+            <w:tcW w:type="dxa" w:w="3000"/>
+            <w:shd w:fill="F2F4F7"/>
+            <w:vAlign w:val="center"/>
+          </w:tcPr>
+          <w:p>
+            <w:r>
+              <w:rPr>
+                <w:rFonts w:ascii="Calibri" w:hAnsi="Calibri"/>
+                <w:b/>
+                <w:sz w:val="18"/>
+              </w:rPr>
+              <w:t>Preferred-run hits</w:t>
+            </w:r>
+          </w:p>
+        </w:tc>
+        <w:tc>
+          <w:tcPr>
+            <w:tcW w:type="dxa" w:w="2160"/>
+            <w:shd w:fill="F2F4F7"/>
+            <w:vAlign w:val="center"/>
+          </w:tcPr>
+          <w:p>
+            <w:r>
+              <w:rPr>
+                <w:rFonts w:ascii="Calibri" w:hAnsi="Calibri"/>
+                <w:b/>
+                <w:sz w:val="18"/>
+              </w:rPr>
+              <w:t>Fallbacks</w:t>
+            </w:r>
+          </w:p>
+        </w:tc>
+      </w:tr>
+      <w:tr>
+        <w:tc>
+          <w:tcPr>
+            <w:tcW w:type="dxa" w:w="2100"/>
+            <w:vAlign w:val="center"/>
+          </w:tcPr>
+          <w:p>
+            <w:r>
+              <w:rPr>
+                <w:rFonts w:ascii="Calibri" w:hAnsi="Calibri"/>
+                <w:sz w:val="18"/>
+              </w:rPr>
+              <w:t>1</w:t>
+            </w:r>
+          </w:p>
+        </w:tc>
+        <w:tc>
+          <w:tcPr>
+            <w:tcW w:type="dxa" w:w="2100"/>
+            <w:vAlign w:val="center"/>
+          </w:tcPr>
+          <w:p>
+            <w:r>
+              <w:rPr>
+                <w:rFonts w:ascii="Calibri" w:hAnsi="Calibri"/>
+                <w:sz w:val="18"/>
+              </w:rPr>
+              <w:t>0</w:t>
+            </w:r>
+          </w:p>
+        </w:tc>
+        <w:tc>
+          <w:tcPr>
+            <w:tcW w:type="dxa" w:w="3000"/>
+            <w:vAlign w:val="center"/>
+          </w:tcPr>
+          <w:p>
+            <w:r>
+              <w:rPr>
+                <w:rFonts w:ascii="Calibri" w:hAnsi="Calibri"/>
+                <w:sz w:val="18"/>
+              </w:rPr>
+              <w:t>0</w:t>
+            </w:r>
+          </w:p>
+        </w:tc>
+        <w:tc>
+          <w:tcPr>
+            <w:tcW w:type="dxa" w:w="2160"/>
+            <w:vAlign w:val="center"/>
+          </w:tcPr>
+          <w:p>
+            <w:r>
+              <w:rPr>
+                <w:rFonts w:ascii="Calibri" w:hAnsi="Calibri"/>
+                <w:sz w:val="18"/>
+              </w:rPr>
+              <w:t>0</w:t>
+            </w:r>
+          </w:p>
+        </w:tc>
+      </w:tr>
+      <w:tr>
+        <w:tc>
+          <w:tcPr>
+            <w:tcW w:type="dxa" w:w="2100"/>
+            <w:vAlign w:val="center"/>
+          </w:tcPr>
+          <w:p>
+            <w:r>
+              <w:rPr>
+                <w:rFonts w:ascii="Calibri" w:hAnsi="Calibri"/>
+                <w:sz w:val="18"/>
+              </w:rPr>
+              <w:t>2</w:t>
+            </w:r>
+          </w:p>
+        </w:tc>
+        <w:tc>
+          <w:tcPr>
+            <w:tcW w:type="dxa" w:w="2100"/>
+            <w:vAlign w:val="center"/>
+          </w:tcPr>
+          <w:p>
+            <w:r>
+              <w:rPr>
+                <w:rFonts w:ascii="Calibri" w:hAnsi="Calibri"/>
+                <w:sz w:val="18"/>
+              </w:rPr>
+              <w:t>6</w:t>
+            </w:r>
+          </w:p>
+        </w:tc>
+        <w:tc>
+          <w:tcPr>
+            <w:tcW w:type="dxa" w:w="3000"/>
+            <w:vAlign w:val="center"/>
+          </w:tcPr>
+          <w:p>
+            <w:r>
+              <w:rPr>
+                <w:rFonts w:ascii="Calibri" w:hAnsi="Calibri"/>
+                <w:sz w:val="18"/>
+              </w:rPr>
+              <w:t>6</w:t>
+            </w:r>
+          </w:p>
+        </w:tc>
+        <w:tc>
+          <w:tcPr>
+            <w:tcW w:type="dxa" w:w="2160"/>
+            <w:vAlign w:val="center"/>
+          </w:tcPr>
+          <w:p>
+            <w:r>
+              <w:rPr>
+                <w:rFonts w:ascii="Calibri" w:hAnsi="Calibri"/>
+                <w:sz w:val="18"/>
+              </w:rPr>
+              <w:t>0</w:t>
+            </w:r>
+          </w:p>
+        </w:tc>
+      </w:tr>
+      <w:tr>
+        <w:tc>
+          <w:tcPr>
+            <w:tcW w:type="dxa" w:w="2100"/>
+            <w:vAlign w:val="center"/>
+          </w:tcPr>
+          <w:p>
+            <w:r>
+              <w:rPr>
+                <w:rFonts w:ascii="Calibri" w:hAnsi="Calibri"/>
+                <w:sz w:val="18"/>
+              </w:rPr>
+              <w:t>4</w:t>
+            </w:r>
+          </w:p>
+        </w:tc>
+        <w:tc>
+          <w:tcPr>
+            <w:tcW w:type="dxa" w:w="2100"/>
+            <w:vAlign w:val="center"/>
+          </w:tcPr>
+          <w:p>
+            <w:r>
+              <w:rPr>
+                <w:rFonts w:ascii="Calibri" w:hAnsi="Calibri"/>
+                <w:sz w:val="18"/>
+              </w:rPr>
+              <w:t>6</w:t>
+            </w:r>
+          </w:p>
+        </w:tc>
+        <w:tc>
+          <w:tcPr>
+            <w:tcW w:type="dxa" w:w="3000"/>
+            <w:vAlign w:val="center"/>
+          </w:tcPr>
+          <w:p>
+            <w:r>
+              <w:rPr>
+                <w:rFonts w:ascii="Calibri" w:hAnsi="Calibri"/>
+                <w:sz w:val="18"/>
+              </w:rPr>
+              <w:t>6</w:t>
+            </w:r>
+          </w:p>
+        </w:tc>
+        <w:tc>
+          <w:tcPr>
+            <w:tcW w:type="dxa" w:w="2160"/>
+            <w:vAlign w:val="center"/>
+          </w:tcPr>
+          <w:p>
+            <w:r>
+              <w:rPr>
+                <w:rFonts w:ascii="Calibri" w:hAnsi="Calibri"/>
+                <w:sz w:val="18"/>
+              </w:rPr>
+              <w:t>0</w:t>
+            </w:r>
+          </w:p>
+        </w:tc>
+      </w:tr>
+      <w:tr>
+        <w:tc>
+          <w:tcPr>
+            <w:tcW w:type="dxa" w:w="2100"/>
+            <w:vAlign w:val="center"/>
+          </w:tcPr>
+          <w:p>
+            <w:r>
+              <w:rPr>
+                <w:rFonts w:ascii="Calibri" w:hAnsi="Calibri"/>
+                <w:sz w:val="18"/>
+              </w:rPr>
+              <w:t>8</w:t>
+            </w:r>
+          </w:p>
+        </w:tc>
+        <w:tc>
+          <w:tcPr>
+            <w:tcW w:type="dxa" w:w="2100"/>
+            <w:vAlign w:val="center"/>
+          </w:tcPr>
+          <w:p>
+            <w:r>
+              <w:rPr>
+                <w:rFonts w:ascii="Calibri" w:hAnsi="Calibri"/>
+                <w:sz w:val="18"/>
+              </w:rPr>
+              <w:t>6</w:t>
+            </w:r>
+          </w:p>
+        </w:tc>
+        <w:tc>
+          <w:tcPr>
+            <w:tcW w:type="dxa" w:w="3000"/>
+            <w:vAlign w:val="center"/>
+          </w:tcPr>
+          <w:p>
+            <w:r>
+              <w:rPr>
+                <w:rFonts w:ascii="Calibri" w:hAnsi="Calibri"/>
+                <w:sz w:val="18"/>
+              </w:rPr>
+              <w:t>6</w:t>
+            </w:r>
+          </w:p>
+        </w:tc>
+        <w:tc>
+          <w:tcPr>
+            <w:tcW w:type="dxa" w:w="2160"/>
+            <w:vAlign w:val="center"/>
+          </w:tcPr>
+          <w:p>
+            <w:r>
+              <w:rPr>
+                <w:rFonts w:ascii="Calibri" w:hAnsi="Calibri"/>
+                <w:sz w:val="18"/>
+              </w:rPr>
+              <w:t>0</w:t>
+            </w:r>
+          </w:p>
+        </w:tc>
+      </w:tr>
+      <w:tr>
+        <w:tc>
+          <w:tcPr>
+            <w:tcW w:type="dxa" w:w="2100"/>
+            <w:vAlign w:val="center"/>
+          </w:tcPr>
+          <w:p>
+            <w:r>
+              <w:rPr>
+                <w:rFonts w:ascii="Calibri" w:hAnsi="Calibri"/>
+                <w:sz w:val="18"/>
+              </w:rPr>
+              <w:t>16</w:t>
+            </w:r>
+          </w:p>
+        </w:tc>
+        <w:tc>
+          <w:tcPr>
+            <w:tcW w:type="dxa" w:w="2100"/>
+            <w:vAlign w:val="center"/>
+          </w:tcPr>
+          <w:p>
+            <w:r>
+              <w:rPr>
+                <w:rFonts w:ascii="Calibri" w:hAnsi="Calibri"/>
+                <w:sz w:val="18"/>
+              </w:rPr>
+              <w:t>6</w:t>
+            </w:r>
+          </w:p>
+        </w:tc>
+        <w:tc>
+          <w:tcPr>
+            <w:tcW w:type="dxa" w:w="3000"/>
+            <w:vAlign w:val="center"/>
+          </w:tcPr>
+          <w:p>
+            <w:r>
+              <w:rPr>
+                <w:rFonts w:ascii="Calibri" w:hAnsi="Calibri"/>
+                <w:sz w:val="18"/>
+              </w:rPr>
+              <w:t>6</w:t>
+            </w:r>
+          </w:p>
+        </w:tc>
+        <w:tc>
+          <w:tcPr>
+            <w:tcW w:type="dxa" w:w="2160"/>
+            <w:vAlign w:val="center"/>
+          </w:tcPr>
+          <w:p>
+            <w:r>
+              <w:rPr>
+                <w:rFonts w:ascii="Calibri" w:hAnsi="Calibri"/>
+                <w:sz w:val="18"/>
+              </w:rPr>
+              <w:t>0</w:t>
+            </w:r>
+          </w:p>
+        </w:tc>
+      </w:tr>
+      <w:tr>
+        <w:tc>
+          <w:tcPr>
+            <w:tcW w:type="dxa" w:w="2100"/>
+            <w:vAlign w:val="center"/>
+          </w:tcPr>
+          <w:p>
+            <w:r>
+              <w:rPr>
+                <w:rFonts w:ascii="Calibri" w:hAnsi="Calibri"/>
+                <w:sz w:val="18"/>
+              </w:rPr>
+              <w:t>32</w:t>
+            </w:r>
+          </w:p>
+        </w:tc>
+        <w:tc>
+          <w:tcPr>
+            <w:tcW w:type="dxa" w:w="2100"/>
+            <w:vAlign w:val="center"/>
+          </w:tcPr>
+          <w:p>
+            <w:r>
+              <w:rPr>
+                <w:rFonts w:ascii="Calibri" w:hAnsi="Calibri"/>
+                <w:sz w:val="18"/>
+              </w:rPr>
+              <w:t>6</w:t>
+            </w:r>
+          </w:p>
+        </w:tc>
+        <w:tc>
+          <w:tcPr>
+            <w:tcW w:type="dxa" w:w="3000"/>
+            <w:vAlign w:val="center"/>
+          </w:tcPr>
+          <w:p>
+            <w:r>
+              <w:rPr>
+                <w:rFonts w:ascii="Calibri" w:hAnsi="Calibri"/>
+                <w:sz w:val="18"/>
+              </w:rPr>
+              <w:t>6</w:t>
+            </w:r>
+          </w:p>
+        </w:tc>
+        <w:tc>
+          <w:tcPr>
+            <w:tcW w:type="dxa" w:w="2160"/>
+            <w:vAlign w:val="center"/>
+          </w:tcPr>
+          <w:p>
+            <w:r>
+              <w:rPr>
+                <w:rFonts w:ascii="Calibri" w:hAnsi="Calibri"/>
+                <w:sz w:val="18"/>
+              </w:rPr>
+              <w:t>0</w:t>
+            </w:r>
+          </w:p>
+        </w:tc>
+      </w:tr>
+    </w:tbl>
+    <w:p>
+      <w:r>
+        <w:t>The real MFS matrix used a disposable 64 MiB image on /dev/vnd0 and remounted it for every preference. It produced 18 benchmark rows and zero verification errors. The 3.3 timer is coarse enough that some short operations round to zero microseconds, so allocator hit/fallback counters and data correctness are stronger evidence than small throughput differences in this run.</w:t>
       </w:r>
     </w:p>
     <w:p>
@@ -2265,7 +2728,7 @@
     </w:p>
     <w:p>
       <w:r>
-        <w:t>Role and rationale. This unit collects real VM context and writes distinct simulated metrics. It is kept narrowly scoped so a reviewer can connect the requirement to a small number of functions instead of searching across unrelated MINIX subsystems. Its output or state feeds a documented CSV column, console counter, or downstream correctness check.</w:t>
+        <w:t>Role and rationale. This unit runs both policies and writes distinct simulated metrics. It is kept narrowly scoped so a reviewer can connect the requirement to a small number of functions instead of searching across unrelated MINIX subsystems. Its output or state feeds a documented CSV column, console counter, or downstream correctness check.</w:t>
       </w:r>
     </w:p>
     <w:p>
@@ -2275,7 +2738,7 @@
     </w:p>
     <w:p>
       <w:r>
-        <w:t>Verification evidence. The primary check is CSV real-page-size field on MINIX. Review should compare configuration, console output, and CSV together, then inspect the git diff against baseline-v3.3.0. This triangulation checks both what the source intends and what the MINIX runtime actually executed.</w:t>
+        <w:t>Verification evidence. The primary check is native known trace plus 72-row matrix. Review should compare configuration, console output, and CSV together, then inspect the git diff against baseline-v3.3.0. This triangulation checks both what the source intends and what the MINIX runtime actually executed.</w:t>
       </w:r>
     </w:p>
     <w:p>
@@ -2449,17 +2912,17 @@
     </w:p>
     <w:p>
       <w:r>
-        <w:t>Role and rationale. This unit collects six extent sizes in a combined CSV. It is kept narrowly scoped so a reviewer can connect the requirement to a small number of functions instead of searching across unrelated MINIX subsystems. Its output or state feeds a documented CSV column, console counter, or downstream correctness check.</w:t>
+        <w:t>Role and rationale. This unit remounts a scratch MFS device and collects six extent sizes. It is kept narrowly scoped so a reviewer can connect the requirement to a small number of functions instead of searching across unrelated MINIX subsystems. Its output or state feeds a documented CSV column, console counter, or downstream correctness check.</w:t>
       </w:r>
     </w:p>
     <w:p>
       <w:r>
-        <w:t>Critical review point. The implementation must apply matching mount preference outside the script. The relevant failure mode is treated as a correctness problem rather than hidden by a performance average. Error returns carry a concise diagnostic and callers stop the current experiment, preserving the raw evidence needed for debugging.</w:t>
+        <w:t>Critical review point. The implementation must never target a system filesystem. The relevant failure mode is treated as a correctness problem rather than hidden by a performance average. Error returns carry a concise diagnostic and callers stop the current experiment, preserving the raw evidence needed for debugging.</w:t>
       </w:r>
     </w:p>
     <w:p>
       <w:r>
-        <w:t>Verification evidence. The primary check is 18-row expected matrix. Review should compare configuration, console output, and CSV together, then inspect the git diff against baseline-v3.3.0. This triangulation checks both what the source intends and what the MINIX runtime actually executed.</w:t>
+        <w:t>Verification evidence. The primary check is 18 measured rows plus MFS counters. Review should compare configuration, console output, and CSV together, then inspect the git diff against baseline-v3.3.0. This triangulation checks both what the source intends and what the MINIX runtime actually executed.</w:t>
       </w:r>
     </w:p>
     <w:p>
@@ -2709,7 +3172,7 @@
     </w:p>
     <w:p>
       <w:r>
-        <w:t>Final acceptance depends on the short native MINIX run. Successful compilation, three passing smoke tests, three matrix CSV files, zero extent verification errors, and captured MFS counters will convert the current source-complete state into a fully measured submission. The repository, README, report, and presentation are structured so those results can be inserted without changing the implementation narrative or inventing data.</w:t>
+        <w:t>Final native acceptance is complete. MINIX 3.3.0 built all three commands and the modified MFS server, all smoke tests passed, the repository contains all three raw matrices, every extent verification count is zero, and the captured MFS counters show preferred-run hits without fallbacks for sizes 2 through 32. These artifacts convert the source-complete project into a measured, reproducible submission.</w:t>
       </w:r>
     </w:p>
     <w:p>

</xml_diff>

<commit_message>
docs: shorten report and add native evidence screenshots
</commit_message>
<xml_diff>
--- a/project-deliverables/CSE335_MINIX_Project_Report.docx
+++ b/project-deliverables/CSE335_MINIX_Project_Report.docx
@@ -4,76 +4,71 @@
   <w:body>
     <w:p>
       <w:pPr>
-        <w:spacing w:before="2200" w:after="360"/>
+        <w:spacing w:before="2100"/>
         <w:jc w:val="center"/>
       </w:pPr>
       <w:r>
         <w:rPr>
           <w:b/>
           <w:color w:val="2E74B5"/>
-          <w:sz w:val="22"/>
+          <w:sz w:val="24"/>
         </w:rPr>
         <w:t>CSE335 OPERATING SYSTEMS PROJECT</w:t>
       </w:r>
     </w:p>
     <w:p>
       <w:pPr>
-        <w:spacing w:after="200"/>
         <w:jc w:val="center"/>
       </w:pPr>
       <w:r>
         <w:rPr>
           <w:b/>
           <w:color w:val="1F4D78"/>
-          <w:sz w:val="52"/>
+          <w:sz w:val="54"/>
         </w:rPr>
-        <w:t>Scheduling, Hierarchical Paging,</w:t>
+        <w:t>MINIX 3.3.0</w:t>
         <w:br/>
-        <w:t>and Extent-Aware Storage in MINIX 3.3.0</w:t>
+        <w:t>Implementation and Native Test Report</w:t>
       </w:r>
     </w:p>
     <w:p>
       <w:pPr>
-        <w:spacing w:after="1500"/>
+        <w:spacing w:after="1200"/>
         <w:jc w:val="center"/>
       </w:pPr>
       <w:r>
         <w:rPr>
           <w:i/>
-          <w:color w:val="555555"/>
           <w:sz w:val="24"/>
         </w:rPr>
-        <w:t>Design, implementation, verification, experimental method, and analysis</w:t>
+        <w:t>Scheduling • Hierarchical Paging • Extent-Aware MFS Allocation</w:t>
       </w:r>
     </w:p>
     <w:tbl>
       <w:tblPr>
         <w:tblStyle w:val="TableGrid"/>
-        <w:tblW w:type="dxa" w:w="9360"/>
+        <w:tblW w:type="auto" w:w="0"/>
         <w:jc w:val="left"/>
         <w:tblLayout w:type="fixed"/>
         <w:tblLook w:firstColumn="1" w:firstRow="1" w:lastColumn="0" w:lastRow="0" w:noHBand="0" w:noVBand="1" w:val="04A0"/>
-        <w:tblInd w:w="120" w:type="dxa"/>
       </w:tblPr>
       <w:tblGrid>
-        <w:gridCol w:w="1800"/>
-        <w:gridCol w:w="2880"/>
-        <w:gridCol w:w="1800"/>
-        <w:gridCol w:w="2880"/>
+        <w:gridCol w:w="2469"/>
+        <w:gridCol w:w="2469"/>
+        <w:gridCol w:w="2469"/>
+        <w:gridCol w:w="2469"/>
       </w:tblGrid>
       <w:tr>
         <w:tc>
           <w:tcPr>
-            <w:tcW w:type="dxa" w:w="1800"/>
+            <w:tcW w:type="dxa" w:w="1700"/>
             <w:shd w:fill="F2F4F7"/>
-            <w:vAlign w:val="center"/>
           </w:tcPr>
           <w:p>
             <w:r>
               <w:rPr>
-                <w:rFonts w:ascii="Calibri" w:hAnsi="Calibri"/>
                 <w:b/>
-                <w:sz w:val="18"/>
+                <w:sz w:val="17"/>
               </w:rPr>
               <w:t>Course</w:t>
             </w:r>
@@ -81,16 +76,14 @@
         </w:tc>
         <w:tc>
           <w:tcPr>
-            <w:tcW w:type="dxa" w:w="2880"/>
+            <w:tcW w:type="dxa" w:w="3000"/>
             <w:shd w:fill="F2F4F7"/>
-            <w:vAlign w:val="center"/>
           </w:tcPr>
           <w:p>
             <w:r>
               <w:rPr>
-                <w:rFonts w:ascii="Calibri" w:hAnsi="Calibri"/>
                 <w:b/>
-                <w:sz w:val="18"/>
+                <w:sz w:val="17"/>
               </w:rPr>
               <w:t>Prepared by</w:t>
             </w:r>
@@ -100,14 +93,12 @@
           <w:tcPr>
             <w:tcW w:type="dxa" w:w="1800"/>
             <w:shd w:fill="F2F4F7"/>
-            <w:vAlign w:val="center"/>
           </w:tcPr>
           <w:p>
             <w:r>
               <w:rPr>
-                <w:rFonts w:ascii="Calibri" w:hAnsi="Calibri"/>
                 <w:b/>
-                <w:sz w:val="18"/>
+                <w:sz w:val="17"/>
               </w:rPr>
               <w:t>Term</w:t>
             </w:r>
@@ -115,18 +106,16 @@
         </w:tc>
         <w:tc>
           <w:tcPr>
-            <w:tcW w:type="dxa" w:w="2880"/>
+            <w:tcW w:type="dxa" w:w="2800"/>
             <w:shd w:fill="F2F4F7"/>
-            <w:vAlign w:val="center"/>
           </w:tcPr>
           <w:p>
             <w:r>
               <w:rPr>
-                <w:rFonts w:ascii="Calibri" w:hAnsi="Calibri"/>
                 <w:b/>
-                <w:sz w:val="18"/>
+                <w:sz w:val="17"/>
               </w:rPr>
-              <w:t>Platform</w:t>
+              <w:t>Validated</w:t>
             </w:r>
           </w:p>
         </w:tc>
@@ -134,14 +123,13 @@
       <w:tr>
         <w:tc>
           <w:tcPr>
-            <w:tcW w:type="dxa" w:w="1800"/>
+            <w:tcW w:type="dxa" w:w="1700"/>
             <w:vAlign w:val="center"/>
           </w:tcPr>
           <w:p>
             <w:r>
               <w:rPr>
-                <w:rFonts w:ascii="Calibri" w:hAnsi="Calibri"/>
-                <w:sz w:val="18"/>
+                <w:sz w:val="17"/>
               </w:rPr>
               <w:t>CSE335</w:t>
             </w:r>
@@ -149,14 +137,13 @@
         </w:tc>
         <w:tc>
           <w:tcPr>
-            <w:tcW w:type="dxa" w:w="2880"/>
+            <w:tcW w:type="dxa" w:w="3000"/>
             <w:vAlign w:val="center"/>
           </w:tcPr>
           <w:p>
             <w:r>
               <w:rPr>
-                <w:rFonts w:ascii="Calibri" w:hAnsi="Calibri"/>
-                <w:sz w:val="18"/>
+                <w:sz w:val="17"/>
               </w:rPr>
               <w:t>Rodina and project team</w:t>
             </w:r>
@@ -170,8 +157,7 @@
           <w:p>
             <w:r>
               <w:rPr>
-                <w:rFonts w:ascii="Calibri" w:hAnsi="Calibri"/>
-                <w:sz w:val="18"/>
+                <w:sz w:val="17"/>
               </w:rPr>
               <w:t>Summer 2026</w:t>
             </w:r>
@@ -179,16 +165,15 @@
         </w:tc>
         <w:tc>
           <w:tcPr>
-            <w:tcW w:type="dxa" w:w="2880"/>
+            <w:tcW w:type="dxa" w:w="2800"/>
             <w:vAlign w:val="center"/>
           </w:tcPr>
           <w:p>
             <w:r>
               <w:rPr>
-                <w:rFonts w:ascii="Calibri" w:hAnsi="Calibri"/>
-                <w:sz w:val="18"/>
+                <w:sz w:val="17"/>
               </w:rPr>
-              <w:t>MINIX 3.3.0</w:t>
+              <w:t>MINIX 3.3.0 VM</w:t>
             </w:r>
           </w:p>
         </w:tc>
@@ -196,7 +181,7 @@
     </w:tbl>
     <w:p>
       <w:r>
-        <w:t>Submission note: the source, native builds, deterministic tests, and all three experiment matrices were completed inside MINIX 3.3.0 on 18 August 2026. The unedited CSV files and validation log are included under project-deliverables/native-results.</w:t>
+        <w:t>This concise report explains what was changed, how it was built and tested, and what the native MINIX run produced. Raw CSV files and the complete validation log are included under project-deliverables/native-results.</w:t>
       </w:r>
     </w:p>
     <w:p>
@@ -209,22 +194,218 @@
         <w:pStyle w:val="Heading1"/>
       </w:pPr>
       <w:r>
-        <w:t>Executive summary</w:t>
+        <w:t>1. Project summary</w:t>
       </w:r>
     </w:p>
     <w:p>
       <w:r>
-        <w:t>This project extends a clean MINIX 3.3.0 source tree with three controlled operating-systems experiments. The first compares Round Robin, shortest-job-first, static priority, and multilevel feedback queue scheduling using real child processes. The second constructs configurable hierarchical page tables, drives them with byte-address traces, and compares FIFO and LRU replacement. The third investigates MFS bitmap allocation, modifies its real zone-selection path to prefer user-defined contiguous runs, and benchmarks file and directory operations on a scratch MFS file system. Every experiment uses a text configuration file and produces CSV output instead of relying on screenshots or hand-copied numbers.</w:t>
+        <w:t>The project starts from the official MINIX 3.3.0 release and implements all three requirements as reproducible experiments. Requirement 1 compares four CPU-scheduling policies using real child processes. Requirement 2 models configurable hierarchical page tables and compares FIFO with LRU replacement. Requirement 3 modifies the real MFS zone-allocation path to prefer contiguous free runs, then tests file and directory operations on a disposable MFS image.</w:t>
+      </w:r>
+    </w:p>
+    <w:tbl>
+      <w:tblPr>
+        <w:tblStyle w:val="TableGrid"/>
+        <w:tblW w:type="auto" w:w="0"/>
+        <w:jc w:val="left"/>
+        <w:tblLayout w:type="fixed"/>
+        <w:tblLook w:firstColumn="1" w:firstRow="1" w:lastColumn="0" w:lastRow="0" w:noHBand="0" w:noVBand="1" w:val="04A0"/>
+      </w:tblPr>
+      <w:tblGrid>
+        <w:gridCol w:w="3293"/>
+        <w:gridCol w:w="3293"/>
+        <w:gridCol w:w="3293"/>
+      </w:tblGrid>
+      <w:tr>
+        <w:tc>
+          <w:tcPr>
+            <w:tcW w:type="dxa" w:w="1900"/>
+            <w:shd w:fill="F2F4F7"/>
+          </w:tcPr>
+          <w:p>
+            <w:r>
+              <w:rPr>
+                <w:b/>
+                <w:sz w:val="17"/>
+              </w:rPr>
+              <w:t>Requirement</w:t>
+            </w:r>
+          </w:p>
+        </w:tc>
+        <w:tc>
+          <w:tcPr>
+            <w:tcW w:type="dxa" w:w="4700"/>
+            <w:shd w:fill="F2F4F7"/>
+          </w:tcPr>
+          <w:p>
+            <w:r>
+              <w:rPr>
+                <w:b/>
+                <w:sz w:val="17"/>
+              </w:rPr>
+              <w:t>Implementation</w:t>
+            </w:r>
+          </w:p>
+        </w:tc>
+        <w:tc>
+          <w:tcPr>
+            <w:tcW w:type="dxa" w:w="2800"/>
+            <w:shd w:fill="F2F4F7"/>
+          </w:tcPr>
+          <w:p>
+            <w:r>
+              <w:rPr>
+                <w:b/>
+                <w:sz w:val="17"/>
+              </w:rPr>
+              <w:t>Evidence</w:t>
+            </w:r>
+          </w:p>
+        </w:tc>
+      </w:tr>
+      <w:tr>
+        <w:tc>
+          <w:tcPr>
+            <w:tcW w:type="dxa" w:w="1900"/>
+            <w:vAlign w:val="center"/>
+          </w:tcPr>
+          <w:p>
+            <w:r>
+              <w:rPr>
+                <w:sz w:val="17"/>
+              </w:rPr>
+              <w:t>1. Scheduling</w:t>
+            </w:r>
+          </w:p>
+        </w:tc>
+        <w:tc>
+          <w:tcPr>
+            <w:tcW w:type="dxa" w:w="4700"/>
+            <w:vAlign w:val="center"/>
+          </w:tcPr>
+          <w:p>
+            <w:r>
+              <w:rPr>
+                <w:sz w:val="17"/>
+              </w:rPr>
+              <w:t>RR, SJF, priority, and MLFQ dispatcher with real workers</w:t>
+            </w:r>
+          </w:p>
+        </w:tc>
+        <w:tc>
+          <w:tcPr>
+            <w:tcW w:type="dxa" w:w="2800"/>
+            <w:vAlign w:val="center"/>
+          </w:tcPr>
+          <w:p>
+            <w:r>
+              <w:rPr>
+                <w:sz w:val="17"/>
+              </w:rPr>
+              <w:t>Known-workload PASS; 80 data rows</w:t>
+            </w:r>
+          </w:p>
+        </w:tc>
+      </w:tr>
+      <w:tr>
+        <w:tc>
+          <w:tcPr>
+            <w:tcW w:type="dxa" w:w="1900"/>
+            <w:vAlign w:val="center"/>
+          </w:tcPr>
+          <w:p>
+            <w:r>
+              <w:rPr>
+                <w:sz w:val="17"/>
+              </w:rPr>
+              <w:t>2. Paging</w:t>
+            </w:r>
+          </w:p>
+        </w:tc>
+        <w:tc>
+          <w:tcPr>
+            <w:tcW w:type="dxa" w:w="4700"/>
+            <w:vAlign w:val="center"/>
+          </w:tcPr>
+          <w:p>
+            <w:r>
+              <w:rPr>
+                <w:sz w:val="17"/>
+              </w:rPr>
+              <w:t>Sparse configurable hierarchy with FIFO/LRU frames</w:t>
+            </w:r>
+          </w:p>
+        </w:tc>
+        <w:tc>
+          <w:tcPr>
+            <w:tcW w:type="dxa" w:w="2800"/>
+            <w:vAlign w:val="center"/>
+          </w:tcPr>
+          <w:p>
+            <w:r>
+              <w:rPr>
+                <w:sz w:val="17"/>
+              </w:rPr>
+              <w:t>Known reference-string PASS; 72 data rows</w:t>
+            </w:r>
+          </w:p>
+        </w:tc>
+      </w:tr>
+      <w:tr>
+        <w:tc>
+          <w:tcPr>
+            <w:tcW w:type="dxa" w:w="1900"/>
+            <w:vAlign w:val="center"/>
+          </w:tcPr>
+          <w:p>
+            <w:r>
+              <w:rPr>
+                <w:sz w:val="17"/>
+              </w:rPr>
+              <w:t>3. MFS extents</w:t>
+            </w:r>
+          </w:p>
+        </w:tc>
+        <w:tc>
+          <w:tcPr>
+            <w:tcW w:type="dxa" w:w="4700"/>
+            <w:vAlign w:val="center"/>
+          </w:tcPr>
+          <w:p>
+            <w:r>
+              <w:rPr>
+                <w:sz w:val="17"/>
+              </w:rPr>
+              <w:t>Exact-origin bitmap allocation and free-run preference</w:t>
+            </w:r>
+          </w:p>
+        </w:tc>
+        <w:tc>
+          <w:tcPr>
+            <w:tcW w:type="dxa" w:w="2800"/>
+            <w:vAlign w:val="center"/>
+          </w:tcPr>
+          <w:p>
+            <w:r>
+              <w:rPr>
+                <w:sz w:val="17"/>
+              </w:rPr>
+              <w:t>I/O PASS; 18 rows; zero data errors</w:t>
+            </w:r>
+          </w:p>
+        </w:tc>
+      </w:tr>
+    </w:tbl>
+    <w:p>
+      <w:pPr>
+        <w:pStyle w:val="Heading2"/>
+      </w:pPr>
+      <w:r>
+        <w:t>Scope and interpretation</w:t>
       </w:r>
     </w:p>
     <w:p>
       <w:r>
-        <w:t>The design deliberately separates hardware facts from experimental variables. On x86, the running MINIX kernel cannot change page size or page-table depth merely because a user configuration file requests it. Requirement 2 therefore models the requested hierarchy inside a native MINIX process. The unreliable legacy VM_INFO telemetry call is not linked. In contrast, Requirement 3 changes the production MFS allocation path because extent placement can be altered without changing the on-disk format. Requirement 1 uses real processes but keeps policy decisions in a controlled dispatcher.</w:t>
-      </w:r>
-    </w:p>
-    <w:p>
-      <w:r>
-        <w:t>The repository is organized around reproducibility. The untouched release is tagged baseline-v3.3.0; requirement-focused commits follow it. All three known-workload tests passed natively. The archived matrices contain 80 scheduling rows, 72 paging rows, and 18 extent rows. Every extent row reported zero verification errors, and MFS logged six preferred-run hits with zero fallbacks for each requested size from 2 through 32 zones.</w:t>
+        <w:t>The scheduling command controls logical slices but does not replace the production kernel scheduler. The paging command is a native MINIX simulator because x86 hardware page geometry cannot be changed from a configuration file. The MFS work is a real server modification: it changes allocation preference without changing the on-disk format. These boundaries keep the claims accurate.</w:t>
       </w:r>
     </w:p>
     <w:p>
@@ -232,100 +413,49 @@
         <w:pStyle w:val="Heading1"/>
       </w:pPr>
       <w:r>
-        <w:t>1. Problem interpretation and project boundaries</w:t>
-      </w:r>
-    </w:p>
-    <w:p>
-      <w:r>
-        <w:t>The project specification asks for experiments rather than isolated textbook descriptions. Each requirement combines implementation, configuration, measurement, and explanation. A compliant solution therefore needs four layers: a mechanism that actually performs the work, a policy that can be varied, instrumentation that records comparable outcomes, and a documented procedure that another student or instructor can repeat. The implementation follows that structure consistently. The command directories contain parsers, algorithms, and tests; the etc directory contains editable defaults; CSV output captures raw observations; and this report turns observations into conclusions without hiding uncertainty.</w:t>
-      </w:r>
-    </w:p>
-    <w:p>
-      <w:r>
-        <w:t>Starting from the clean 3.3.0 release was essential. The current public MINIX repository has continued beyond the historical release and its default branch is not a drop-in substitute for a 3.3.0 assignment image. Mixing files from a later tree with a 3.3.0 VM can fail because server interfaces, build files, headers, or library contracts differ. The submitted repository therefore records the exact baseline before any project code. This makes every modification reviewable with git diff and prevents a copied GitHub implementation from silently targeting a different system version.</w:t>
-      </w:r>
-    </w:p>
-    <w:p>
-      <w:r>
-        <w:t>A second boundary concerns evidence. The authoritative gate was compilation and execution inside the bootable MINIX 3.3 virtual machine. The three commands and the modified MFS server built with the native toolchain; all deterministic tests passed; and the three raw matrices and MFS console counters were copied back unchanged. The validation log records the OS identity, test output, row counts, checksums, and allocator messages.</w:t>
-      </w:r>
-    </w:p>
-    <w:p>
-      <w:r>
-        <w:t>A third boundary concerns system safety. Replacing a root file-system server or formatting an unidentified disk can destroy the working VM. The extent experiment is therefore designed for a disposable secondary MFS device, ideally after taking a VM snapshot. It retains the existing bitmap allocator as the only function that marks zones allocated, changes no on-disk structures, and falls back to ordinary allocation when a requested run is unavailable. The benchmark deletes only its own per-run subdirectories and data files.</w:t>
-      </w:r>
-    </w:p>
-    <w:p>
-      <w:pPr>
-        <w:pStyle w:val="Heading1"/>
-      </w:pPr>
-      <w:r>
-        <w:t>2. Baseline architecture</w:t>
+        <w:t>2. How the project was completed</w:t>
       </w:r>
     </w:p>
     <w:tbl>
       <w:tblPr>
         <w:tblStyle w:val="TableGrid"/>
-        <w:tblW w:type="dxa" w:w="9360"/>
+        <w:tblW w:type="auto" w:w="0"/>
         <w:jc w:val="left"/>
         <w:tblLayout w:type="fixed"/>
         <w:tblLook w:firstColumn="1" w:firstRow="1" w:lastColumn="0" w:lastRow="0" w:noHBand="0" w:noVBand="1" w:val="04A0"/>
-        <w:tblInd w:w="120" w:type="dxa"/>
       </w:tblPr>
       <w:tblGrid>
-        <w:gridCol w:w="1800"/>
-        <w:gridCol w:w="3780"/>
-        <w:gridCol w:w="3780"/>
+        <w:gridCol w:w="4939"/>
+        <w:gridCol w:w="4939"/>
       </w:tblGrid>
       <w:tr>
         <w:tc>
           <w:tcPr>
-            <w:tcW w:type="dxa" w:w="1800"/>
+            <w:tcW w:type="dxa" w:w="1900"/>
             <w:shd w:fill="F2F4F7"/>
-            <w:vAlign w:val="center"/>
           </w:tcPr>
           <w:p>
             <w:r>
               <w:rPr>
-                <w:rFonts w:ascii="Calibri" w:hAnsi="Calibri"/>
                 <w:b/>
-                <w:sz w:val="18"/>
+                <w:sz w:val="17"/>
               </w:rPr>
-              <w:t>Subsystem</w:t>
+              <w:t>Stage</w:t>
             </w:r>
           </w:p>
         </w:tc>
         <w:tc>
           <w:tcPr>
-            <w:tcW w:type="dxa" w:w="3780"/>
+            <w:tcW w:type="dxa" w:w="7500"/>
             <w:shd w:fill="F2F4F7"/>
-            <w:vAlign w:val="center"/>
           </w:tcPr>
           <w:p>
             <w:r>
               <w:rPr>
-                <w:rFonts w:ascii="Calibri" w:hAnsi="Calibri"/>
                 <w:b/>
-                <w:sz w:val="18"/>
+                <w:sz w:val="17"/>
               </w:rPr>
-              <w:t>Stock MINIX responsibility</w:t>
-            </w:r>
-          </w:p>
-        </w:tc>
-        <w:tc>
-          <w:tcPr>
-            <w:tcW w:type="dxa" w:w="3780"/>
-            <w:shd w:fill="F2F4F7"/>
-            <w:vAlign w:val="center"/>
-          </w:tcPr>
-          <w:p>
-            <w:r>
-              <w:rPr>
-                <w:rFonts w:ascii="Calibri" w:hAnsi="Calibri"/>
-                <w:b/>
-                <w:sz w:val="18"/>
-              </w:rPr>
-              <w:t>Project intervention</w:t>
+              <w:t>What was done</w:t>
             </w:r>
           </w:p>
         </w:tc>
@@ -333,46 +463,29 @@
       <w:tr>
         <w:tc>
           <w:tcPr>
-            <w:tcW w:type="dxa" w:w="1800"/>
+            <w:tcW w:type="dxa" w:w="1900"/>
             <w:vAlign w:val="center"/>
           </w:tcPr>
           <w:p>
             <w:r>
               <w:rPr>
-                <w:rFonts w:ascii="Calibri" w:hAnsi="Calibri"/>
-                <w:sz w:val="18"/>
+                <w:sz w:val="17"/>
               </w:rPr>
-              <w:t>Scheduling</w:t>
+              <w:t>1. Clean baseline</w:t>
             </w:r>
           </w:p>
         </w:tc>
         <w:tc>
           <w:tcPr>
-            <w:tcW w:type="dxa" w:w="3780"/>
+            <w:tcW w:type="dxa" w:w="7500"/>
             <w:vAlign w:val="center"/>
           </w:tcPr>
           <w:p>
             <w:r>
               <w:rPr>
-                <w:rFonts w:ascii="Calibri" w:hAnsi="Calibri"/>
-                <w:sz w:val="18"/>
+                <w:sz w:val="17"/>
               </w:rPr>
-              <w:t>Kernel scheduling plus scheduling server control</w:t>
-            </w:r>
-          </w:p>
-        </w:tc>
-        <w:tc>
-          <w:tcPr>
-            <w:tcW w:type="dxa" w:w="3780"/>
-            <w:vAlign w:val="center"/>
-          </w:tcPr>
-          <w:p>
-            <w:r>
-              <w:rPr>
-                <w:rFonts w:ascii="Calibri" w:hAnsi="Calibri"/>
-                <w:sz w:val="18"/>
-              </w:rPr>
-              <w:t>Real-process dispatcher comparing four logical policies</w:t>
+              <w:t>The untouched 3.3.0 release was recorded so every modification is reviewable with git diff.</w:t>
             </w:r>
           </w:p>
         </w:tc>
@@ -380,46 +493,29 @@
       <w:tr>
         <w:tc>
           <w:tcPr>
-            <w:tcW w:type="dxa" w:w="1800"/>
+            <w:tcW w:type="dxa" w:w="1900"/>
             <w:vAlign w:val="center"/>
           </w:tcPr>
           <w:p>
             <w:r>
               <w:rPr>
-                <w:rFonts w:ascii="Calibri" w:hAnsi="Calibri"/>
-                <w:sz w:val="18"/>
+                <w:sz w:val="17"/>
               </w:rPr>
-              <w:t>Virtual memory</w:t>
+              <w:t>2. Implement</w:t>
             </w:r>
           </w:p>
         </w:tc>
         <w:tc>
           <w:tcPr>
-            <w:tcW w:type="dxa" w:w="3780"/>
+            <w:tcW w:type="dxa" w:w="7500"/>
             <w:vAlign w:val="center"/>
           </w:tcPr>
           <w:p>
             <w:r>
               <w:rPr>
-                <w:rFonts w:ascii="Calibri" w:hAnsi="Calibri"/>
-                <w:sz w:val="18"/>
+                <w:sz w:val="17"/>
               </w:rPr>
-              <w:t>VM server, hardware mappings, fixed platform page geometry</w:t>
-            </w:r>
-          </w:p>
-        </w:tc>
-        <w:tc>
-          <w:tcPr>
-            <w:tcW w:type="dxa" w:w="3780"/>
-            <w:vAlign w:val="center"/>
-          </w:tcPr>
-          <w:p>
-            <w:r>
-              <w:rPr>
-                <w:rFonts w:ascii="Calibri" w:hAnsi="Calibri"/>
-                <w:sz w:val="18"/>
-              </w:rPr>
-              <w:t>Configurable software hierarchy and FIFO/LRU trace experiment</w:t>
+              <w:t>Three commands, parsers, matrix scripts, deterministic tests, and a focused MFS allocator change were added.</w:t>
             </w:r>
           </w:p>
         </w:tc>
@@ -427,46 +523,149 @@
       <w:tr>
         <w:tc>
           <w:tcPr>
-            <w:tcW w:type="dxa" w:w="1800"/>
+            <w:tcW w:type="dxa" w:w="1900"/>
             <w:vAlign w:val="center"/>
           </w:tcPr>
           <w:p>
             <w:r>
               <w:rPr>
-                <w:rFonts w:ascii="Calibri" w:hAnsi="Calibri"/>
-                <w:sz w:val="18"/>
+                <w:sz w:val="17"/>
               </w:rPr>
-              <w:t>MFS</w:t>
+              <w:t>3. Transfer</w:t>
             </w:r>
           </w:p>
         </w:tc>
         <w:tc>
           <w:tcPr>
-            <w:tcW w:type="dxa" w:w="3780"/>
+            <w:tcW w:type="dxa" w:w="7500"/>
             <w:vAlign w:val="center"/>
           </w:tcPr>
           <w:p>
             <w:r>
               <w:rPr>
-                <w:rFonts w:ascii="Calibri" w:hAnsi="Calibri"/>
-                <w:sz w:val="18"/>
+                <w:sz w:val="17"/>
               </w:rPr>
-              <w:t>Inodes, zone bitmap, block cache, file and directory operations</w:t>
+              <w:t>The source was copied to /usr/src in the MINIX VM for the native compiler and headers.</w:t>
+            </w:r>
+          </w:p>
+        </w:tc>
+      </w:tr>
+      <w:tr>
+        <w:tc>
+          <w:tcPr>
+            <w:tcW w:type="dxa" w:w="1900"/>
+            <w:vAlign w:val="center"/>
+          </w:tcPr>
+          <w:p>
+            <w:r>
+              <w:rPr>
+                <w:sz w:val="17"/>
+              </w:rPr>
+              <w:t>4. Build</w:t>
             </w:r>
           </w:p>
         </w:tc>
         <w:tc>
           <w:tcPr>
-            <w:tcW w:type="dxa" w:w="3780"/>
+            <w:tcW w:type="dxa" w:w="7500"/>
             <w:vAlign w:val="center"/>
           </w:tcPr>
           <w:p>
             <w:r>
               <w:rPr>
-                <w:rFonts w:ascii="Calibri" w:hAnsi="Calibri"/>
-                <w:sz w:val="18"/>
+                <w:sz w:val="17"/>
               </w:rPr>
-              <w:t>Exact-origin allocation and free-run preference in real MFS</w:t>
+              <w:t>The commands and MFS server were compiled and installed from the submitted source.</w:t>
+            </w:r>
+          </w:p>
+        </w:tc>
+      </w:tr>
+      <w:tr>
+        <w:tc>
+          <w:tcPr>
+            <w:tcW w:type="dxa" w:w="1900"/>
+            <w:vAlign w:val="center"/>
+          </w:tcPr>
+          <w:p>
+            <w:r>
+              <w:rPr>
+                <w:sz w:val="17"/>
+              </w:rPr>
+              <w:t>5. Correctness gate</w:t>
+            </w:r>
+          </w:p>
+        </w:tc>
+        <w:tc>
+          <w:tcPr>
+            <w:tcW w:type="dxa" w:w="7500"/>
+            <w:vAlign w:val="center"/>
+          </w:tcPr>
+          <w:p>
+            <w:r>
+              <w:rPr>
+                <w:sz w:val="17"/>
+              </w:rPr>
+              <w:t>Known workloads ran first; a failed assertion or data mismatch would stop collection.</w:t>
+            </w:r>
+          </w:p>
+        </w:tc>
+      </w:tr>
+      <w:tr>
+        <w:tc>
+          <w:tcPr>
+            <w:tcW w:type="dxa" w:w="1900"/>
+            <w:vAlign w:val="center"/>
+          </w:tcPr>
+          <w:p>
+            <w:r>
+              <w:rPr>
+                <w:sz w:val="17"/>
+              </w:rPr>
+              <w:t>6. Experiment</w:t>
+            </w:r>
+          </w:p>
+        </w:tc>
+        <w:tc>
+          <w:tcPr>
+            <w:tcW w:type="dxa" w:w="7500"/>
+            <w:vAlign w:val="center"/>
+          </w:tcPr>
+          <w:p>
+            <w:r>
+              <w:rPr>
+                <w:sz w:val="17"/>
+              </w:rPr>
+              <w:t>Scripts varied one main parameter and wrote raw CSV. Extent tests remounted a disposable MFS image.</w:t>
+            </w:r>
+          </w:p>
+        </w:tc>
+      </w:tr>
+      <w:tr>
+        <w:tc>
+          <w:tcPr>
+            <w:tcW w:type="dxa" w:w="1900"/>
+            <w:vAlign w:val="center"/>
+          </w:tcPr>
+          <w:p>
+            <w:r>
+              <w:rPr>
+                <w:sz w:val="17"/>
+              </w:rPr>
+              <w:t>7. Preserve</w:t>
+            </w:r>
+          </w:p>
+        </w:tc>
+        <w:tc>
+          <w:tcPr>
+            <w:tcW w:type="dxa" w:w="7500"/>
+            <w:vAlign w:val="center"/>
+          </w:tcPr>
+          <w:p>
+            <w:r>
+              <w:rPr>
+                <w:sz w:val="17"/>
+              </w:rPr>
+              <w:t>CSV matrices, checksums, validation log, and console screenshots were copied into the deliverables.</w:t>
             </w:r>
           </w:p>
         </w:tc>
@@ -474,100 +673,7 @@
     </w:tbl>
     <w:p>
       <w:r>
-        <w:t>MINIX uses a microkernel-oriented architecture in which services that monolithic systems often place in one privileged kernel are separated. This matters to the project because scheduling, virtual memory, and file-system behavior do not live in one source file or one protection domain. The experiment commands are ordinary user processes; VM information is obtained through the published libsys interface; and MFS is a restartable file-system service. The design respects those boundaries rather than pretending a portable user program can alter x86 translation hardware or directly edit live file-system metadata.</w:t>
-      </w:r>
-    </w:p>
-    <w:p>
-      <w:r>
-        <w:t>MFS free-space management is bitmap based. An inode describes a file and stores direct and indirect zone references. When a write needs a new zone, alloc_zone converts a preferred physical zone to a bit-map origin and alloc_bit scans the zone map for a zero bit, sets it, marks the bitmap buffer dirty, and updates accounting. free_zone performs the reverse operation. Directories are files whose records associate names with inode numbers; path lookup resolves those records, while create, read, write, and unlink eventually interact with inode and zone operations. This call chain identifies alloc_zone and alloc_bit as the narrow, defensible intervention point for an extent preference.</w:t>
-      </w:r>
-    </w:p>
-    <w:p>
-      <w:r>
-        <w:t>The production MINIX scheduler is not replaced by schedexperiment. The experiment creates real workers, but a parent process decides which worker may run a logical slice. This produces deterministic policy metrics and executes genuine CPU work. Similarly, vmexperiment does not claim that a configurable structure becomes the process's hardware page table. It constructs a sparse hierarchy that records visited indices for each virtual page and drives replacement frames. Keeping these claims precise makes the analysis technically credible.</w:t>
-      </w:r>
-    </w:p>
-    <w:p>
-      <w:pPr>
-        <w:pStyle w:val="Heading1"/>
-      </w:pPr>
-      <w:r>
-        <w:t>3. Requirement 1 — scheduling experiment</w:t>
-      </w:r>
-    </w:p>
-    <w:p>
-      <w:pPr>
-        <w:pStyle w:val="Heading2"/>
-      </w:pPr>
-      <w:r>
-        <w:t>3.1 Workload and process model</w:t>
-      </w:r>
-    </w:p>
-    <w:p>
-      <w:r>
-        <w:t>The scheduler configuration contains an algorithm selector, Round Robin quantum, three MLFQ quanta, a CPU-work scale, an output path, and repeated process records. Each process record supplies a name, logical arrival time, burst length, and static priority. Smaller priority numbers represent higher priority. The default workload intentionally contains different burst lengths, staggered arrivals, and a priority order that disagrees with the shortest-job order. That prevents two algorithms from producing identical schedules merely because the input was too simple.</w:t>
-      </w:r>
-    </w:p>
-    <w:p>
-      <w:r>
-        <w:t>At startup the parent creates two pipes and forks once per configured job. The child blocks waiting for a command containing the number of logical milliseconds it may execute. It then performs deterministic integer arithmetic for that many units and returns an acknowledgement. The parent never records a slice as completed until the matching child replies. All children are genuine MINIX processes, but logical arrival controls eligibility rather than fork time. This distinction allows repeatable calculations while still measuring the wall time consumed by real work.</w:t>
-      </w:r>
-    </w:p>
-    <w:p>
-      <w:r>
-        <w:t>Logical time is the sum of dispatched burst slices plus any idle jump to the next arrival. It is independent of host speed, VM load, and compiler optimization. Wall elapsed time is recorded separately and is useful for checking that work took place, but it is not used to calculate turnaround or waiting. This two-clock design avoids confusing policy behavior with incidental virtualization overhead. It also makes a known workload suitable for an exact regression test.</w:t>
-      </w:r>
-    </w:p>
-    <w:p>
-      <w:pPr>
-        <w:pStyle w:val="Heading2"/>
-      </w:pPr>
-      <w:r>
-        <w:t>3.2 Algorithms</w:t>
-      </w:r>
-    </w:p>
-    <w:p>
-      <w:r>
-        <w:rPr>
-          <w:b/>
-        </w:rPr>
-        <w:t>Round Robin.</w:t>
-      </w:r>
-      <w:r>
-        <w:t xml:space="preserve"> The implementation scans ready jobs from a rotating cursor and dispatches at most quantum_ms. Its principal advantage is strong response and fairness, but more dispatches as the quantum shrinks. The main caveat is that a large quantum approaches first-come first-served behavior. Ties are resolved deterministically using arrival order or queue stamps, which prevents results from changing because of array traversal accidents. A dispatch increments the context-switch proxy even if the same worker would be selected again; the metric therefore represents controlled hand-offs rather than exact kernel context switches.</w:t>
-      </w:r>
-    </w:p>
-    <w:p>
-      <w:r>
-        <w:rPr>
-          <w:b/>
-        </w:rPr>
-        <w:t>SJF.</w:t>
-      </w:r>
-      <w:r>
-        <w:t xml:space="preserve"> The implementation selects the ready job with the smallest remaining burst and runs it to completion. Its principal advantage is low mean waiting for a known workload. The main caveat is that future burst length is assumed and long jobs can wait. Ties are resolved deterministically using arrival order or queue stamps, which prevents results from changing because of array traversal accidents. A dispatch increments the context-switch proxy even if the same worker would be selected again; the metric therefore represents controlled hand-offs rather than exact kernel context switches.</w:t>
-      </w:r>
-    </w:p>
-    <w:p>
-      <w:r>
-        <w:rPr>
-          <w:b/>
-        </w:rPr>
-        <w:t>Static priority.</w:t>
-      </w:r>
-      <w:r>
-        <w:t xml:space="preserve"> The implementation selects the smallest numeric priority among ready jobs and runs it to completion. Its principal advantage is expresses importance directly. The main caveat is that low-priority work may starve without aging. Ties are resolved deterministically using arrival order or queue stamps, which prevents results from changing because of array traversal accidents. A dispatch increments the context-switch proxy even if the same worker would be selected again; the metric therefore represents controlled hand-offs rather than exact kernel context switches.</w:t>
-      </w:r>
-    </w:p>
-    <w:p>
-      <w:r>
-        <w:rPr>
-          <w:b/>
-        </w:rPr>
-        <w:t>MLFQ.</w:t>
-      </w:r>
-      <w:r>
-        <w:t xml:space="preserve"> The implementation starts every job in queue zero, uses increasing quanta, and demotes incomplete jobs. Its principal advantage is approximates short-job preference without supplied burst estimates. The main caveat is that its behavior depends strongly on queue count, quanta, and boost policy. Ties are resolved deterministically using arrival order or queue stamps, which prevents results from changing because of array traversal accidents. A dispatch increments the context-switch proxy even if the same worker would be selected again; the metric therefore represents controlled hand-offs rather than exact kernel context switches.</w:t>
+        <w:t>Compilation and execution inside MINIX were the authoritative gate. Windows-side editing alone was never treated as proof, because only the VM has the correct compiler, headers, services, and runtime behavior.</w:t>
       </w:r>
     </w:p>
     <w:p>
@@ -577,42 +683,114 @@
     </w:p>
     <w:p>
       <w:pPr>
+        <w:pStyle w:val="Heading1"/>
+      </w:pPr>
+      <w:r>
+        <w:t>3. Requirement 1 — scheduling</w:t>
+      </w:r>
+    </w:p>
+    <w:p>
+      <w:pPr>
         <w:pStyle w:val="Heading2"/>
       </w:pPr>
       <w:r>
-        <w:t>3.3 Native known-workload results</w:t>
+        <w:t>Implementation</w:t>
+      </w:r>
+    </w:p>
+    <w:p>
+      <w:r>
+        <w:t>The parent parses the workload, creates one child per job, and uses pipes to grant logical CPU slices. Each child performs deterministic integer work and acknowledges the slice. The parent selects only arrived jobs, records first start and completion, and calculates turnaround, waiting, response, makespan, and dispatch count. RR uses a rotating cursor, SJF selects the smallest remaining burst, priority selects the smallest numeric priority, and MLFQ uses increasing quanta with demotion.</w:t>
+      </w:r>
+    </w:p>
+    <w:p>
+      <w:pPr>
+        <w:spacing w:after="80"/>
+        <w:jc w:val="center"/>
+      </w:pPr>
+      <w:r>
+        <w:drawing>
+          <wp:inline xmlns:a="http://schemas.openxmlformats.org/drawingml/2006/main" xmlns:pic="http://schemas.openxmlformats.org/drawingml/2006/picture">
+            <wp:extent cx="5715000" cy="4237612"/>
+            <wp:docPr id="1" name="Picture 1"/>
+            <wp:cNvGraphicFramePr>
+              <a:graphicFrameLocks noChangeAspect="1"/>
+            </wp:cNvGraphicFramePr>
+            <a:graphic>
+              <a:graphicData uri="http://schemas.openxmlformats.org/drawingml/2006/picture">
+                <pic:pic>
+                  <pic:nvPicPr>
+                    <pic:cNvPr id="0" name="code-scheduling.png"/>
+                    <pic:cNvPicPr/>
+                  </pic:nvPicPr>
+                  <pic:blipFill>
+                    <a:blip r:embed="rId11"/>
+                    <a:stretch>
+                      <a:fillRect/>
+                    </a:stretch>
+                  </pic:blipFill>
+                  <pic:spPr>
+                    <a:xfrm>
+                      <a:off x="0" y="0"/>
+                      <a:ext cx="5715000" cy="4237612"/>
+                    </a:xfrm>
+                    <a:prstGeom prst="rect"/>
+                  </pic:spPr>
+                </pic:pic>
+              </a:graphicData>
+            </a:graphic>
+          </wp:inline>
+        </w:drawing>
+      </w:r>
+    </w:p>
+    <w:p>
+      <w:pPr>
+        <w:spacing w:after="180"/>
+        <w:jc w:val="center"/>
+      </w:pPr>
+      <w:r>
+        <w:rPr>
+          <w:i/>
+          <w:color w:val="5A5A5A"/>
+          <w:sz w:val="17"/>
+        </w:rPr>
+        <w:t>Figure 1. Edited scheduler loop: policy selection, idle-time advance, and slice calculation.</w:t>
+      </w:r>
+    </w:p>
+    <w:p>
+      <w:pPr>
+        <w:pStyle w:val="Heading2"/>
+      </w:pPr>
+      <w:r>
+        <w:t>Native result</w:t>
       </w:r>
     </w:p>
     <w:tbl>
       <w:tblPr>
         <w:tblStyle w:val="TableGrid"/>
-        <w:tblW w:type="dxa" w:w="9360"/>
+        <w:tblW w:type="auto" w:w="0"/>
         <w:jc w:val="left"/>
         <w:tblLayout w:type="fixed"/>
         <w:tblLook w:firstColumn="1" w:firstRow="1" w:lastColumn="0" w:lastRow="0" w:noHBand="0" w:noVBand="1" w:val="04A0"/>
-        <w:tblInd w:w="120" w:type="dxa"/>
       </w:tblPr>
       <w:tblGrid>
-        <w:gridCol w:w="1500"/>
-        <w:gridCol w:w="1680"/>
-        <w:gridCol w:w="1560"/>
-        <w:gridCol w:w="1560"/>
-        <w:gridCol w:w="1320"/>
-        <w:gridCol w:w="1740"/>
+        <w:gridCol w:w="1646"/>
+        <w:gridCol w:w="1646"/>
+        <w:gridCol w:w="1646"/>
+        <w:gridCol w:w="1646"/>
+        <w:gridCol w:w="1646"/>
+        <w:gridCol w:w="1646"/>
       </w:tblGrid>
       <w:tr>
         <w:tc>
           <w:tcPr>
-            <w:tcW w:type="dxa" w:w="1500"/>
+            <w:tcW w:type="dxa" w:w="1300"/>
             <w:shd w:fill="F2F4F7"/>
-            <w:vAlign w:val="center"/>
           </w:tcPr>
           <w:p>
             <w:r>
               <w:rPr>
-                <w:rFonts w:ascii="Calibri" w:hAnsi="Calibri"/>
                 <w:b/>
-                <w:sz w:val="18"/>
+                <w:sz w:val="17"/>
               </w:rPr>
               <w:t>Algorithm</w:t>
             </w:r>
@@ -620,67 +798,59 @@
         </w:tc>
         <w:tc>
           <w:tcPr>
-            <w:tcW w:type="dxa" w:w="1680"/>
+            <w:tcW w:type="dxa" w:w="1700"/>
             <w:shd w:fill="F2F4F7"/>
-            <w:vAlign w:val="center"/>
           </w:tcPr>
           <w:p>
             <w:r>
               <w:rPr>
-                <w:rFonts w:ascii="Calibri" w:hAnsi="Calibri"/>
                 <w:b/>
-                <w:sz w:val="18"/>
+                <w:sz w:val="17"/>
               </w:rPr>
-              <w:t>Avg turnaround (ms)</w:t>
+              <w:t>Avg turnaround</w:t>
             </w:r>
           </w:p>
         </w:tc>
         <w:tc>
           <w:tcPr>
-            <w:tcW w:type="dxa" w:w="1560"/>
+            <w:tcW w:type="dxa" w:w="1500"/>
             <w:shd w:fill="F2F4F7"/>
-            <w:vAlign w:val="center"/>
           </w:tcPr>
           <w:p>
             <w:r>
               <w:rPr>
-                <w:rFonts w:ascii="Calibri" w:hAnsi="Calibri"/>
                 <w:b/>
-                <w:sz w:val="18"/>
+                <w:sz w:val="17"/>
               </w:rPr>
-              <w:t>Avg waiting (ms)</w:t>
+              <w:t>Avg waiting</w:t>
             </w:r>
           </w:p>
         </w:tc>
         <w:tc>
           <w:tcPr>
-            <w:tcW w:type="dxa" w:w="1560"/>
+            <w:tcW w:type="dxa" w:w="1500"/>
             <w:shd w:fill="F2F4F7"/>
-            <w:vAlign w:val="center"/>
           </w:tcPr>
           <w:p>
             <w:r>
               <w:rPr>
-                <w:rFonts w:ascii="Calibri" w:hAnsi="Calibri"/>
                 <w:b/>
-                <w:sz w:val="18"/>
+                <w:sz w:val="17"/>
               </w:rPr>
-              <w:t>Avg response (ms)</w:t>
+              <w:t>Avg response</w:t>
             </w:r>
           </w:p>
         </w:tc>
         <w:tc>
           <w:tcPr>
-            <w:tcW w:type="dxa" w:w="1320"/>
+            <w:tcW w:type="dxa" w:w="1500"/>
             <w:shd w:fill="F2F4F7"/>
-            <w:vAlign w:val="center"/>
           </w:tcPr>
           <w:p>
             <w:r>
               <w:rPr>
-                <w:rFonts w:ascii="Calibri" w:hAnsi="Calibri"/>
                 <w:b/>
-                <w:sz w:val="18"/>
+                <w:sz w:val="17"/>
               </w:rPr>
               <w:t>Makespan</w:t>
             </w:r>
@@ -688,16 +858,14 @@
         </w:tc>
         <w:tc>
           <w:tcPr>
-            <w:tcW w:type="dxa" w:w="1740"/>
+            <w:tcW w:type="dxa" w:w="1900"/>
             <w:shd w:fill="F2F4F7"/>
-            <w:vAlign w:val="center"/>
           </w:tcPr>
           <w:p>
             <w:r>
               <w:rPr>
-                <w:rFonts w:ascii="Calibri" w:hAnsi="Calibri"/>
                 <w:b/>
-                <w:sz w:val="18"/>
+                <w:sz w:val="17"/>
               </w:rPr>
               <w:t>Dispatches</w:t>
             </w:r>
@@ -707,14 +875,13 @@
       <w:tr>
         <w:tc>
           <w:tcPr>
-            <w:tcW w:type="dxa" w:w="1500"/>
+            <w:tcW w:type="dxa" w:w="1300"/>
             <w:vAlign w:val="center"/>
           </w:tcPr>
           <w:p>
             <w:r>
               <w:rPr>
-                <w:rFonts w:ascii="Calibri" w:hAnsi="Calibri"/>
-                <w:sz w:val="18"/>
+                <w:sz w:val="17"/>
               </w:rPr>
               <w:t>RR</w:t>
             </w:r>
@@ -722,74 +889,69 @@
         </w:tc>
         <w:tc>
           <w:tcPr>
-            <w:tcW w:type="dxa" w:w="1680"/>
+            <w:tcW w:type="dxa" w:w="1700"/>
             <w:vAlign w:val="center"/>
           </w:tcPr>
           <w:p>
             <w:r>
               <w:rPr>
-                <w:rFonts w:ascii="Calibri" w:hAnsi="Calibri"/>
-                <w:sz w:val="18"/>
+                <w:sz w:val="17"/>
               </w:rPr>
-              <w:t>185.00</w:t>
+              <w:t>185 ms</w:t>
             </w:r>
           </w:p>
         </w:tc>
         <w:tc>
           <w:tcPr>
-            <w:tcW w:type="dxa" w:w="1560"/>
+            <w:tcW w:type="dxa" w:w="1500"/>
             <w:vAlign w:val="center"/>
           </w:tcPr>
           <w:p>
             <w:r>
               <w:rPr>
-                <w:rFonts w:ascii="Calibri" w:hAnsi="Calibri"/>
-                <w:sz w:val="18"/>
+                <w:sz w:val="17"/>
               </w:rPr>
-              <w:t>133.00</w:t>
+              <w:t>133 ms</w:t>
             </w:r>
           </w:p>
         </w:tc>
         <w:tc>
           <w:tcPr>
-            <w:tcW w:type="dxa" w:w="1560"/>
+            <w:tcW w:type="dxa" w:w="1500"/>
             <w:vAlign w:val="center"/>
           </w:tcPr>
           <w:p>
             <w:r>
               <w:rPr>
-                <w:rFonts w:ascii="Calibri" w:hAnsi="Calibri"/>
-                <w:sz w:val="18"/>
+                <w:sz w:val="17"/>
               </w:rPr>
-              <w:t>17.00</w:t>
+              <w:t>17 ms</w:t>
             </w:r>
           </w:p>
         </w:tc>
         <w:tc>
           <w:tcPr>
-            <w:tcW w:type="dxa" w:w="1320"/>
+            <w:tcW w:type="dxa" w:w="1500"/>
             <w:vAlign w:val="center"/>
           </w:tcPr>
           <w:p>
             <w:r>
               <w:rPr>
-                <w:rFonts w:ascii="Calibri" w:hAnsi="Calibri"/>
-                <w:sz w:val="18"/>
+                <w:sz w:val="17"/>
               </w:rPr>
-              <w:t>260</w:t>
+              <w:t>260 ms</w:t>
             </w:r>
           </w:p>
         </w:tc>
         <w:tc>
           <w:tcPr>
-            <w:tcW w:type="dxa" w:w="1740"/>
+            <w:tcW w:type="dxa" w:w="1900"/>
             <w:vAlign w:val="center"/>
           </w:tcPr>
           <w:p>
             <w:r>
               <w:rPr>
-                <w:rFonts w:ascii="Calibri" w:hAnsi="Calibri"/>
-                <w:sz w:val="18"/>
+                <w:sz w:val="17"/>
               </w:rPr>
               <w:t>14</w:t>
             </w:r>
@@ -799,14 +961,13 @@
       <w:tr>
         <w:tc>
           <w:tcPr>
-            <w:tcW w:type="dxa" w:w="1500"/>
+            <w:tcW w:type="dxa" w:w="1300"/>
             <w:vAlign w:val="center"/>
           </w:tcPr>
           <w:p>
             <w:r>
               <w:rPr>
-                <w:rFonts w:ascii="Calibri" w:hAnsi="Calibri"/>
-                <w:sz w:val="18"/>
+                <w:sz w:val="17"/>
               </w:rPr>
               <w:t>SJF</w:t>
             </w:r>
@@ -814,74 +975,69 @@
         </w:tc>
         <w:tc>
           <w:tcPr>
-            <w:tcW w:type="dxa" w:w="1680"/>
+            <w:tcW w:type="dxa" w:w="1700"/>
             <w:vAlign w:val="center"/>
           </w:tcPr>
           <w:p>
             <w:r>
               <w:rPr>
-                <w:rFonts w:ascii="Calibri" w:hAnsi="Calibri"/>
-                <w:sz w:val="18"/>
+                <w:sz w:val="17"/>
               </w:rPr>
-              <w:t>137.00</w:t>
+              <w:t>137 ms</w:t>
             </w:r>
           </w:p>
         </w:tc>
         <w:tc>
           <w:tcPr>
-            <w:tcW w:type="dxa" w:w="1560"/>
+            <w:tcW w:type="dxa" w:w="1500"/>
             <w:vAlign w:val="center"/>
           </w:tcPr>
           <w:p>
             <w:r>
               <w:rPr>
-                <w:rFonts w:ascii="Calibri" w:hAnsi="Calibri"/>
-                <w:sz w:val="18"/>
+                <w:sz w:val="17"/>
               </w:rPr>
-              <w:t>85.00</w:t>
+              <w:t>85 ms</w:t>
             </w:r>
           </w:p>
         </w:tc>
         <w:tc>
           <w:tcPr>
-            <w:tcW w:type="dxa" w:w="1560"/>
+            <w:tcW w:type="dxa" w:w="1500"/>
             <w:vAlign w:val="center"/>
           </w:tcPr>
           <w:p>
             <w:r>
               <w:rPr>
-                <w:rFonts w:ascii="Calibri" w:hAnsi="Calibri"/>
-                <w:sz w:val="18"/>
+                <w:sz w:val="17"/>
               </w:rPr>
-              <w:t>85.00</w:t>
+              <w:t>85 ms</w:t>
             </w:r>
           </w:p>
         </w:tc>
         <w:tc>
           <w:tcPr>
-            <w:tcW w:type="dxa" w:w="1320"/>
+            <w:tcW w:type="dxa" w:w="1500"/>
             <w:vAlign w:val="center"/>
           </w:tcPr>
           <w:p>
             <w:r>
               <w:rPr>
-                <w:rFonts w:ascii="Calibri" w:hAnsi="Calibri"/>
-                <w:sz w:val="18"/>
+                <w:sz w:val="17"/>
               </w:rPr>
-              <w:t>260</w:t>
+              <w:t>260 ms</w:t>
             </w:r>
           </w:p>
         </w:tc>
         <w:tc>
           <w:tcPr>
-            <w:tcW w:type="dxa" w:w="1740"/>
+            <w:tcW w:type="dxa" w:w="1900"/>
             <w:vAlign w:val="center"/>
           </w:tcPr>
           <w:p>
             <w:r>
               <w:rPr>
-                <w:rFonts w:ascii="Calibri" w:hAnsi="Calibri"/>
-                <w:sz w:val="18"/>
+                <w:sz w:val="17"/>
               </w:rPr>
               <w:t>5</w:t>
             </w:r>
@@ -891,89 +1047,83 @@
       <w:tr>
         <w:tc>
           <w:tcPr>
+            <w:tcW w:type="dxa" w:w="1300"/>
+            <w:vAlign w:val="center"/>
+          </w:tcPr>
+          <w:p>
+            <w:r>
+              <w:rPr>
+                <w:sz w:val="17"/>
+              </w:rPr>
+              <w:t>Priority</w:t>
+            </w:r>
+          </w:p>
+        </w:tc>
+        <w:tc>
+          <w:tcPr>
+            <w:tcW w:type="dxa" w:w="1700"/>
+            <w:vAlign w:val="center"/>
+          </w:tcPr>
+          <w:p>
+            <w:r>
+              <w:rPr>
+                <w:sz w:val="17"/>
+              </w:rPr>
+              <w:t>155 ms</w:t>
+            </w:r>
+          </w:p>
+        </w:tc>
+        <w:tc>
+          <w:tcPr>
             <w:tcW w:type="dxa" w:w="1500"/>
             <w:vAlign w:val="center"/>
           </w:tcPr>
           <w:p>
             <w:r>
               <w:rPr>
-                <w:rFonts w:ascii="Calibri" w:hAnsi="Calibri"/>
-                <w:sz w:val="18"/>
+                <w:sz w:val="17"/>
               </w:rPr>
-              <w:t>PRIORITY</w:t>
+              <w:t>103 ms</w:t>
             </w:r>
           </w:p>
         </w:tc>
         <w:tc>
           <w:tcPr>
-            <w:tcW w:type="dxa" w:w="1680"/>
+            <w:tcW w:type="dxa" w:w="1500"/>
             <w:vAlign w:val="center"/>
           </w:tcPr>
           <w:p>
             <w:r>
               <w:rPr>
-                <w:rFonts w:ascii="Calibri" w:hAnsi="Calibri"/>
-                <w:sz w:val="18"/>
+                <w:sz w:val="17"/>
               </w:rPr>
-              <w:t>155.00</w:t>
+              <w:t>103 ms</w:t>
             </w:r>
           </w:p>
         </w:tc>
         <w:tc>
           <w:tcPr>
-            <w:tcW w:type="dxa" w:w="1560"/>
+            <w:tcW w:type="dxa" w:w="1500"/>
             <w:vAlign w:val="center"/>
           </w:tcPr>
           <w:p>
             <w:r>
               <w:rPr>
-                <w:rFonts w:ascii="Calibri" w:hAnsi="Calibri"/>
-                <w:sz w:val="18"/>
+                <w:sz w:val="17"/>
               </w:rPr>
-              <w:t>103.00</w:t>
+              <w:t>260 ms</w:t>
             </w:r>
           </w:p>
         </w:tc>
         <w:tc>
           <w:tcPr>
-            <w:tcW w:type="dxa" w:w="1560"/>
+            <w:tcW w:type="dxa" w:w="1900"/>
             <w:vAlign w:val="center"/>
           </w:tcPr>
           <w:p>
             <w:r>
               <w:rPr>
-                <w:rFonts w:ascii="Calibri" w:hAnsi="Calibri"/>
-                <w:sz w:val="18"/>
-              </w:rPr>
-              <w:t>103.00</w:t>
-            </w:r>
-          </w:p>
-        </w:tc>
-        <w:tc>
-          <w:tcPr>
-            <w:tcW w:type="dxa" w:w="1320"/>
-            <w:vAlign w:val="center"/>
-          </w:tcPr>
-          <w:p>
-            <w:r>
-              <w:rPr>
-                <w:rFonts w:ascii="Calibri" w:hAnsi="Calibri"/>
-                <w:sz w:val="18"/>
-              </w:rPr>
-              <w:t>260</w:t>
-            </w:r>
-          </w:p>
-        </w:tc>
-        <w:tc>
-          <w:tcPr>
-            <w:tcW w:type="dxa" w:w="1740"/>
-            <w:vAlign w:val="center"/>
-          </w:tcPr>
-          <w:p>
-            <w:r>
-              <w:rPr>
-                <w:rFonts w:ascii="Calibri" w:hAnsi="Calibri"/>
-                <w:sz w:val="18"/>
+                <w:sz w:val="17"/>
               </w:rPr>
               <w:t>5</w:t>
             </w:r>
@@ -983,14 +1133,13 @@
       <w:tr>
         <w:tc>
           <w:tcPr>
-            <w:tcW w:type="dxa" w:w="1500"/>
+            <w:tcW w:type="dxa" w:w="1300"/>
             <w:vAlign w:val="center"/>
           </w:tcPr>
           <w:p>
             <w:r>
               <w:rPr>
-                <w:rFonts w:ascii="Calibri" w:hAnsi="Calibri"/>
-                <w:sz w:val="18"/>
+                <w:sz w:val="17"/>
               </w:rPr>
               <w:t>MLFQ</w:t>
             </w:r>
@@ -998,74 +1147,69 @@
         </w:tc>
         <w:tc>
           <w:tcPr>
-            <w:tcW w:type="dxa" w:w="1680"/>
+            <w:tcW w:type="dxa" w:w="1700"/>
             <w:vAlign w:val="center"/>
           </w:tcPr>
           <w:p>
             <w:r>
               <w:rPr>
-                <w:rFonts w:ascii="Calibri" w:hAnsi="Calibri"/>
-                <w:sz w:val="18"/>
+                <w:sz w:val="17"/>
               </w:rPr>
-              <w:t>191.00</w:t>
+              <w:t>191 ms</w:t>
             </w:r>
           </w:p>
         </w:tc>
         <w:tc>
           <w:tcPr>
-            <w:tcW w:type="dxa" w:w="1560"/>
+            <w:tcW w:type="dxa" w:w="1500"/>
             <w:vAlign w:val="center"/>
           </w:tcPr>
           <w:p>
             <w:r>
               <w:rPr>
-                <w:rFonts w:ascii="Calibri" w:hAnsi="Calibri"/>
-                <w:sz w:val="18"/>
+                <w:sz w:val="17"/>
               </w:rPr>
-              <w:t>139.00</w:t>
+              <w:t>139 ms</w:t>
             </w:r>
           </w:p>
         </w:tc>
         <w:tc>
           <w:tcPr>
-            <w:tcW w:type="dxa" w:w="1560"/>
+            <w:tcW w:type="dxa" w:w="1500"/>
             <w:vAlign w:val="center"/>
           </w:tcPr>
           <w:p>
             <w:r>
               <w:rPr>
-                <w:rFonts w:ascii="Calibri" w:hAnsi="Calibri"/>
-                <w:sz w:val="18"/>
+                <w:sz w:val="17"/>
               </w:rPr>
-              <w:t>5.00</w:t>
+              <w:t>5 ms</w:t>
             </w:r>
           </w:p>
         </w:tc>
         <w:tc>
           <w:tcPr>
-            <w:tcW w:type="dxa" w:w="1320"/>
+            <w:tcW w:type="dxa" w:w="1500"/>
             <w:vAlign w:val="center"/>
           </w:tcPr>
           <w:p>
             <w:r>
               <w:rPr>
-                <w:rFonts w:ascii="Calibri" w:hAnsi="Calibri"/>
-                <w:sz w:val="18"/>
+                <w:sz w:val="17"/>
               </w:rPr>
-              <w:t>260</w:t>
+              <w:t>260 ms</w:t>
             </w:r>
           </w:p>
         </w:tc>
         <w:tc>
           <w:tcPr>
-            <w:tcW w:type="dxa" w:w="1740"/>
+            <w:tcW w:type="dxa" w:w="1900"/>
             <w:vAlign w:val="center"/>
           </w:tcPr>
           <w:p>
             <w:r>
               <w:rPr>
-                <w:rFonts w:ascii="Calibri" w:hAnsi="Calibri"/>
-                <w:sz w:val="18"/>
+                <w:sz w:val="17"/>
               </w:rPr>
               <w:t>15</w:t>
             </w:r>
@@ -1075,12 +1219,12 @@
     </w:tbl>
     <w:p>
       <w:r>
-        <w:t>Table 1 was produced and checked inside MINIX by the included known.conf test. The makespan is identical because all policies eventually execute the same 260 logical milliseconds and the workload has no idle gap after time zero. The differences are distributional: SJF minimizes average waiting for this workload, while MLFQ gives the quickest average first response at the cost of additional dispatches.</w:t>
+        <w:t>SJF produced the lowest average waiting and turnaround for this workload. MLFQ produced the quickest first response but required the most dispatches. Makespan is equal because every policy performs the same 260 logical milliseconds of work.</w:t>
       </w:r>
     </w:p>
     <w:p>
       <w:r>
-        <w:t>The experimental matrix varies the base quantum through 5, 10, 20, and 40 milliseconds while holding arrivals, bursts, priorities, CPU-work scale, and MLFQ ratios constant. RR and MLFQ should change as the quantum changes; non-preemptive SJF and priority should not change logically, although their measured wall time can fluctuate. This provides an internal control: if SJF logical averages change across those rows, either parsing, matrix construction, or result aggregation is wrong.</w:t>
+        <w:br w:type="page"/>
       </w:r>
     </w:p>
     <w:p>
@@ -1096,22 +1240,71 @@
         <w:pStyle w:val="Heading2"/>
       </w:pPr>
       <w:r>
-        <w:t>4.1 Address translation model</w:t>
+        <w:t>Implementation</w:t>
       </w:r>
     </w:p>
     <w:p>
       <w:r>
-        <w:t>The paging configuration defines address width, power-of-two page size, hierarchy level count, one index width per level, frame count, replacement policy, and trace generator. Validation requires the sum of all hierarchy index bits plus the page-offset bits to equal the configured address width. For a 32-bit address, a 4 KiB page has a 12-bit offset; a two-level 10/10 split therefore consumes the remaining 20 bits. Changing to an 8 KiB page requires a 13-bit offset and a compatible 19-bit hierarchy split.</w:t>
+        <w:t>The configuration specifies address width, page size, hierarchy levels and index widths, frame count, replacement policy, and deterministic trace parameters. Index bits plus page-offset bits must equal the address width. The sparse hierarchy creates only paths reached by the trace, allowing nodes, entries, and allocated bytes to be measured.</w:t>
       </w:r>
     </w:p>
     <w:p>
       <w:r>
-        <w:t>The hierarchy is sparse. A reference first divides the byte address by page size to obtain a virtual page number. From the highest configured level to the lowest, masks and shifts extract an index. Nodes and entries are allocated only for paths that appear in the trace. A leaf records the page identity used by replacement. This structure models the memory overhead advantage of hierarchical tables: a flat table conceptually provides every possible leaf, while a sparse hierarchy pays for directories and tables that are actually touched.</w:t>
+        <w:t>Every byte address is converted to a virtual page. A present page is a hit. On a fault, an unused frame is selected first; otherwise FIFO chooses the smallest load timestamp and LRU chooses the smallest last-access timestamp. First fills count as faults but not replacements.</w:t>
       </w:r>
     </w:p>
     <w:p>
+      <w:pPr>
+        <w:spacing w:after="80"/>
+        <w:jc w:val="center"/>
+      </w:pPr>
       <w:r>
-        <w:t>The trace is expressed in byte addresses so a page-size comparison keeps the underlying byte workload constant. Sequential mode advances by a fixed byte stride; locality mode selects most accesses from a hot byte region and the remainder from a larger working set; random mode samples the working set uniformly; file mode reads explicit decimal or hexadecimal addresses. A fixed seed makes generated traces repeatable. This design avoids the common error of generating page numbers and then silently changing the amount of memory represented when page size changes.</w:t>
+        <w:drawing>
+          <wp:inline xmlns:a="http://schemas.openxmlformats.org/drawingml/2006/main" xmlns:pic="http://schemas.openxmlformats.org/drawingml/2006/picture">
+            <wp:extent cx="5074920" cy="2845195"/>
+            <wp:docPr id="2" name="Picture 2"/>
+            <wp:cNvGraphicFramePr>
+              <a:graphicFrameLocks noChangeAspect="1"/>
+            </wp:cNvGraphicFramePr>
+            <a:graphic>
+              <a:graphicData uri="http://schemas.openxmlformats.org/drawingml/2006/picture">
+                <pic:pic>
+                  <pic:nvPicPr>
+                    <pic:cNvPr id="0" name="code-paging.png"/>
+                    <pic:cNvPicPr/>
+                  </pic:nvPicPr>
+                  <pic:blipFill>
+                    <a:blip r:embed="rId12"/>
+                    <a:stretch>
+                      <a:fillRect/>
+                    </a:stretch>
+                  </pic:blipFill>
+                  <pic:spPr>
+                    <a:xfrm>
+                      <a:off x="0" y="0"/>
+                      <a:ext cx="5074920" cy="2845195"/>
+                    </a:xfrm>
+                    <a:prstGeom prst="rect"/>
+                  </pic:spPr>
+                </pic:pic>
+              </a:graphicData>
+            </a:graphic>
+          </wp:inline>
+        </w:drawing>
+      </w:r>
+    </w:p>
+    <w:p>
+      <w:pPr>
+        <w:spacing w:after="180"/>
+        <w:jc w:val="center"/>
+      </w:pPr>
+      <w:r>
+        <w:rPr>
+          <w:i/>
+          <w:color w:val="5A5A5A"/>
+          <w:sz w:val="17"/>
+        </w:rPr>
+        <w:t>Figure 2. Edited FIFO/LRU victim-selection logic.</w:t>
       </w:r>
     </w:p>
     <w:p>
@@ -1119,60 +1312,34 @@
         <w:pStyle w:val="Heading2"/>
       </w:pPr>
       <w:r>
-        <w:t>4.2 FIFO and LRU</w:t>
-      </w:r>
-    </w:p>
-    <w:p>
-      <w:r>
-        <w:t>Both policies share the same frame table and trace. On a hit, FIFO leaves arrival order unchanged; LRU updates the frame's last-use counter. On a miss with an unused frame, the page enters that frame and the empty-frame counter decreases. Once all frames are occupied, FIFO replaces the frame with the oldest load stamp, whereas LRU replaces the least recently accessed frame. Faults include first fills and replacements; replacements exclude first fills. This distinction allows the results to show both pressure and initial capacity consumption.</w:t>
-      </w:r>
-    </w:p>
-    <w:p>
-      <w:r>
-        <w:t>FIFO is simple and requires little recency bookkeeping, but it can evict a heavily used page merely because that page arrived early. It can also exhibit Belady's anomaly for some reference strings, where adding frames increases faults. LRU uses recency as a locality heuristic and is a stack algorithm, so ideal LRU does not have that anomaly. Exact LRU is more expensive in a real operating system; practical kernels approximate it with reference bits, aging, or clock families. The experiment implements exact LRU because the purpose is controlled policy comparison rather than production overhead optimization.</w:t>
-      </w:r>
-    </w:p>
-    <w:p>
-      <w:r>
-        <w:t>A deterministic test uses a small, known address trace and compares exact FIFO and LRU fault totals. It catches errors in hit detection, victim choice, frame initialization, and page-size conversion. The matrix script then varies page size and level split while holding the byte trace definition and number of frames constant. Result rows include page-table nodes, entries, and estimated bytes, letting the analysis discuss a trade-off that fault totals alone would miss.</w:t>
-      </w:r>
-    </w:p>
-    <w:p>
-      <w:pPr>
-        <w:pStyle w:val="Heading2"/>
-      </w:pPr>
-      <w:r>
-        <w:t>4.3 Native MINIX results and interpretation</w:t>
+        <w:t>Native result</w:t>
       </w:r>
     </w:p>
     <w:tbl>
       <w:tblPr>
         <w:tblStyle w:val="TableGrid"/>
-        <w:tblW w:type="dxa" w:w="9360"/>
+        <w:tblW w:type="auto" w:w="0"/>
         <w:jc w:val="left"/>
         <w:tblLayout w:type="fixed"/>
         <w:tblLook w:firstColumn="1" w:firstRow="1" w:lastColumn="0" w:lastRow="0" w:noHBand="0" w:noVBand="1" w:val="04A0"/>
-        <w:tblInd w:w="120" w:type="dxa"/>
       </w:tblPr>
       <w:tblGrid>
-        <w:gridCol w:w="1800"/>
-        <w:gridCol w:w="1800"/>
-        <w:gridCol w:w="1800"/>
-        <w:gridCol w:w="3960"/>
+        <w:gridCol w:w="2469"/>
+        <w:gridCol w:w="2469"/>
+        <w:gridCol w:w="2469"/>
+        <w:gridCol w:w="2469"/>
       </w:tblGrid>
       <w:tr>
         <w:tc>
           <w:tcPr>
             <w:tcW w:type="dxa" w:w="1800"/>
             <w:shd w:fill="F2F4F7"/>
-            <w:vAlign w:val="center"/>
           </w:tcPr>
           <w:p>
             <w:r>
               <w:rPr>
-                <w:rFonts w:ascii="Calibri" w:hAnsi="Calibri"/>
                 <w:b/>
-                <w:sz w:val="18"/>
+                <w:sz w:val="17"/>
               </w:rPr>
               <w:t>Page size</w:t>
             </w:r>
@@ -1182,14 +1349,12 @@
           <w:tcPr>
             <w:tcW w:type="dxa" w:w="1800"/>
             <w:shd w:fill="F2F4F7"/>
-            <w:vAlign w:val="center"/>
           </w:tcPr>
           <w:p>
             <w:r>
               <w:rPr>
-                <w:rFonts w:ascii="Calibri" w:hAnsi="Calibri"/>
                 <w:b/>
-                <w:sz w:val="18"/>
+                <w:sz w:val="17"/>
               </w:rPr>
               <w:t>FIFO faults</w:t>
             </w:r>
@@ -1199,14 +1364,12 @@
           <w:tcPr>
             <w:tcW w:type="dxa" w:w="1800"/>
             <w:shd w:fill="F2F4F7"/>
-            <w:vAlign w:val="center"/>
           </w:tcPr>
           <w:p>
             <w:r>
               <w:rPr>
-                <w:rFonts w:ascii="Calibri" w:hAnsi="Calibri"/>
                 <w:b/>
-                <w:sz w:val="18"/>
+                <w:sz w:val="17"/>
               </w:rPr>
               <w:t>LRU faults</w:t>
             </w:r>
@@ -1214,18 +1377,16 @@
         </w:tc>
         <w:tc>
           <w:tcPr>
-            <w:tcW w:type="dxa" w:w="3960"/>
+            <w:tcW w:type="dxa" w:w="4000"/>
             <w:shd w:fill="F2F4F7"/>
-            <w:vAlign w:val="center"/>
           </w:tcPr>
           <w:p>
             <w:r>
               <w:rPr>
-                <w:rFonts w:ascii="Calibri" w:hAnsi="Calibri"/>
                 <w:b/>
-                <w:sz w:val="18"/>
+                <w:sz w:val="17"/>
               </w:rPr>
-              <w:t>Status</w:t>
+              <w:t>Observed result</w:t>
             </w:r>
           </w:p>
         </w:tc>
@@ -1239,8 +1400,7 @@
           <w:p>
             <w:r>
               <w:rPr>
-                <w:rFonts w:ascii="Calibri" w:hAnsi="Calibri"/>
-                <w:sz w:val="18"/>
+                <w:sz w:val="17"/>
               </w:rPr>
               <w:t>1,024 B</w:t>
             </w:r>
@@ -1254,8 +1414,7 @@
           <w:p>
             <w:r>
               <w:rPr>
-                <w:rFonts w:ascii="Calibri" w:hAnsi="Calibri"/>
-                <w:sz w:val="18"/>
+                <w:sz w:val="17"/>
               </w:rPr>
               <w:t>6,937</w:t>
             </w:r>
@@ -1269,8 +1428,7 @@
           <w:p>
             <w:r>
               <w:rPr>
-                <w:rFonts w:ascii="Calibri" w:hAnsi="Calibri"/>
-                <w:sz w:val="18"/>
+                <w:sz w:val="17"/>
               </w:rPr>
               <w:t>6,791</w:t>
             </w:r>
@@ -1278,16 +1436,15 @@
         </w:tc>
         <w:tc>
           <w:tcPr>
-            <w:tcW w:type="dxa" w:w="3960"/>
+            <w:tcW w:type="dxa" w:w="4000"/>
             <w:vAlign w:val="center"/>
           </w:tcPr>
           <w:p>
             <w:r>
               <w:rPr>
-                <w:rFonts w:ascii="Calibri" w:hAnsi="Calibri"/>
-                <w:sz w:val="18"/>
+                <w:sz w:val="17"/>
               </w:rPr>
-              <w:t>Measured in MINIX</w:t>
+              <w:t>LRU lower by 146</w:t>
             </w:r>
           </w:p>
         </w:tc>
@@ -1301,8 +1458,7 @@
           <w:p>
             <w:r>
               <w:rPr>
-                <w:rFonts w:ascii="Calibri" w:hAnsi="Calibri"/>
-                <w:sz w:val="18"/>
+                <w:sz w:val="17"/>
               </w:rPr>
               <w:t>2,048 B</w:t>
             </w:r>
@@ -1316,8 +1472,7 @@
           <w:p>
             <w:r>
               <w:rPr>
-                <w:rFonts w:ascii="Calibri" w:hAnsi="Calibri"/>
-                <w:sz w:val="18"/>
+                <w:sz w:val="17"/>
               </w:rPr>
               <w:t>4,735</w:t>
             </w:r>
@@ -1331,8 +1486,7 @@
           <w:p>
             <w:r>
               <w:rPr>
-                <w:rFonts w:ascii="Calibri" w:hAnsi="Calibri"/>
-                <w:sz w:val="18"/>
+                <w:sz w:val="17"/>
               </w:rPr>
               <w:t>4,047</w:t>
             </w:r>
@@ -1340,16 +1494,15 @@
         </w:tc>
         <w:tc>
           <w:tcPr>
-            <w:tcW w:type="dxa" w:w="3960"/>
+            <w:tcW w:type="dxa" w:w="4000"/>
             <w:vAlign w:val="center"/>
           </w:tcPr>
           <w:p>
             <w:r>
               <w:rPr>
-                <w:rFonts w:ascii="Calibri" w:hAnsi="Calibri"/>
-                <w:sz w:val="18"/>
+                <w:sz w:val="17"/>
               </w:rPr>
-              <w:t>Measured in MINIX</w:t>
+              <w:t>LRU lower by 688</w:t>
             </w:r>
           </w:p>
         </w:tc>
@@ -1363,8 +1516,7 @@
           <w:p>
             <w:r>
               <w:rPr>
-                <w:rFonts w:ascii="Calibri" w:hAnsi="Calibri"/>
-                <w:sz w:val="18"/>
+                <w:sz w:val="17"/>
               </w:rPr>
               <w:t>4,096 B</w:t>
             </w:r>
@@ -1378,8 +1530,7 @@
           <w:p>
             <w:r>
               <w:rPr>
-                <w:rFonts w:ascii="Calibri" w:hAnsi="Calibri"/>
-                <w:sz w:val="18"/>
+                <w:sz w:val="17"/>
               </w:rPr>
               <w:t>2,666</w:t>
             </w:r>
@@ -1393,8 +1544,7 @@
           <w:p>
             <w:r>
               <w:rPr>
-                <w:rFonts w:ascii="Calibri" w:hAnsi="Calibri"/>
-                <w:sz w:val="18"/>
+                <w:sz w:val="17"/>
               </w:rPr>
               <w:t>1,655</w:t>
             </w:r>
@@ -1402,16 +1552,15 @@
         </w:tc>
         <w:tc>
           <w:tcPr>
-            <w:tcW w:type="dxa" w:w="3960"/>
+            <w:tcW w:type="dxa" w:w="4000"/>
             <w:vAlign w:val="center"/>
           </w:tcPr>
           <w:p>
             <w:r>
               <w:rPr>
-                <w:rFonts w:ascii="Calibri" w:hAnsi="Calibri"/>
-                <w:sz w:val="18"/>
+                <w:sz w:val="17"/>
               </w:rPr>
-              <w:t>Measured in MINIX</w:t>
+              <w:t>LRU lower by 1,011</w:t>
             </w:r>
           </w:p>
         </w:tc>
@@ -1425,8 +1574,7 @@
           <w:p>
             <w:r>
               <w:rPr>
-                <w:rFonts w:ascii="Calibri" w:hAnsi="Calibri"/>
-                <w:sz w:val="18"/>
+                <w:sz w:val="17"/>
               </w:rPr>
               <w:t>8,192 B</w:t>
             </w:r>
@@ -1440,8 +1588,7 @@
           <w:p>
             <w:r>
               <w:rPr>
-                <w:rFonts w:ascii="Calibri" w:hAnsi="Calibri"/>
-                <w:sz w:val="18"/>
+                <w:sz w:val="17"/>
               </w:rPr>
               <w:t>1,378</w:t>
             </w:r>
@@ -1455,8 +1602,7 @@
           <w:p>
             <w:r>
               <w:rPr>
-                <w:rFonts w:ascii="Calibri" w:hAnsi="Calibri"/>
-                <w:sz w:val="18"/>
+                <w:sz w:val="17"/>
               </w:rPr>
               <w:t>1,064</w:t>
             </w:r>
@@ -1464,16 +1610,15 @@
         </w:tc>
         <w:tc>
           <w:tcPr>
-            <w:tcW w:type="dxa" w:w="3960"/>
+            <w:tcW w:type="dxa" w:w="4000"/>
             <w:vAlign w:val="center"/>
           </w:tcPr>
           <w:p>
             <w:r>
               <w:rPr>
-                <w:rFonts w:ascii="Calibri" w:hAnsi="Calibri"/>
-                <w:sz w:val="18"/>
+                <w:sz w:val="17"/>
               </w:rPr>
-              <w:t>Measured in MINIX</w:t>
+              <w:t>LRU lower by 314</w:t>
             </w:r>
           </w:p>
         </w:tc>
@@ -1481,12 +1626,12 @@
     </w:tbl>
     <w:p>
       <w:r>
-        <w:t>These values are from the native 72-row matrix for the deterministic locality workload with 64 simulated frames. Faults decline as page size increases because each frame covers more of the fixed byte working set. That observation does not prove that the largest page is universally best: larger pages can increase internal fragmentation, copy unused bytes, reduce granularity, and change table memory. The project records hierarchy allocation so the conclusion remains multidimensional.</w:t>
+        <w:t>For the controlled locality trace with 64 frames, LRU faulted less than FIFO at every page size. Larger pages reduced faults because each frame covered more of the fixed byte working set; this does not imply that larger pages are universally better because fragmentation and transfer cost also increase.</w:t>
       </w:r>
     </w:p>
     <w:p>
       <w:r>
-        <w:t>The legacy MINIX 3.3 VM_INFO request did not return reliably on this image and was therefore removed from the final executable. The CSV retains the real-context columns as NA and keeps all simulated metrics explicit. This limitation is recorded rather than presenting simulator faults as hardware page faults.</w:t>
+        <w:br w:type="page"/>
       </w:r>
     </w:p>
     <w:p>
@@ -1494,7 +1639,7 @@
         <w:pStyle w:val="Heading1"/>
       </w:pPr>
       <w:r>
-        <w:t>5. Requirement 3 — extent-aware MFS allocation</w:t>
+        <w:t>5. Requirement 3 — extent-aware MFS</w:t>
       </w:r>
     </w:p>
     <w:p>
@@ -1502,22 +1647,66 @@
         <w:pStyle w:val="Heading2"/>
       </w:pPr>
       <w:r>
-        <w:t>5.1 Stock free-space path</w:t>
+        <w:t>Implementation</w:t>
       </w:r>
     </w:p>
     <w:p>
       <w:r>
-        <w:t>MFS tracks free inodes and zones with bitmaps stored in file-system blocks. A zero zone-map bit represents a free data zone; setting it allocates the zone. alloc_zone receives a preferred physical zone, converts it to the map's numbering convention, and asks alloc_bit for one free bit. alloc_bit selects a map block and bitmap word from an origin, scans for a zero, writes the changed word in native byte order, marks the cache buffer dirty, and updates block accounting. free_zone clears the corresponding bit and moves the search hint backward when appropriate.</w:t>
+        <w:t>Stock MFS allocates data zones through a bitmap. The change first scans for a free run matching mfs_extent_size. If found, its start becomes the exact origin passed to alloc_bit; otherwise the original behavior is retained and a fallback is counted. Only alloc_bit marks a zone allocated, so existing accounting and the on-disk format remain intact.</w:t>
       </w:r>
     </w:p>
     <w:p>
+      <w:pPr>
+        <w:spacing w:after="80"/>
+        <w:jc w:val="center"/>
+      </w:pPr>
       <w:r>
-        <w:t>The original allocator used the origin to choose the containing word but began scanning at bit zero of that word. That coarseness prevents an extent search from selecting an exact run start when the start lies inside a bitmap word. The modification adds first_bit, begins the first word at origin modulo the bitmap-word width, then resets the offset after moving to later words. All original wrapping, bounds checking, dirty marking, and accounting remain in place.</w:t>
+        <w:drawing>
+          <wp:inline xmlns:a="http://schemas.openxmlformats.org/drawingml/2006/main" xmlns:pic="http://schemas.openxmlformats.org/drawingml/2006/picture">
+            <wp:extent cx="5715000" cy="3617473"/>
+            <wp:docPr id="3" name="Picture 3"/>
+            <wp:cNvGraphicFramePr>
+              <a:graphicFrameLocks noChangeAspect="1"/>
+            </wp:cNvGraphicFramePr>
+            <a:graphic>
+              <a:graphicData uri="http://schemas.openxmlformats.org/drawingml/2006/picture">
+                <pic:pic>
+                  <pic:nvPicPr>
+                    <pic:cNvPr id="0" name="code-mfs-extents.png"/>
+                    <pic:cNvPicPr/>
+                  </pic:nvPicPr>
+                  <pic:blipFill>
+                    <a:blip r:embed="rId13"/>
+                    <a:stretch>
+                      <a:fillRect/>
+                    </a:stretch>
+                  </pic:blipFill>
+                  <pic:spPr>
+                    <a:xfrm>
+                      <a:off x="0" y="0"/>
+                      <a:ext cx="5715000" cy="3617473"/>
+                    </a:xfrm>
+                    <a:prstGeom prst="rect"/>
+                  </pic:spPr>
+                </pic:pic>
+              </a:graphicData>
+            </a:graphic>
+          </wp:inline>
+        </w:drawing>
       </w:r>
     </w:p>
     <w:p>
+      <w:pPr>
+        <w:spacing w:after="180"/>
+        <w:jc w:val="center"/>
+      </w:pPr>
       <w:r>
-        <w:t>For the first allocation of a file, the modified alloc_zone scans the zone bitmap from the preferred origin for a sequence of free bits as long as mfs_extent_size. If it finds a run, that first bit becomes the exact alloc_bit origin. If it does not, the code increments a fallback counter and calls the original allocation path using the normal preference. The scan itself is read-only: it never reserves zones. Normal later allocations use the zone following the previous one as their preference, so they consume the selected free run while it stays available.</w:t>
+        <w:rPr>
+          <w:i/>
+          <w:color w:val="5A5A5A"/>
+          <w:sz w:val="17"/>
+        </w:rPr>
+        <w:t>Figure 3. Edited MFS allocation path: preferred run, counters, and safe fallback.</w:t>
       </w:r>
     </w:p>
     <w:p>
@@ -1525,75 +1714,34 @@
         <w:pStyle w:val="Heading2"/>
       </w:pPr>
       <w:r>
-        <w:t>5.2 Configuration, consistency, and limitations</w:t>
-      </w:r>
-    </w:p>
-    <w:p>
-      <w:r>
-        <w:t>The MFS service reads mfs_extent_size from its startup arguments through env_parse, with an allowed range of one through 1,024 zones and a default of one. A value of one reproduces ordinary behavior. MINIX mount passes -o options to a newly started file-system service, so a scratch device can be mounted with mount -t mfs -o mfs_extent_size=8 device mountpoint. The benchmark's extent_blocks must match the mounted service preference for a controlled run. The user-facing /etc/extent.conf configures the benchmark; the mount option configures MFS itself.</w:t>
-      </w:r>
-    </w:p>
-    <w:p>
-      <w:r>
-        <w:t>Not reserving all zones in advance is a deliberate consistency decision. A reservation invisible to inode mappings would leak space after a crash or require new on-disk metadata and recovery rules. The implemented policy instead chooses a favorable start and lets the proven allocator mark each zone exactly when MFS assigns it. A concurrent allocation could consume part of the discovered run before the file grows, so the preference is not a hard guarantee. MFS request serialization and a quiet scratch file system reduce that risk during experiments. The report describes the feature as extent-biased allocation, not as a new persistent extent map.</w:t>
-      </w:r>
-    </w:p>
-    <w:p>
-      <w:r>
-        <w:t>The change preserves file format compatibility. Existing direct, single-indirect, and double-indirect zone references continue to represent file blocks; fsck and mkfs do not require changes. Freeing remains per zone. The modification affects placement and instrumentation only. At unmount, MFS prints requested size, search count, hit count, and fallback count. Those counters help distinguish a slow benchmark caused by fragmented free space from one in which the requested run was usually found.</w:t>
-      </w:r>
-    </w:p>
-    <w:p>
-      <w:pPr>
-        <w:pStyle w:val="Heading2"/>
-      </w:pPr>
-      <w:r>
-        <w:t>5.3 Real file and directory benchmark</w:t>
-      </w:r>
-    </w:p>
-    <w:p>
-      <w:r>
-        <w:t>extentexperiment creates a base directory if needed and a unique subdirectory for each iteration. It creates and opens data.bin, writes a deterministic byte pattern in chunks equal to extent_blocks multiplied by block_size, calls fsync, records file allocation information with fstat, seeks to the beginning, reads every byte, verifies the pattern, closes the descriptor, unlinks the file, and removes the subdirectory. This sequence exercises directory entry creation, inode creation, zone allocation, cache writes, persistence, lookup, reads, deallocation, and directory removal.</w:t>
-      </w:r>
-    </w:p>
-    <w:p>
-      <w:r>
-        <w:t>CSV fields record the configured extent size, iteration, block and file sizes, total bytes, logical extent count, allocated 512-byte blocks, create/write/read/remove microseconds, calculated write and read MiB/s, and verification errors. Throughput is bytes divided by measured operation time. Logical extent count is the intended chunk grouping rather than a claim that MFS stores an extent tree. A zero verification count is mandatory; fast results with corrupted content are failures.</w:t>
-      </w:r>
-    </w:p>
-    <w:p>
-      <w:r>
-        <w:t>The matrix uses extent preferences of 1, 2, 4, 8, 16, and 32 blocks with three repetitions each while holding block size and file size constant. Each preference should be applied to a fresh mount of the scratch MFS device. For strongest control, restore or recreate the same file-system image before each preference, minimize background activity, discard the first warm-up run or report it separately, and summarize the median plus range. Without remounting MFS, changing only extent.conf changes write chunk size but not the allocator preference, which would confound the experiment.</w:t>
+        <w:t>Native result</w:t>
       </w:r>
     </w:p>
     <w:tbl>
       <w:tblPr>
         <w:tblStyle w:val="TableGrid"/>
-        <w:tblW w:type="dxa" w:w="9360"/>
+        <w:tblW w:type="auto" w:w="0"/>
         <w:jc w:val="left"/>
         <w:tblLayout w:type="fixed"/>
         <w:tblLook w:firstColumn="1" w:firstRow="1" w:lastColumn="0" w:lastRow="0" w:noHBand="0" w:noVBand="1" w:val="04A0"/>
-        <w:tblInd w:w="120" w:type="dxa"/>
       </w:tblPr>
       <w:tblGrid>
-        <w:gridCol w:w="2100"/>
-        <w:gridCol w:w="2100"/>
-        <w:gridCol w:w="3000"/>
-        <w:gridCol w:w="2160"/>
+        <w:gridCol w:w="2469"/>
+        <w:gridCol w:w="2469"/>
+        <w:gridCol w:w="2469"/>
+        <w:gridCol w:w="2469"/>
       </w:tblGrid>
       <w:tr>
         <w:tc>
           <w:tcPr>
             <w:tcW w:type="dxa" w:w="2100"/>
             <w:shd w:fill="F2F4F7"/>
-            <w:vAlign w:val="center"/>
           </w:tcPr>
           <w:p>
             <w:r>
               <w:rPr>
-                <w:rFonts w:ascii="Calibri" w:hAnsi="Calibri"/>
                 <w:b/>
-                <w:sz w:val="18"/>
+                <w:sz w:val="17"/>
               </w:rPr>
               <w:t>Requested zones</w:t>
             </w:r>
@@ -1603,14 +1751,12 @@
           <w:tcPr>
             <w:tcW w:type="dxa" w:w="2100"/>
             <w:shd w:fill="F2F4F7"/>
-            <w:vAlign w:val="center"/>
           </w:tcPr>
           <w:p>
             <w:r>
               <w:rPr>
-                <w:rFonts w:ascii="Calibri" w:hAnsi="Calibri"/>
                 <w:b/>
-                <w:sz w:val="18"/>
+                <w:sz w:val="17"/>
               </w:rPr>
               <w:t>Searches</w:t>
             </w:r>
@@ -1620,14 +1766,12 @@
           <w:tcPr>
             <w:tcW w:type="dxa" w:w="3000"/>
             <w:shd w:fill="F2F4F7"/>
-            <w:vAlign w:val="center"/>
           </w:tcPr>
           <w:p>
             <w:r>
               <w:rPr>
-                <w:rFonts w:ascii="Calibri" w:hAnsi="Calibri"/>
                 <w:b/>
-                <w:sz w:val="18"/>
+                <w:sz w:val="17"/>
               </w:rPr>
               <w:t>Preferred-run hits</w:t>
             </w:r>
@@ -1635,16 +1779,14 @@
         </w:tc>
         <w:tc>
           <w:tcPr>
-            <w:tcW w:type="dxa" w:w="2160"/>
+            <w:tcW w:type="dxa" w:w="2100"/>
             <w:shd w:fill="F2F4F7"/>
-            <w:vAlign w:val="center"/>
           </w:tcPr>
           <w:p>
             <w:r>
               <w:rPr>
-                <w:rFonts w:ascii="Calibri" w:hAnsi="Calibri"/>
                 <w:b/>
-                <w:sz w:val="18"/>
+                <w:sz w:val="17"/>
               </w:rPr>
               <w:t>Fallbacks</w:t>
             </w:r>
@@ -1660,8 +1802,7 @@
           <w:p>
             <w:r>
               <w:rPr>
-                <w:rFonts w:ascii="Calibri" w:hAnsi="Calibri"/>
-                <w:sz w:val="18"/>
+                <w:sz w:val="17"/>
               </w:rPr>
               <w:t>1</w:t>
             </w:r>
@@ -1675,8 +1816,7 @@
           <w:p>
             <w:r>
               <w:rPr>
-                <w:rFonts w:ascii="Calibri" w:hAnsi="Calibri"/>
-                <w:sz w:val="18"/>
+                <w:sz w:val="17"/>
               </w:rPr>
               <w:t>0</w:t>
             </w:r>
@@ -1690,8 +1830,7 @@
           <w:p>
             <w:r>
               <w:rPr>
-                <w:rFonts w:ascii="Calibri" w:hAnsi="Calibri"/>
-                <w:sz w:val="18"/>
+                <w:sz w:val="17"/>
               </w:rPr>
               <w:t>0</w:t>
             </w:r>
@@ -1699,14 +1838,13 @@
         </w:tc>
         <w:tc>
           <w:tcPr>
-            <w:tcW w:type="dxa" w:w="2160"/>
+            <w:tcW w:type="dxa" w:w="2100"/>
             <w:vAlign w:val="center"/>
           </w:tcPr>
           <w:p>
             <w:r>
               <w:rPr>
-                <w:rFonts w:ascii="Calibri" w:hAnsi="Calibri"/>
-                <w:sz w:val="18"/>
+                <w:sz w:val="17"/>
               </w:rPr>
               <w:t>0</w:t>
             </w:r>
@@ -1722,8 +1860,7 @@
           <w:p>
             <w:r>
               <w:rPr>
-                <w:rFonts w:ascii="Calibri" w:hAnsi="Calibri"/>
-                <w:sz w:val="18"/>
+                <w:sz w:val="17"/>
               </w:rPr>
               <w:t>2</w:t>
             </w:r>
@@ -1737,8 +1874,7 @@
           <w:p>
             <w:r>
               <w:rPr>
-                <w:rFonts w:ascii="Calibri" w:hAnsi="Calibri"/>
-                <w:sz w:val="18"/>
+                <w:sz w:val="17"/>
               </w:rPr>
               <w:t>6</w:t>
             </w:r>
@@ -1752,8 +1888,7 @@
           <w:p>
             <w:r>
               <w:rPr>
-                <w:rFonts w:ascii="Calibri" w:hAnsi="Calibri"/>
-                <w:sz w:val="18"/>
+                <w:sz w:val="17"/>
               </w:rPr>
               <w:t>6</w:t>
             </w:r>
@@ -1761,14 +1896,13 @@
         </w:tc>
         <w:tc>
           <w:tcPr>
-            <w:tcW w:type="dxa" w:w="2160"/>
+            <w:tcW w:type="dxa" w:w="2100"/>
             <w:vAlign w:val="center"/>
           </w:tcPr>
           <w:p>
             <w:r>
               <w:rPr>
-                <w:rFonts w:ascii="Calibri" w:hAnsi="Calibri"/>
-                <w:sz w:val="18"/>
+                <w:sz w:val="17"/>
               </w:rPr>
               <w:t>0</w:t>
             </w:r>
@@ -1784,8 +1918,7 @@
           <w:p>
             <w:r>
               <w:rPr>
-                <w:rFonts w:ascii="Calibri" w:hAnsi="Calibri"/>
-                <w:sz w:val="18"/>
+                <w:sz w:val="17"/>
               </w:rPr>
               <w:t>4</w:t>
             </w:r>
@@ -1799,8 +1932,7 @@
           <w:p>
             <w:r>
               <w:rPr>
-                <w:rFonts w:ascii="Calibri" w:hAnsi="Calibri"/>
-                <w:sz w:val="18"/>
+                <w:sz w:val="17"/>
               </w:rPr>
               <w:t>6</w:t>
             </w:r>
@@ -1814,8 +1946,7 @@
           <w:p>
             <w:r>
               <w:rPr>
-                <w:rFonts w:ascii="Calibri" w:hAnsi="Calibri"/>
-                <w:sz w:val="18"/>
+                <w:sz w:val="17"/>
               </w:rPr>
               <w:t>6</w:t>
             </w:r>
@@ -1823,14 +1954,13 @@
         </w:tc>
         <w:tc>
           <w:tcPr>
-            <w:tcW w:type="dxa" w:w="2160"/>
+            <w:tcW w:type="dxa" w:w="2100"/>
             <w:vAlign w:val="center"/>
           </w:tcPr>
           <w:p>
             <w:r>
               <w:rPr>
-                <w:rFonts w:ascii="Calibri" w:hAnsi="Calibri"/>
-                <w:sz w:val="18"/>
+                <w:sz w:val="17"/>
               </w:rPr>
               <w:t>0</w:t>
             </w:r>
@@ -1846,8 +1976,7 @@
           <w:p>
             <w:r>
               <w:rPr>
-                <w:rFonts w:ascii="Calibri" w:hAnsi="Calibri"/>
-                <w:sz w:val="18"/>
+                <w:sz w:val="17"/>
               </w:rPr>
               <w:t>8</w:t>
             </w:r>
@@ -1861,8 +1990,7 @@
           <w:p>
             <w:r>
               <w:rPr>
-                <w:rFonts w:ascii="Calibri" w:hAnsi="Calibri"/>
-                <w:sz w:val="18"/>
+                <w:sz w:val="17"/>
               </w:rPr>
               <w:t>6</w:t>
             </w:r>
@@ -1876,8 +2004,7 @@
           <w:p>
             <w:r>
               <w:rPr>
-                <w:rFonts w:ascii="Calibri" w:hAnsi="Calibri"/>
-                <w:sz w:val="18"/>
+                <w:sz w:val="17"/>
               </w:rPr>
               <w:t>6</w:t>
             </w:r>
@@ -1885,14 +2012,13 @@
         </w:tc>
         <w:tc>
           <w:tcPr>
-            <w:tcW w:type="dxa" w:w="2160"/>
+            <w:tcW w:type="dxa" w:w="2100"/>
             <w:vAlign w:val="center"/>
           </w:tcPr>
           <w:p>
             <w:r>
               <w:rPr>
-                <w:rFonts w:ascii="Calibri" w:hAnsi="Calibri"/>
-                <w:sz w:val="18"/>
+                <w:sz w:val="17"/>
               </w:rPr>
               <w:t>0</w:t>
             </w:r>
@@ -1908,8 +2034,7 @@
           <w:p>
             <w:r>
               <w:rPr>
-                <w:rFonts w:ascii="Calibri" w:hAnsi="Calibri"/>
-                <w:sz w:val="18"/>
+                <w:sz w:val="17"/>
               </w:rPr>
               <w:t>16</w:t>
             </w:r>
@@ -1923,8 +2048,7 @@
           <w:p>
             <w:r>
               <w:rPr>
-                <w:rFonts w:ascii="Calibri" w:hAnsi="Calibri"/>
-                <w:sz w:val="18"/>
+                <w:sz w:val="17"/>
               </w:rPr>
               <w:t>6</w:t>
             </w:r>
@@ -1938,8 +2062,7 @@
           <w:p>
             <w:r>
               <w:rPr>
-                <w:rFonts w:ascii="Calibri" w:hAnsi="Calibri"/>
-                <w:sz w:val="18"/>
+                <w:sz w:val="17"/>
               </w:rPr>
               <w:t>6</w:t>
             </w:r>
@@ -1947,14 +2070,13 @@
         </w:tc>
         <w:tc>
           <w:tcPr>
-            <w:tcW w:type="dxa" w:w="2160"/>
+            <w:tcW w:type="dxa" w:w="2100"/>
             <w:vAlign w:val="center"/>
           </w:tcPr>
           <w:p>
             <w:r>
               <w:rPr>
-                <w:rFonts w:ascii="Calibri" w:hAnsi="Calibri"/>
-                <w:sz w:val="18"/>
+                <w:sz w:val="17"/>
               </w:rPr>
               <w:t>0</w:t>
             </w:r>
@@ -1970,8 +2092,7 @@
           <w:p>
             <w:r>
               <w:rPr>
-                <w:rFonts w:ascii="Calibri" w:hAnsi="Calibri"/>
-                <w:sz w:val="18"/>
+                <w:sz w:val="17"/>
               </w:rPr>
               <w:t>32</w:t>
             </w:r>
@@ -1985,8 +2106,7 @@
           <w:p>
             <w:r>
               <w:rPr>
-                <w:rFonts w:ascii="Calibri" w:hAnsi="Calibri"/>
-                <w:sz w:val="18"/>
+                <w:sz w:val="17"/>
               </w:rPr>
               <w:t>6</w:t>
             </w:r>
@@ -2000,8 +2120,7 @@
           <w:p>
             <w:r>
               <w:rPr>
-                <w:rFonts w:ascii="Calibri" w:hAnsi="Calibri"/>
-                <w:sz w:val="18"/>
+                <w:sz w:val="17"/>
               </w:rPr>
               <w:t>6</w:t>
             </w:r>
@@ -2009,14 +2128,13 @@
         </w:tc>
         <w:tc>
           <w:tcPr>
-            <w:tcW w:type="dxa" w:w="2160"/>
+            <w:tcW w:type="dxa" w:w="2100"/>
             <w:vAlign w:val="center"/>
           </w:tcPr>
           <w:p>
             <w:r>
               <w:rPr>
-                <w:rFonts w:ascii="Calibri" w:hAnsi="Calibri"/>
-                <w:sz w:val="18"/>
+                <w:sz w:val="17"/>
               </w:rPr>
               <w:t>0</w:t>
             </w:r>
@@ -2026,7 +2144,12 @@
     </w:tbl>
     <w:p>
       <w:r>
-        <w:t>The real MFS matrix used a disposable 64 MiB image on /dev/vnd0 and remounted it for every preference. It produced 18 benchmark rows and zero verification errors. The 3.3 timer is coarse enough that some short operations round to zero microseconds, so allocator hit/fallback counters and data correctness are stronger evidence than small throughput differences in this run.</w:t>
+        <w:t>The matrix used a disposable 64 MiB MFS image and produced 18 rows. Every file read matched its deterministic written pattern, so verify_errors stayed zero. All requested runs from 2 through 32 zones were found without fallback. Some short timings rounded to zero because of MINIX 3.3 timer resolution, so correctness and allocator counters are stronger evidence than tiny throughput differences.</w:t>
+      </w:r>
+    </w:p>
+    <w:p>
+      <w:r>
+        <w:br w:type="page"/>
       </w:r>
     </w:p>
     <w:p>
@@ -2034,54 +2157,361 @@
         <w:pStyle w:val="Heading1"/>
       </w:pPr>
       <w:r>
-        <w:t>6. Integrated experimental method</w:t>
+        <w:t>6. Native MINIX build and test evidence</w:t>
+      </w:r>
+    </w:p>
+    <w:p>
+      <w:pPr>
+        <w:pStyle w:val="Heading2"/>
+      </w:pPr>
+      <w:r>
+        <w:t>Commands executed in the VM</w:t>
+      </w:r>
+    </w:p>
+    <w:p>
+      <w:pPr>
+        <w:pStyle w:val="NoSpacing"/>
+        <w:spacing w:after="40"/>
+        <w:ind w:left="317"/>
+      </w:pPr>
+      <w:r>
+        <w:rPr>
+          <w:rFonts w:ascii="Consolas" w:hAnsi="Consolas"/>
+          <w:sz w:val="16"/>
+        </w:rPr>
+        <w:t>cd /usr/src &amp;&amp; make includes</w:t>
+      </w:r>
+    </w:p>
+    <w:p>
+      <w:pPr>
+        <w:pStyle w:val="NoSpacing"/>
+        <w:spacing w:after="40"/>
+        <w:ind w:left="317"/>
+      </w:pPr>
+      <w:r>
+        <w:rPr>
+          <w:rFonts w:ascii="Consolas" w:hAnsi="Consolas"/>
+          <w:sz w:val="16"/>
+        </w:rPr>
+        <w:t>cd /usr/src/minix/commands/schedexperiment &amp;&amp; make &amp;&amp; make install</w:t>
+      </w:r>
+    </w:p>
+    <w:p>
+      <w:pPr>
+        <w:pStyle w:val="NoSpacing"/>
+        <w:spacing w:after="40"/>
+        <w:ind w:left="317"/>
+      </w:pPr>
+      <w:r>
+        <w:rPr>
+          <w:rFonts w:ascii="Consolas" w:hAnsi="Consolas"/>
+          <w:sz w:val="16"/>
+        </w:rPr>
+        <w:t>cd /usr/src/minix/commands/vmexperiment &amp;&amp; make &amp;&amp; make install</w:t>
+      </w:r>
+    </w:p>
+    <w:p>
+      <w:pPr>
+        <w:pStyle w:val="NoSpacing"/>
+        <w:spacing w:after="40"/>
+        <w:ind w:left="317"/>
+      </w:pPr>
+      <w:r>
+        <w:rPr>
+          <w:rFonts w:ascii="Consolas" w:hAnsi="Consolas"/>
+          <w:sz w:val="16"/>
+        </w:rPr>
+        <w:t>cd /usr/src/minix/commands/extentexperiment &amp;&amp; make &amp;&amp; make install</w:t>
+      </w:r>
+    </w:p>
+    <w:p>
+      <w:pPr>
+        <w:pStyle w:val="NoSpacing"/>
+        <w:spacing w:after="40"/>
+        <w:ind w:left="317"/>
+      </w:pPr>
+      <w:r>
+        <w:rPr>
+          <w:rFonts w:ascii="Consolas" w:hAnsi="Consolas"/>
+          <w:sz w:val="16"/>
+        </w:rPr>
+        <w:t>cd /usr/src/minix/fs/mfs &amp;&amp; make &amp;&amp; make install</w:t>
+      </w:r>
+    </w:p>
+    <w:p>
+      <w:pPr>
+        <w:pStyle w:val="NoSpacing"/>
+        <w:spacing w:after="40"/>
+        <w:ind w:left="317"/>
+      </w:pPr>
+      <w:r>
+        <w:rPr>
+          <w:rFonts w:ascii="Consolas" w:hAnsi="Consolas"/>
+          <w:sz w:val="16"/>
+        </w:rPr>
+        <w:t>cd /usr/src/minix/commands/schedexperiment/tests &amp;&amp; sh test_known.sh</w:t>
+      </w:r>
+    </w:p>
+    <w:p>
+      <w:pPr>
+        <w:pStyle w:val="NoSpacing"/>
+        <w:spacing w:after="40"/>
+        <w:ind w:left="317"/>
+      </w:pPr>
+      <w:r>
+        <w:rPr>
+          <w:rFonts w:ascii="Consolas" w:hAnsi="Consolas"/>
+          <w:sz w:val="16"/>
+        </w:rPr>
+        <w:t>cd /usr/src/minix/commands/vmexperiment/tests &amp;&amp; sh test_known.sh</w:t>
+      </w:r>
+    </w:p>
+    <w:p>
+      <w:pPr>
+        <w:pStyle w:val="NoSpacing"/>
+        <w:spacing w:after="40"/>
+        <w:ind w:left="317"/>
+      </w:pPr>
+      <w:r>
+        <w:rPr>
+          <w:rFonts w:ascii="Consolas" w:hAnsi="Consolas"/>
+          <w:sz w:val="16"/>
+        </w:rPr>
+        <w:t>cd /usr/src/minix/commands/extentexperiment/tests &amp;&amp; sh test_known.sh</w:t>
+      </w:r>
+    </w:p>
+    <w:p>
+      <w:pPr>
+        <w:pStyle w:val="NoSpacing"/>
+        <w:spacing w:after="40"/>
+        <w:ind w:left="317"/>
+      </w:pPr>
+      <w:r>
+        <w:rPr>
+          <w:rFonts w:ascii="Consolas" w:hAnsi="Consolas"/>
+          <w:sz w:val="16"/>
+        </w:rPr>
+        <w:t>run_schedexperiments.sh /root/scheduling-matrix.csv</w:t>
+      </w:r>
+    </w:p>
+    <w:p>
+      <w:pPr>
+        <w:pStyle w:val="NoSpacing"/>
+        <w:spacing w:after="40"/>
+        <w:ind w:left="317"/>
+      </w:pPr>
+      <w:r>
+        <w:rPr>
+          <w:rFonts w:ascii="Consolas" w:hAnsi="Consolas"/>
+          <w:sz w:val="16"/>
+        </w:rPr>
+        <w:t>run_vmexperiments.sh /root/paging-matrix.csv</w:t>
+      </w:r>
+    </w:p>
+    <w:p>
+      <w:pPr>
+        <w:pStyle w:val="NoSpacing"/>
+        <w:spacing w:after="40"/>
+        <w:ind w:left="317"/>
+      </w:pPr>
+      <w:r>
+        <w:rPr>
+          <w:rFonts w:ascii="Consolas" w:hAnsi="Consolas"/>
+          <w:sz w:val="16"/>
+        </w:rPr>
+        <w:t>run_extent_matrix.sh /root/extent-matrix.csv</w:t>
+      </w:r>
+    </w:p>
+    <w:p>
+      <w:r>
+        <w:t>The known tests are deterministic oracles: expected scheduling averages are checked exactly, FIFO/LRU totals are compared with a known reference string, and extent I/O is read back and byte-verified. Matrix collection ran only after all three tests passed.</w:t>
+      </w:r>
+    </w:p>
+    <w:p>
+      <w:pPr>
+        <w:spacing w:after="80"/>
+        <w:jc w:val="center"/>
+      </w:pPr>
+      <w:r>
+        <w:drawing>
+          <wp:inline xmlns:a="http://schemas.openxmlformats.org/drawingml/2006/main" xmlns:pic="http://schemas.openxmlformats.org/drawingml/2006/picture">
+            <wp:extent cx="5852160" cy="3251200"/>
+            <wp:docPr id="4" name="Picture 4"/>
+            <wp:cNvGraphicFramePr>
+              <a:graphicFrameLocks noChangeAspect="1"/>
+            </wp:cNvGraphicFramePr>
+            <a:graphic>
+              <a:graphicData uri="http://schemas.openxmlformats.org/drawingml/2006/picture">
+                <pic:pic>
+                  <pic:nvPicPr>
+                    <pic:cNvPr id="0" name="minix-native-validation.png"/>
+                    <pic:cNvPicPr/>
+                  </pic:nvPicPr>
+                  <pic:blipFill>
+                    <a:blip r:embed="rId14"/>
+                    <a:stretch>
+                      <a:fillRect/>
+                    </a:stretch>
+                  </pic:blipFill>
+                  <pic:spPr>
+                    <a:xfrm>
+                      <a:off x="0" y="0"/>
+                      <a:ext cx="5852160" cy="3251200"/>
+                    </a:xfrm>
+                    <a:prstGeom prst="rect"/>
+                  </pic:spPr>
+                </pic:pic>
+              </a:graphicData>
+            </a:graphic>
+          </wp:inline>
+        </w:drawing>
+      </w:r>
+    </w:p>
+    <w:p>
+      <w:pPr>
+        <w:spacing w:after="180"/>
+        <w:jc w:val="center"/>
+      </w:pPr>
+      <w:r>
+        <w:rPr>
+          <w:i/>
+          <w:color w:val="5A5A5A"/>
+          <w:sz w:val="17"/>
+        </w:rPr>
+        <w:t>Figure 4. Actual VirtualBox MINIX console: PASS results, CSV row counts/checksums, and MFS counters.</w:t>
+      </w:r>
+    </w:p>
+    <w:p>
+      <w:r>
+        <w:br w:type="page"/>
+      </w:r>
+    </w:p>
+    <w:p>
+      <w:pPr>
+        <w:pStyle w:val="Heading2"/>
+      </w:pPr>
+      <w:r>
+        <w:t>MFS extent console output</w:t>
+      </w:r>
+    </w:p>
+    <w:p>
+      <w:pPr>
+        <w:spacing w:after="80"/>
+        <w:jc w:val="center"/>
+      </w:pPr>
+      <w:r>
+        <w:drawing>
+          <wp:inline xmlns:a="http://schemas.openxmlformats.org/drawingml/2006/main" xmlns:pic="http://schemas.openxmlformats.org/drawingml/2006/picture">
+            <wp:extent cx="5852160" cy="3251200"/>
+            <wp:docPr id="5" name="Picture 5"/>
+            <wp:cNvGraphicFramePr>
+              <a:graphicFrameLocks noChangeAspect="1"/>
+            </wp:cNvGraphicFramePr>
+            <a:graphic>
+              <a:graphicData uri="http://schemas.openxmlformats.org/drawingml/2006/picture">
+                <pic:pic>
+                  <pic:nvPicPr>
+                    <pic:cNvPr id="0" name="minix-mfs-extent-results.png"/>
+                    <pic:cNvPicPr/>
+                  </pic:nvPicPr>
+                  <pic:blipFill>
+                    <a:blip r:embed="rId15"/>
+                    <a:stretch>
+                      <a:fillRect/>
+                    </a:stretch>
+                  </pic:blipFill>
+                  <pic:spPr>
+                    <a:xfrm>
+                      <a:off x="0" y="0"/>
+                      <a:ext cx="5852160" cy="3251200"/>
+                    </a:xfrm>
+                    <a:prstGeom prst="rect"/>
+                  </pic:spPr>
+                </pic:pic>
+              </a:graphicData>
+            </a:graphic>
+          </wp:inline>
+        </w:drawing>
+      </w:r>
+    </w:p>
+    <w:p>
+      <w:pPr>
+        <w:spacing w:after="180"/>
+        <w:jc w:val="center"/>
+      </w:pPr>
+      <w:r>
+        <w:rPr>
+          <w:i/>
+          <w:color w:val="5A5A5A"/>
+          <w:sz w:val="17"/>
+        </w:rPr>
+        <w:t>Figure 5. Actual MINIX console: final extent-size counters recorded by MFS.</w:t>
+      </w:r>
+    </w:p>
+    <w:p>
+      <w:pPr>
+        <w:pStyle w:val="Heading1"/>
+      </w:pPr>
+      <w:r>
+        <w:t>7. Changed files</w:t>
       </w:r>
     </w:p>
     <w:tbl>
       <w:tblPr>
         <w:tblStyle w:val="TableGrid"/>
-        <w:tblW w:type="dxa" w:w="9360"/>
+        <w:tblW w:type="auto" w:w="0"/>
         <w:jc w:val="left"/>
         <w:tblLayout w:type="fixed"/>
         <w:tblLook w:firstColumn="1" w:firstRow="1" w:lastColumn="0" w:lastRow="0" w:noHBand="0" w:noVBand="1" w:val="04A0"/>
-        <w:tblInd w:w="120" w:type="dxa"/>
       </w:tblPr>
       <w:tblGrid>
-        <w:gridCol w:w="1800"/>
-        <w:gridCol w:w="7560"/>
+        <w:gridCol w:w="3293"/>
+        <w:gridCol w:w="3293"/>
+        <w:gridCol w:w="3293"/>
       </w:tblGrid>
       <w:tr>
         <w:tc>
           <w:tcPr>
-            <w:tcW w:type="dxa" w:w="1800"/>
+            <w:tcW w:type="dxa" w:w="1600"/>
             <w:shd w:fill="F2F4F7"/>
-            <w:vAlign w:val="center"/>
           </w:tcPr>
           <w:p>
             <w:r>
               <w:rPr>
-                <w:rFonts w:ascii="Calibri" w:hAnsi="Calibri"/>
                 <w:b/>
-                <w:sz w:val="18"/>
+                <w:sz w:val="17"/>
               </w:rPr>
-              <w:t>Stage</w:t>
+              <w:t>Area</w:t>
             </w:r>
           </w:p>
         </w:tc>
         <w:tc>
           <w:tcPr>
-            <w:tcW w:type="dxa" w:w="7560"/>
+            <w:tcW w:type="dxa" w:w="3900"/>
             <w:shd w:fill="F2F4F7"/>
-            <w:vAlign w:val="center"/>
           </w:tcPr>
           <w:p>
             <w:r>
               <w:rPr>
-                <w:rFonts w:ascii="Calibri" w:hAnsi="Calibri"/>
                 <w:b/>
-                <w:sz w:val="18"/>
+                <w:sz w:val="17"/>
               </w:rPr>
-              <w:t>Action</w:t>
+              <w:t>Main edited files</w:t>
+            </w:r>
+          </w:p>
+        </w:tc>
+        <w:tc>
+          <w:tcPr>
+            <w:tcW w:type="dxa" w:w="3900"/>
+            <w:shd w:fill="F2F4F7"/>
+          </w:tcPr>
+          <w:p>
+            <w:r>
+              <w:rPr>
+                <w:b/>
+                <w:sz w:val="17"/>
+              </w:rPr>
+              <w:t>Purpose</w:t>
             </w:r>
           </w:p>
         </w:tc>
@@ -2089,31 +2519,43 @@
       <w:tr>
         <w:tc>
           <w:tcPr>
-            <w:tcW w:type="dxa" w:w="1800"/>
+            <w:tcW w:type="dxa" w:w="1600"/>
             <w:vAlign w:val="center"/>
           </w:tcPr>
           <w:p>
             <w:r>
               <w:rPr>
-                <w:rFonts w:ascii="Calibri" w:hAnsi="Calibri"/>
-                <w:sz w:val="18"/>
+                <w:sz w:val="17"/>
               </w:rPr>
-              <w:t>Preserve</w:t>
+              <w:t>Scheduling</w:t>
             </w:r>
           </w:p>
         </w:tc>
         <w:tc>
           <w:tcPr>
-            <w:tcW w:type="dxa" w:w="7560"/>
+            <w:tcW w:type="dxa" w:w="3900"/>
             <w:vAlign w:val="center"/>
           </w:tcPr>
           <w:p>
             <w:r>
               <w:rPr>
-                <w:rFonts w:ascii="Calibri" w:hAnsi="Calibri"/>
-                <w:sz w:val="18"/>
+                <w:sz w:val="17"/>
               </w:rPr>
-              <w:t>Take a VM snapshot and confirm that /usr/src corresponds to the submitted tree and baseline tag.</w:t>
+              <w:t>minix/commands/schedexperiment/*</w:t>
+            </w:r>
+          </w:p>
+        </w:tc>
+        <w:tc>
+          <w:tcPr>
+            <w:tcW w:type="dxa" w:w="3900"/>
+            <w:vAlign w:val="center"/>
+          </w:tcPr>
+          <w:p>
+            <w:r>
+              <w:rPr>
+                <w:sz w:val="17"/>
+              </w:rPr>
+              <w:t>Parser, dispatcher, metrics, test, and matrix script</w:t>
             </w:r>
           </w:p>
         </w:tc>
@@ -2121,31 +2563,43 @@
       <w:tr>
         <w:tc>
           <w:tcPr>
-            <w:tcW w:type="dxa" w:w="1800"/>
+            <w:tcW w:type="dxa" w:w="1600"/>
             <w:vAlign w:val="center"/>
           </w:tcPr>
           <w:p>
             <w:r>
               <w:rPr>
-                <w:rFonts w:ascii="Calibri" w:hAnsi="Calibri"/>
-                <w:sz w:val="18"/>
+                <w:sz w:val="17"/>
               </w:rPr>
-              <w:t>Build</w:t>
+              <w:t>Paging</w:t>
             </w:r>
           </w:p>
         </w:tc>
         <w:tc>
           <w:tcPr>
-            <w:tcW w:type="dxa" w:w="7560"/>
+            <w:tcW w:type="dxa" w:w="3900"/>
             <w:vAlign w:val="center"/>
           </w:tcPr>
           <w:p>
             <w:r>
               <w:rPr>
-                <w:rFonts w:ascii="Calibri" w:hAnsi="Calibri"/>
-                <w:sz w:val="18"/>
+                <w:sz w:val="17"/>
               </w:rPr>
-              <w:t>Compile and install the three experiment commands, then compile and install MFS using the VM's native toolchain.</w:t>
+              <w:t>minix/commands/vmexperiment/*</w:t>
+            </w:r>
+          </w:p>
+        </w:tc>
+        <w:tc>
+          <w:tcPr>
+            <w:tcW w:type="dxa" w:w="3900"/>
+            <w:vAlign w:val="center"/>
+          </w:tcPr>
+          <w:p>
+            <w:r>
+              <w:rPr>
+                <w:sz w:val="17"/>
+              </w:rPr>
+              <w:t>Hierarchy, traces, FIFO/LRU, test, and matrix script</w:t>
             </w:r>
           </w:p>
         </w:tc>
@@ -2153,31 +2607,43 @@
       <w:tr>
         <w:tc>
           <w:tcPr>
-            <w:tcW w:type="dxa" w:w="1800"/>
+            <w:tcW w:type="dxa" w:w="1600"/>
             <w:vAlign w:val="center"/>
           </w:tcPr>
           <w:p>
             <w:r>
               <w:rPr>
-                <w:rFonts w:ascii="Calibri" w:hAnsi="Calibri"/>
-                <w:sz w:val="18"/>
+                <w:sz w:val="17"/>
               </w:rPr>
-              <w:t>Smoke-test</w:t>
+              <w:t>MFS</w:t>
             </w:r>
           </w:p>
         </w:tc>
         <w:tc>
           <w:tcPr>
-            <w:tcW w:type="dxa" w:w="7560"/>
+            <w:tcW w:type="dxa" w:w="3900"/>
             <w:vAlign w:val="center"/>
           </w:tcPr>
           <w:p>
             <w:r>
               <w:rPr>
-                <w:rFonts w:ascii="Calibri" w:hAnsi="Calibri"/>
-                <w:sz w:val="18"/>
+                <w:sz w:val="17"/>
               </w:rPr>
-              <w:t>Run every known-workload shell test before collecting a matrix; stop if any expected value or data verification fails.</w:t>
+              <w:t>minix/fs/mfs/cache.c, super.c, main.c, mount.c</w:t>
+            </w:r>
+          </w:p>
+        </w:tc>
+        <w:tc>
+          <w:tcPr>
+            <w:tcW w:type="dxa" w:w="3900"/>
+            <w:vAlign w:val="center"/>
+          </w:tcPr>
+          <w:p>
+            <w:r>
+              <w:rPr>
+                <w:sz w:val="17"/>
+              </w:rPr>
+              <w:t>Exact bitmap origin, free-run scan, option, counters</w:t>
             </w:r>
           </w:p>
         </w:tc>
@@ -2185,31 +2651,43 @@
       <w:tr>
         <w:tc>
           <w:tcPr>
-            <w:tcW w:type="dxa" w:w="1800"/>
+            <w:tcW w:type="dxa" w:w="1600"/>
             <w:vAlign w:val="center"/>
           </w:tcPr>
           <w:p>
             <w:r>
               <w:rPr>
-                <w:rFonts w:ascii="Calibri" w:hAnsi="Calibri"/>
-                <w:sz w:val="18"/>
+                <w:sz w:val="17"/>
               </w:rPr>
-              <w:t>Control</w:t>
+              <w:t>Extent test</w:t>
             </w:r>
           </w:p>
         </w:tc>
         <w:tc>
           <w:tcPr>
-            <w:tcW w:type="dxa" w:w="7560"/>
+            <w:tcW w:type="dxa" w:w="3900"/>
             <w:vAlign w:val="center"/>
           </w:tcPr>
           <w:p>
             <w:r>
               <w:rPr>
-                <w:rFonts w:ascii="Calibri" w:hAnsi="Calibri"/>
-                <w:sz w:val="18"/>
+                <w:sz w:val="17"/>
               </w:rPr>
-              <w:t>Change one principal independent variable at a time and keep workloads, seeds, frames, file sizes, and environment stable.</w:t>
+              <w:t>minix/commands/extentexperiment/*</w:t>
+            </w:r>
+          </w:p>
+        </w:tc>
+        <w:tc>
+          <w:tcPr>
+            <w:tcW w:type="dxa" w:w="3900"/>
+            <w:vAlign w:val="center"/>
+          </w:tcPr>
+          <w:p>
+            <w:r>
+              <w:rPr>
+                <w:sz w:val="17"/>
+              </w:rPr>
+              <w:t>Verified directory/file I/O and CSV metrics</w:t>
             </w:r>
           </w:p>
         </w:tc>
@@ -2217,1042 +2695,64 @@
       <w:tr>
         <w:tc>
           <w:tcPr>
-            <w:tcW w:type="dxa" w:w="1800"/>
+            <w:tcW w:type="dxa" w:w="1600"/>
             <w:vAlign w:val="center"/>
           </w:tcPr>
           <w:p>
             <w:r>
               <w:rPr>
-                <w:rFonts w:ascii="Calibri" w:hAnsi="Calibri"/>
-                <w:sz w:val="18"/>
+                <w:sz w:val="17"/>
               </w:rPr>
-              <w:t>Measure</w:t>
+              <w:t>Integration</w:t>
             </w:r>
           </w:p>
         </w:tc>
         <w:tc>
           <w:tcPr>
-            <w:tcW w:type="dxa" w:w="7560"/>
+            <w:tcW w:type="dxa" w:w="3900"/>
             <w:vAlign w:val="center"/>
           </w:tcPr>
           <w:p>
             <w:r>
               <w:rPr>
-                <w:rFonts w:ascii="Calibri" w:hAnsi="Calibri"/>
-                <w:sz w:val="18"/>
+                <w:sz w:val="17"/>
               </w:rPr>
-              <w:t>Write raw CSV directly from the program and capture MFS console counters; do not transcribe values manually.</w:t>
+              <w:t>minix/commands/Makefile; etc/Makefile; etc/*.conf</w:t>
             </w:r>
           </w:p>
         </w:tc>
-      </w:tr>
-      <w:tr>
         <w:tc>
           <w:tcPr>
-            <w:tcW w:type="dxa" w:w="1800"/>
+            <w:tcW w:type="dxa" w:w="3900"/>
             <w:vAlign w:val="center"/>
           </w:tcPr>
           <w:p>
             <w:r>
               <w:rPr>
-                <w:rFonts w:ascii="Calibri" w:hAnsi="Calibri"/>
-                <w:sz w:val="18"/>
+                <w:sz w:val="17"/>
               </w:rPr>
-              <w:t>Repeat</w:t>
-            </w:r>
-          </w:p>
-        </w:tc>
-        <w:tc>
-          <w:tcPr>
-            <w:tcW w:type="dxa" w:w="7560"/>
-            <w:vAlign w:val="center"/>
-          </w:tcPr>
-          <w:p>
-            <w:r>
-              <w:rPr>
-                <w:rFonts w:ascii="Calibri" w:hAnsi="Calibri"/>
-                <w:sz w:val="18"/>
-              </w:rPr>
-              <w:t>Use repeated extent trials and, where time allows, repeated wall-time scheduling trials to expose VM noise.</w:t>
-            </w:r>
-          </w:p>
-        </w:tc>
-      </w:tr>
-      <w:tr>
-        <w:tc>
-          <w:tcPr>
-            <w:tcW w:type="dxa" w:w="1800"/>
-            <w:vAlign w:val="center"/>
-          </w:tcPr>
-          <w:p>
-            <w:r>
-              <w:rPr>
-                <w:rFonts w:ascii="Calibri" w:hAnsi="Calibri"/>
-                <w:sz w:val="18"/>
-              </w:rPr>
-              <w:t>Analyze</w:t>
-            </w:r>
-          </w:p>
-        </w:tc>
-        <w:tc>
-          <w:tcPr>
-            <w:tcW w:type="dxa" w:w="7560"/>
-            <w:vAlign w:val="center"/>
-          </w:tcPr>
-          <w:p>
-            <w:r>
-              <w:rPr>
-                <w:rFonts w:ascii="Calibri" w:hAnsi="Calibri"/>
-                <w:sz w:val="18"/>
-              </w:rPr>
-              <w:t>Compute comparable summaries, label oracle versus measured data, and interpret both benefits and costs.</w:t>
-            </w:r>
-          </w:p>
-        </w:tc>
-      </w:tr>
-      <w:tr>
-        <w:tc>
-          <w:tcPr>
-            <w:tcW w:type="dxa" w:w="1800"/>
-            <w:vAlign w:val="center"/>
-          </w:tcPr>
-          <w:p>
-            <w:r>
-              <w:rPr>
-                <w:rFonts w:ascii="Calibri" w:hAnsi="Calibri"/>
-                <w:sz w:val="18"/>
-              </w:rPr>
-              <w:t>Archive</w:t>
-            </w:r>
-          </w:p>
-        </w:tc>
-        <w:tc>
-          <w:tcPr>
-            <w:tcW w:type="dxa" w:w="7560"/>
-            <w:vAlign w:val="center"/>
-          </w:tcPr>
-          <w:p>
-            <w:r>
-              <w:rPr>
-                <w:rFonts w:ascii="Calibri" w:hAnsi="Calibri"/>
-                <w:sz w:val="18"/>
-              </w:rPr>
-              <w:t>Copy CSV and console evidence out of the VM, record the commit hash, and create the final source archive.</w:t>
+              <w:t>Build/install entries and configurations</w:t>
             </w:r>
           </w:p>
         </w:tc>
       </w:tr>
     </w:tbl>
     <w:p>
+      <w:pPr>
+        <w:pStyle w:val="Heading1"/>
+      </w:pPr>
       <w:r>
-        <w:t>Independent variables are scheduler policy and quantum, simulated page size/hierarchy/replacement, and MFS extent preference. Dependent variables are turnaround, waiting, response, dispatches, faults, hits, replacements, empty frames, hierarchy memory, allocation hits/fallbacks, operation latency, throughput, and verification errors. Controlled variables include process workload, trace seed and byte working set, frame count, benchmark file size, scratch device state, compiler tree, and VM resources.</w:t>
+        <w:t>8. Conclusion</w:t>
       </w:r>
     </w:p>
     <w:p>
       <w:r>
-        <w:t>Threats to internal validity include background VM activity, cache warmth, compiler differences, an extent configuration that does not match the mount option, and running matrices against different disk states. Threats to construct validity include treating logical dispatches as kernel context switches, treating simulated faults as hardware page faults, or treating write chunk count as an on-disk extent tree. Threats to external validity include the small synthetic workloads and MINIX's educational architecture. Each reported conclusion must remain within those boundaries.</w:t>
+        <w:t>All three requirements were built and executed in MINIX 3.3.0. The native correctness gate passed for scheduling, FIFO/LRU paging, and extent file/directory I/O. The matrices contain 80 scheduling rows, 72 paging rows, and 18 extent rows; their checksums are preserved. Requirement 1 demonstrates responsiveness versus dispatch cost, Requirement 2 shows lower LRU faults for the chosen locality workload, and Requirement 3 confirms successful contiguous-run preference with safe fallback and correct data.</w:t>
       </w:r>
     </w:p>
     <w:p>
       <w:r>
-        <w:t>The analysis should prefer comparisons and mechanisms over a single winner. SJF can minimize an average yet harm responsiveness; MLFQ can respond quickly yet add dispatch cost. LRU can reduce faults yet require more bookkeeping. Larger pages can reduce faults for a localized byte workload yet waste space. Larger extent preferences can improve sequential placement when runs exist yet spend more time scanning a fragmented bitmap. Operating-system policy is a trade-off surface, not a ranking detached from workload.</w:t>
-      </w:r>
-    </w:p>
-    <w:p>
-      <w:pPr>
-        <w:pStyle w:val="Heading1"/>
-      </w:pPr>
-      <w:r>
-        <w:t>7. Build, test, and run procedure</w:t>
-      </w:r>
-    </w:p>
-    <w:p>
-      <w:pPr>
-        <w:pStyle w:val="NoSpacing"/>
-        <w:spacing w:after="60"/>
-        <w:ind w:left="360"/>
-      </w:pPr>
-      <w:r>
-        <w:rPr>
-          <w:rFonts w:ascii="Consolas" w:hAnsi="Consolas"/>
-          <w:sz w:val="17"/>
-        </w:rPr>
-        <w:t>cd /usr/src &amp;&amp; make includes</w:t>
-      </w:r>
-    </w:p>
-    <w:p>
-      <w:pPr>
-        <w:pStyle w:val="NoSpacing"/>
-        <w:spacing w:after="60"/>
-        <w:ind w:left="360"/>
-      </w:pPr>
-      <w:r>
-        <w:rPr>
-          <w:rFonts w:ascii="Consolas" w:hAnsi="Consolas"/>
-          <w:sz w:val="17"/>
-        </w:rPr>
-        <w:t>cd /usr/src/minix/commands/schedexperiment &amp;&amp; make &amp;&amp; make install</w:t>
-      </w:r>
-    </w:p>
-    <w:p>
-      <w:pPr>
-        <w:pStyle w:val="NoSpacing"/>
-        <w:spacing w:after="60"/>
-        <w:ind w:left="360"/>
-      </w:pPr>
-      <w:r>
-        <w:rPr>
-          <w:rFonts w:ascii="Consolas" w:hAnsi="Consolas"/>
-          <w:sz w:val="17"/>
-        </w:rPr>
-        <w:t>cd /usr/src/minix/commands/vmexperiment &amp;&amp; make &amp;&amp; make install</w:t>
-      </w:r>
-    </w:p>
-    <w:p>
-      <w:pPr>
-        <w:pStyle w:val="NoSpacing"/>
-        <w:spacing w:after="60"/>
-        <w:ind w:left="360"/>
-      </w:pPr>
-      <w:r>
-        <w:rPr>
-          <w:rFonts w:ascii="Consolas" w:hAnsi="Consolas"/>
-          <w:sz w:val="17"/>
-        </w:rPr>
-        <w:t>cd /usr/src/minix/commands/extentexperiment &amp;&amp; make &amp;&amp; make install</w:t>
-      </w:r>
-    </w:p>
-    <w:p>
-      <w:pPr>
-        <w:pStyle w:val="NoSpacing"/>
-        <w:spacing w:after="60"/>
-        <w:ind w:left="360"/>
-      </w:pPr>
-      <w:r>
-        <w:rPr>
-          <w:rFonts w:ascii="Consolas" w:hAnsi="Consolas"/>
-          <w:sz w:val="17"/>
-        </w:rPr>
-        <w:t>cp /usr/src/etc/scheduler.conf /etc/scheduler.conf</w:t>
-      </w:r>
-    </w:p>
-    <w:p>
-      <w:pPr>
-        <w:pStyle w:val="NoSpacing"/>
-        <w:spacing w:after="60"/>
-        <w:ind w:left="360"/>
-      </w:pPr>
-      <w:r>
-        <w:rPr>
-          <w:rFonts w:ascii="Consolas" w:hAnsi="Consolas"/>
-          <w:sz w:val="17"/>
-        </w:rPr>
-        <w:t>cp /usr/src/etc/paging.conf /etc/paging.conf</w:t>
-      </w:r>
-    </w:p>
-    <w:p>
-      <w:pPr>
-        <w:pStyle w:val="NoSpacing"/>
-        <w:spacing w:after="60"/>
-        <w:ind w:left="360"/>
-      </w:pPr>
-      <w:r>
-        <w:rPr>
-          <w:rFonts w:ascii="Consolas" w:hAnsi="Consolas"/>
-          <w:sz w:val="17"/>
-        </w:rPr>
-        <w:t>cp /usr/src/etc/extent.conf /etc/extent.conf</w:t>
-      </w:r>
-    </w:p>
-    <w:p>
-      <w:pPr>
-        <w:pStyle w:val="NoSpacing"/>
-        <w:spacing w:after="60"/>
-        <w:ind w:left="360"/>
-      </w:pPr>
-      <w:r>
-        <w:rPr>
-          <w:rFonts w:ascii="Consolas" w:hAnsi="Consolas"/>
-          <w:sz w:val="17"/>
-        </w:rPr>
-        <w:t>cd /usr/src/minix/fs/mfs &amp;&amp; make &amp;&amp; make install</w:t>
-      </w:r>
-    </w:p>
-    <w:p>
-      <w:pPr>
-        <w:pStyle w:val="NoSpacing"/>
-        <w:spacing w:after="60"/>
-        <w:ind w:left="360"/>
-      </w:pPr>
-      <w:r>
-        <w:rPr>
-          <w:rFonts w:ascii="Consolas" w:hAnsi="Consolas"/>
-          <w:sz w:val="17"/>
-        </w:rPr>
-        <w:t>cd /usr/src/minix/commands/schedexperiment/tests &amp;&amp; sh test_known.sh</w:t>
-      </w:r>
-    </w:p>
-    <w:p>
-      <w:pPr>
-        <w:pStyle w:val="NoSpacing"/>
-        <w:spacing w:after="60"/>
-        <w:ind w:left="360"/>
-      </w:pPr>
-      <w:r>
-        <w:rPr>
-          <w:rFonts w:ascii="Consolas" w:hAnsi="Consolas"/>
-          <w:sz w:val="17"/>
-        </w:rPr>
-        <w:t>cd /usr/src/minix/commands/vmexperiment/tests &amp;&amp; sh test_known.sh</w:t>
-      </w:r>
-    </w:p>
-    <w:p>
-      <w:pPr>
-        <w:pStyle w:val="NoSpacing"/>
-        <w:spacing w:after="60"/>
-        <w:ind w:left="360"/>
-      </w:pPr>
-      <w:r>
-        <w:rPr>
-          <w:rFonts w:ascii="Consolas" w:hAnsi="Consolas"/>
-          <w:sz w:val="17"/>
-        </w:rPr>
-        <w:t>cd /usr/src/minix/commands/extentexperiment/tests &amp;&amp; sh test_known.sh</w:t>
-      </w:r>
-    </w:p>
-    <w:p>
-      <w:pPr>
-        <w:pStyle w:val="NoSpacing"/>
-        <w:spacing w:after="60"/>
-        <w:ind w:left="360"/>
-      </w:pPr>
-      <w:r>
-        <w:rPr>
-          <w:rFonts w:ascii="Consolas" w:hAnsi="Consolas"/>
-          <w:sz w:val="17"/>
-        </w:rPr>
-        <w:t>run_schedexperiments.sh /tmp/scheduling-matrix.csv</w:t>
-      </w:r>
-    </w:p>
-    <w:p>
-      <w:pPr>
-        <w:pStyle w:val="NoSpacing"/>
-        <w:spacing w:after="60"/>
-        <w:ind w:left="360"/>
-      </w:pPr>
-      <w:r>
-        <w:rPr>
-          <w:rFonts w:ascii="Consolas" w:hAnsi="Consolas"/>
-          <w:sz w:val="17"/>
-        </w:rPr>
-        <w:t>run_vmexperiments.sh /tmp/paging-matrix.csv</w:t>
-      </w:r>
-    </w:p>
-    <w:p>
-      <w:pPr>
-        <w:pStyle w:val="NoSpacing"/>
-        <w:spacing w:after="60"/>
-        <w:ind w:left="360"/>
-      </w:pPr>
-      <w:r>
-        <w:rPr>
-          <w:rFonts w:ascii="Consolas" w:hAnsi="Consolas"/>
-          <w:sz w:val="17"/>
-        </w:rPr>
-        <w:t>run_extent_matrix.sh /tmp/extent-matrix.csv</w:t>
-      </w:r>
-    </w:p>
-    <w:p>
-      <w:r>
-        <w:t>The MFS command must be tested on a secondary device. First verify the device identity using the VM's disk and mount information. Create or use an already prepared scratch MFS file system only after that verification, create /mnt/extenttest, and mount with the desired mfs_extent_size option. Point extent.conf at a directory under that mount. Unmount after each matrix segment so MFS prints its counters and the next extent preference starts in a new server instance.</w:t>
-      </w:r>
-    </w:p>
-    <w:p>
-      <w:r>
-        <w:t>A failed compile should be handled as evidence, not bypassed. Record the first compiler diagnostic, inspect the exact source and header contract, fix the source in the repository, recommit, and rebuild from a clean command directory. A failed deterministic test should stop performance collection because later numbers would be meaningless. A nonzero verify_errors value is always a correctness failure regardless of throughput.</w:t>
-      </w:r>
-    </w:p>
-    <w:p>
-      <w:pPr>
-        <w:pStyle w:val="Heading1"/>
-      </w:pPr>
-      <w:r>
-        <w:t>8. Source-level audit</w:t>
-      </w:r>
-    </w:p>
-    <w:p>
-      <w:pPr>
-        <w:pStyle w:val="Heading3"/>
-      </w:pPr>
-      <w:r>
-        <w:t>schedexperiment/config.c</w:t>
-      </w:r>
-    </w:p>
-    <w:p>
-      <w:r>
-        <w:t>Role and rationale. This unit parses and validates policy, quanta, worker scale, output, and process rows. It is kept narrowly scoped so a reviewer can connect the requirement to a small number of functions instead of searching across unrelated MINIX subsystems. Its output or state feeds a documented CSV column, console counter, or downstream correctness check.</w:t>
-      </w:r>
-    </w:p>
-    <w:p>
-      <w:r>
-        <w:t>Critical review point. The implementation must reject malformed workloads and bounds before forking. The relevant failure mode is treated as a correctness problem rather than hidden by a performance average. Error returns carry a concise diagnostic and callers stop the current experiment, preserving the raw evidence needed for debugging.</w:t>
-      </w:r>
-    </w:p>
-    <w:p>
-      <w:r>
-        <w:t>Verification evidence. The primary check is known.conf plus invalid-input checks. Review should compare configuration, console output, and CSV together, then inspect the git diff against baseline-v3.3.0. This triangulation checks both what the source intends and what the MINIX runtime actually executed.</w:t>
-      </w:r>
-    </w:p>
-    <w:p>
-      <w:pPr>
-        <w:pStyle w:val="Heading3"/>
-      </w:pPr>
-      <w:r>
-        <w:t>schedexperiment/scheduler.c</w:t>
-      </w:r>
-    </w:p>
-    <w:p>
-      <w:r>
-        <w:t>Role and rationale. This unit creates workers and implements four selectors and metric accounting. It is kept narrowly scoped so a reviewer can connect the requirement to a small number of functions instead of searching across unrelated MINIX subsystems. Its output or state feeds a documented CSV column, console counter, or downstream correctness check.</w:t>
-      </w:r>
-    </w:p>
-    <w:p>
-      <w:r>
-        <w:t>Critical review point. The implementation must pipe/fork failure cleanup and deterministic ties. The relevant failure mode is treated as a correctness problem rather than hidden by a performance average. Error returns carry a concise diagnostic and callers stop the current experiment, preserving the raw evidence needed for debugging.</w:t>
-      </w:r>
-    </w:p>
-    <w:p>
-      <w:r>
-        <w:t>Verification evidence. The primary check is known averages and normal child exit. Review should compare configuration, console output, and CSV together, then inspect the git diff against baseline-v3.3.0. This triangulation checks both what the source intends and what the MINIX runtime actually executed.</w:t>
-      </w:r>
-    </w:p>
-    <w:p>
-      <w:pPr>
-        <w:pStyle w:val="Heading3"/>
-      </w:pPr>
-      <w:r>
-        <w:t>schedexperiment/schedexperiment.c</w:t>
-      </w:r>
-    </w:p>
-    <w:p>
-      <w:r>
-        <w:t>Role and rationale. This unit drives selected algorithms and writes per-job CSV. It is kept narrowly scoped so a reviewer can connect the requirement to a small number of functions instead of searching across unrelated MINIX subsystems. Its output or state feeds a documented CSV column, console counter, or downstream correctness check.</w:t>
-      </w:r>
-    </w:p>
-    <w:p>
-      <w:r>
-        <w:t>Critical review point. The implementation must never mix a partial failed run into output. The relevant failure mode is treated as a correctness problem rather than hidden by a performance average. Error returns carry a concise diagnostic and callers stop the current experiment, preserving the raw evidence needed for debugging.</w:t>
-      </w:r>
-    </w:p>
-    <w:p>
-      <w:r>
-        <w:t>Verification evidence. The primary check is header and row-count inspection. Review should compare configuration, console output, and CSV together, then inspect the git diff against baseline-v3.3.0. This triangulation checks both what the source intends and what the MINIX runtime actually executed.</w:t>
-      </w:r>
-    </w:p>
-    <w:p>
-      <w:pPr>
-        <w:pStyle w:val="Heading3"/>
-      </w:pPr>
-      <w:r>
-        <w:t>run_schedexperiments.sh</w:t>
-      </w:r>
-    </w:p>
-    <w:p>
-      <w:r>
-        <w:t>Role and rationale. This unit varies base quantum while preserving workload. It is kept narrowly scoped so a reviewer can connect the requirement to a small number of functions instead of searching across unrelated MINIX subsystems. Its output or state feeds a documented CSV column, console counter, or downstream correctness check.</w:t>
-      </w:r>
-    </w:p>
-    <w:p>
-      <w:r>
-        <w:t>Critical review point. The implementation must adds quantum as an explicit matrix column. The relevant failure mode is treated as a correctness problem rather than hidden by a performance average. Error returns carry a concise diagnostic and callers stop the current experiment, preserving the raw evidence needed for debugging.</w:t>
-      </w:r>
-    </w:p>
-    <w:p>
-      <w:r>
-        <w:t>Verification evidence. The primary check is four-quantum CSV audit. Review should compare configuration, console output, and CSV together, then inspect the git diff against baseline-v3.3.0. This triangulation checks both what the source intends and what the MINIX runtime actually executed.</w:t>
-      </w:r>
-    </w:p>
-    <w:p>
-      <w:pPr>
-        <w:pStyle w:val="Heading3"/>
-      </w:pPr>
-      <w:r>
-        <w:t>vmexperiment/config.c</w:t>
-      </w:r>
-    </w:p>
-    <w:p>
-      <w:r>
-        <w:t>Role and rationale. This unit parses address geometry, frames, policy, and trace definition. It is kept narrowly scoped so a reviewer can connect the requirement to a small number of functions instead of searching across unrelated MINIX subsystems. Its output or state feeds a documented CSV column, console counter, or downstream correctness check.</w:t>
-      </w:r>
-    </w:p>
-    <w:p>
-      <w:r>
-        <w:t>Critical review point. The implementation must enforce exact bit sum and power-of-two page size. The relevant failure mode is treated as a correctness problem rather than hidden by a performance average. Error returns carry a concise diagnostic and callers stop the current experiment, preserving the raw evidence needed for debugging.</w:t>
-      </w:r>
-    </w:p>
-    <w:p>
-      <w:r>
-        <w:t>Verification evidence. The primary check is valid and deliberately invalid configurations. Review should compare configuration, console output, and CSV together, then inspect the git diff against baseline-v3.3.0. This triangulation checks both what the source intends and what the MINIX runtime actually executed.</w:t>
-      </w:r>
-    </w:p>
-    <w:p>
-      <w:pPr>
-        <w:pStyle w:val="Heading3"/>
-      </w:pPr>
-      <w:r>
-        <w:t>vmexperiment/simulator.c</w:t>
-      </w:r>
-    </w:p>
-    <w:p>
-      <w:r>
-        <w:t>Role and rationale. This unit builds sparse page paths, traces, frames, FIFO, and LRU. It is kept narrowly scoped so a reviewer can connect the requirement to a small number of functions instead of searching across unrelated MINIX subsystems. Its output or state feeds a documented CSV column, console counter, or downstream correctness check.</w:t>
-      </w:r>
-    </w:p>
-    <w:p>
-      <w:r>
-        <w:t>Critical review point. The implementation must use byte addresses and deterministic stamps. The relevant failure mode is treated as a correctness problem rather than hidden by a performance average. Error returns carry a concise diagnostic and callers stop the current experiment, preserving the raw evidence needed for debugging.</w:t>
-      </w:r>
-    </w:p>
-    <w:p>
-      <w:r>
-        <w:t>Verification evidence. The primary check is known reference-string oracle. Review should compare configuration, console output, and CSV together, then inspect the git diff against baseline-v3.3.0. This triangulation checks both what the source intends and what the MINIX runtime actually executed.</w:t>
-      </w:r>
-    </w:p>
-    <w:p>
-      <w:pPr>
-        <w:pStyle w:val="Heading3"/>
-      </w:pPr>
-      <w:r>
-        <w:t>vmexperiment/vmexperiment.c</w:t>
-      </w:r>
-    </w:p>
-    <w:p>
-      <w:r>
-        <w:t>Role and rationale. This unit runs both policies and writes distinct simulated metrics. It is kept narrowly scoped so a reviewer can connect the requirement to a small number of functions instead of searching across unrelated MINIX subsystems. Its output or state feeds a documented CSV column, console counter, or downstream correctness check.</w:t>
-      </w:r>
-    </w:p>
-    <w:p>
-      <w:r>
-        <w:t>Critical review point. The implementation must do not claim simulator faults are hardware faults. The relevant failure mode is treated as a correctness problem rather than hidden by a performance average. Error returns carry a concise diagnostic and callers stop the current experiment, preserving the raw evidence needed for debugging.</w:t>
-      </w:r>
-    </w:p>
-    <w:p>
-      <w:r>
-        <w:t>Verification evidence. The primary check is native known trace plus 72-row matrix. Review should compare configuration, console output, and CSV together, then inspect the git diff against baseline-v3.3.0. This triangulation checks both what the source intends and what the MINIX runtime actually executed.</w:t>
-      </w:r>
-    </w:p>
-    <w:p>
-      <w:pPr>
-        <w:pStyle w:val="Heading3"/>
-      </w:pPr>
-      <w:r>
-        <w:t>run_vmexperiments.sh</w:t>
-      </w:r>
-    </w:p>
-    <w:p>
-      <w:r>
-        <w:t>Role and rationale. This unit generates controlled page-size and hierarchy cases. It is kept narrowly scoped so a reviewer can connect the requirement to a small number of functions instead of searching across unrelated MINIX subsystems. Its output or state feeds a documented CSV column, console counter, or downstream correctness check.</w:t>
-      </w:r>
-    </w:p>
-    <w:p>
-      <w:r>
-        <w:t>Critical review point. The implementation must hold byte workload and frames constant. The relevant failure mode is treated as a correctness problem rather than hidden by a performance average. Error returns carry a concise diagnostic and callers stop the current experiment, preserving the raw evidence needed for debugging.</w:t>
-      </w:r>
-    </w:p>
-    <w:p>
-      <w:r>
-        <w:t>Verification evidence. The primary check is matrix row and configuration review. Review should compare configuration, console output, and CSV together, then inspect the git diff against baseline-v3.3.0. This triangulation checks both what the source intends and what the MINIX runtime actually executed.</w:t>
-      </w:r>
-    </w:p>
-    <w:p>
-      <w:pPr>
-        <w:pStyle w:val="Heading3"/>
-      </w:pPr>
-      <w:r>
-        <w:t>mfs/cache.c</w:t>
-      </w:r>
-    </w:p>
-    <w:p>
-      <w:r>
-        <w:t>Role and rationale. This unit finds a free zone run and biases first-zone allocation. It is kept narrowly scoped so a reviewer can connect the requirement to a small number of functions instead of searching across unrelated MINIX subsystems. Its output or state feeds a documented CSV column, console counter, or downstream correctness check.</w:t>
-      </w:r>
-    </w:p>
-    <w:p>
-      <w:r>
-        <w:t>Critical review point. The implementation must scan read-only and retain safe fallback. The relevant failure mode is treated as a correctness problem rather than hidden by a performance average. Error returns carry a concise diagnostic and callers stop the current experiment, preserving the raw evidence needed for debugging.</w:t>
-      </w:r>
-    </w:p>
-    <w:p>
-      <w:r>
-        <w:t>Verification evidence. The primary check is mount counters plus file verification. Review should compare configuration, console output, and CSV together, then inspect the git diff against baseline-v3.3.0. This triangulation checks both what the source intends and what the MINIX runtime actually executed.</w:t>
-      </w:r>
-    </w:p>
-    <w:p>
-      <w:pPr>
-        <w:pStyle w:val="Heading3"/>
-      </w:pPr>
-      <w:r>
-        <w:t>mfs/super.c</w:t>
-      </w:r>
-    </w:p>
-    <w:p>
-      <w:r>
-        <w:t>Role and rationale. This unit honors the exact origin bit inside the first bitmap word. It is kept narrowly scoped so a reviewer can connect the requirement to a small number of functions instead of searching across unrelated MINIX subsystems. Its output or state feeds a documented CSV column, console counter, or downstream correctness check.</w:t>
-      </w:r>
-    </w:p>
-    <w:p>
-      <w:r>
-        <w:t>Critical review point. The implementation must reset offset after the first word and preserve wrap bounds. The relevant failure mode is treated as a correctness problem rather than hidden by a performance average. Error returns carry a concise diagnostic and callers stop the current experiment, preserving the raw evidence needed for debugging.</w:t>
-      </w:r>
-    </w:p>
-    <w:p>
-      <w:r>
-        <w:t>Verification evidence. The primary check is fragmented scratch-image allocation cases. Review should compare configuration, console output, and CSV together, then inspect the git diff against baseline-v3.3.0. This triangulation checks both what the source intends and what the MINIX runtime actually executed.</w:t>
-      </w:r>
-    </w:p>
-    <w:p>
-      <w:pPr>
-        <w:pStyle w:val="Heading3"/>
-      </w:pPr>
-      <w:r>
-        <w:t>mfs/main.c</w:t>
-      </w:r>
-    </w:p>
-    <w:p>
-      <w:r>
-        <w:t>Role and rationale. This unit reads bounded extent preference at service startup. It is kept narrowly scoped so a reviewer can connect the requirement to a small number of functions instead of searching across unrelated MINIX subsystems. Its output or state feeds a documented CSV column, console counter, or downstream correctness check.</w:t>
-      </w:r>
-    </w:p>
-    <w:p>
-      <w:r>
-        <w:t>Critical review point. The implementation must default one preserves compatibility. The relevant failure mode is treated as a correctness problem rather than hidden by a performance average. Error returns carry a concise diagnostic and callers stop the current experiment, preserving the raw evidence needed for debugging.</w:t>
-      </w:r>
-    </w:p>
-    <w:p>
-      <w:r>
-        <w:t>Verification evidence. The primary check is server startup log. Review should compare configuration, console output, and CSV together, then inspect the git diff against baseline-v3.3.0. This triangulation checks both what the source intends and what the MINIX runtime actually executed.</w:t>
-      </w:r>
-    </w:p>
-    <w:p>
-      <w:pPr>
-        <w:pStyle w:val="Heading3"/>
-      </w:pPr>
-      <w:r>
-        <w:t>mfs/mount.c</w:t>
-      </w:r>
-    </w:p>
-    <w:p>
-      <w:r>
-        <w:t>Role and rationale. This unit reports search, hit, and fallback counters at unmount. It is kept narrowly scoped so a reviewer can connect the requirement to a small number of functions instead of searching across unrelated MINIX subsystems. Its output or state feeds a documented CSV column, console counter, or downstream correctness check.</w:t>
-      </w:r>
-    </w:p>
-    <w:p>
-      <w:r>
-        <w:t>Critical review point. The implementation must report before resetting mounted state. The relevant failure mode is treated as a correctness problem rather than hidden by a performance average. Error returns carry a concise diagnostic and callers stop the current experiment, preserving the raw evidence needed for debugging.</w:t>
-      </w:r>
-    </w:p>
-    <w:p>
-      <w:r>
-        <w:t>Verification evidence. The primary check is captured console output. Review should compare configuration, console output, and CSV together, then inspect the git diff against baseline-v3.3.0. This triangulation checks both what the source intends and what the MINIX runtime actually executed.</w:t>
-      </w:r>
-    </w:p>
-    <w:p>
-      <w:pPr>
-        <w:pStyle w:val="Heading3"/>
-      </w:pPr>
-      <w:r>
-        <w:t>extentexperiment/config.c</w:t>
-      </w:r>
-    </w:p>
-    <w:p>
-      <w:r>
-        <w:t>Role and rationale. This unit parses sizes, repetitions, paths, and safety limits. It is kept narrowly scoped so a reviewer can connect the requirement to a small number of functions instead of searching across unrelated MINIX subsystems. Its output or state feeds a documented CSV column, console counter, or downstream correctness check.</w:t>
-      </w:r>
-    </w:p>
-    <w:p>
-      <w:r>
-        <w:t>Critical review point. The implementation must prevent overflow and excessive buffers/files. The relevant failure mode is treated as a correctness problem rather than hidden by a performance average. Error returns carry a concise diagnostic and callers stop the current experiment, preserving the raw evidence needed for debugging.</w:t>
-      </w:r>
-    </w:p>
-    <w:p>
-      <w:r>
-        <w:t>Verification evidence. The primary check is known.conf and boundary inputs. Review should compare configuration, console output, and CSV together, then inspect the git diff against baseline-v3.3.0. This triangulation checks both what the source intends and what the MINIX runtime actually executed.</w:t>
-      </w:r>
-    </w:p>
-    <w:p>
-      <w:pPr>
-        <w:pStyle w:val="Heading3"/>
-      </w:pPr>
-      <w:r>
-        <w:t>extentexperiment.c</w:t>
-      </w:r>
-    </w:p>
-    <w:p>
-      <w:r>
-        <w:t>Role and rationale. This unit performs real directory and verified file I/O. It is kept narrowly scoped so a reviewer can connect the requirement to a small number of functions instead of searching across unrelated MINIX subsystems. Its output or state feeds a documented CSV column, console counter, or downstream correctness check.</w:t>
-      </w:r>
-    </w:p>
-    <w:p>
-      <w:r>
-        <w:t>Critical review point. The implementation must clean up only owned paths on every error. The relevant failure mode is treated as a correctness problem rather than hidden by a performance average. Error returns carry a concise diagnostic and callers stop the current experiment, preserving the raw evidence needed for debugging.</w:t>
-      </w:r>
-    </w:p>
-    <w:p>
-      <w:r>
-        <w:t>Verification evidence. The primary check is two-row smoke test with zero errors. Review should compare configuration, console output, and CSV together, then inspect the git diff against baseline-v3.3.0. This triangulation checks both what the source intends and what the MINIX runtime actually executed.</w:t>
-      </w:r>
-    </w:p>
-    <w:p>
-      <w:pPr>
-        <w:pStyle w:val="Heading3"/>
-      </w:pPr>
-      <w:r>
-        <w:t>run_extent_matrix.sh</w:t>
-      </w:r>
-    </w:p>
-    <w:p>
-      <w:r>
-        <w:t>Role and rationale. This unit remounts a scratch MFS device and collects six extent sizes. It is kept narrowly scoped so a reviewer can connect the requirement to a small number of functions instead of searching across unrelated MINIX subsystems. Its output or state feeds a documented CSV column, console counter, or downstream correctness check.</w:t>
-      </w:r>
-    </w:p>
-    <w:p>
-      <w:r>
-        <w:t>Critical review point. The implementation must never target a system filesystem. The relevant failure mode is treated as a correctness problem rather than hidden by a performance average. Error returns carry a concise diagnostic and callers stop the current experiment, preserving the raw evidence needed for debugging.</w:t>
-      </w:r>
-    </w:p>
-    <w:p>
-      <w:r>
-        <w:t>Verification evidence. The primary check is 18 measured rows plus MFS counters. Review should compare configuration, console output, and CSV together, then inspect the git diff against baseline-v3.3.0. This triangulation checks both what the source intends and what the MINIX runtime actually executed.</w:t>
-      </w:r>
-    </w:p>
-    <w:p>
-      <w:pPr>
-        <w:pStyle w:val="Heading3"/>
-      </w:pPr>
-      <w:r>
-        <w:t>etc/*.conf</w:t>
-      </w:r>
-    </w:p>
-    <w:p>
-      <w:r>
-        <w:t>Role and rationale. This unit provides editable, documented defaults. It is kept narrowly scoped so a reviewer can connect the requirement to a small number of functions instead of searching across unrelated MINIX subsystems. Its output or state feeds a documented CSV column, console counter, or downstream correctness check.</w:t>
-      </w:r>
-    </w:p>
-    <w:p>
-      <w:r>
-        <w:t>Critical review point. The implementation must separate service option from benchmark option. The relevant failure mode is treated as a correctness problem rather than hidden by a performance average. Error returns carry a concise diagnostic and callers stop the current experiment, preserving the raw evidence needed for debugging.</w:t>
-      </w:r>
-    </w:p>
-    <w:p>
-      <w:r>
-        <w:t>Verification evidence. The primary check is copy, parse, and record with results. Review should compare configuration, console output, and CSV together, then inspect the git diff against baseline-v3.3.0. This triangulation checks both what the source intends and what the MINIX runtime actually executed.</w:t>
-      </w:r>
-    </w:p>
-    <w:p>
-      <w:pPr>
-        <w:pStyle w:val="Heading3"/>
-      </w:pPr>
-      <w:r>
-        <w:t>commands/Makefile</w:t>
-      </w:r>
-    </w:p>
-    <w:p>
-      <w:r>
-        <w:t>Role and rationale. This unit includes all three experiment command directories. It is kept narrowly scoped so a reviewer can connect the requirement to a small number of functions instead of searching across unrelated MINIX subsystems. Its output or state feeds a documented CSV column, console counter, or downstream correctness check.</w:t>
-      </w:r>
-    </w:p>
-    <w:p>
-      <w:r>
-        <w:t>Critical review point. The implementation must use native BSD make recursion. The relevant failure mode is treated as a correctness problem rather than hidden by a performance average. Error returns carry a concise diagnostic and callers stop the current experiment, preserving the raw evidence needed for debugging.</w:t>
-      </w:r>
-    </w:p>
-    <w:p>
-      <w:r>
-        <w:t>Verification evidence. The primary check is top-level command build. Review should compare configuration, console output, and CSV together, then inspect the git diff against baseline-v3.3.0. This triangulation checks both what the source intends and what the MINIX runtime actually executed.</w:t>
-      </w:r>
-    </w:p>
-    <w:p>
-      <w:pPr>
-        <w:pStyle w:val="Heading3"/>
-      </w:pPr>
-      <w:r>
-        <w:t>etc/Makefile</w:t>
-      </w:r>
-    </w:p>
-    <w:p>
-      <w:r>
-        <w:t>Role and rationale. This unit installs all three configuration files. It is kept narrowly scoped so a reviewer can connect the requirement to a small number of functions instead of searching across unrelated MINIX subsystems. Its output or state feeds a documented CSV column, console counter, or downstream correctness check.</w:t>
-      </w:r>
-    </w:p>
-    <w:p>
-      <w:r>
-        <w:t>Critical review point. The implementation must retain existing file list formatting. The relevant failure mode is treated as a correctness problem rather than hidden by a performance average. Error returns carry a concise diagnostic and callers stop the current experiment, preserving the raw evidence needed for debugging.</w:t>
-      </w:r>
-    </w:p>
-    <w:p>
-      <w:r>
-        <w:t>Verification evidence. The primary check is make install and /etc inspection. Review should compare configuration, console output, and CSV together, then inspect the git diff against baseline-v3.3.0. This triangulation checks both what the source intends and what the MINIX runtime actually executed.</w:t>
-      </w:r>
-    </w:p>
-    <w:p>
-      <w:pPr>
-        <w:pStyle w:val="Heading1"/>
-      </w:pPr>
-      <w:r>
-        <w:t>9. Verification checklist and interpretation guide</w:t>
-      </w:r>
-    </w:p>
-    <w:p>
-      <w:r>
-        <w:t>Check 1: Confirm the repository HEAD and the commit recorded with the results are identical. Passing this item closes a specific path from implementation error to misleading conclusion. Record the command or artifact used as evidence, the observed result, and the person or timestamp responsible. If the item fails, do not merely tick it after an undocumented change; fix the source or procedure, rerun the affected downstream steps, and preserve the corrected output. This audit trail is especially important when several team members move files between Windows, a shared folder, and the MINIX VM on submission day.</w:t>
-      </w:r>
-    </w:p>
-    <w:p>
-      <w:r>
-        <w:t>Check 2: Confirm all three binaries report usage errors for unknown command-line options. Passing this item closes a specific path from implementation error to misleading conclusion. Record the command or artifact used as evidence, the observed result, and the person or timestamp responsible. If the item fails, do not merely tick it after an undocumented change; fix the source or procedure, rerun the affected downstream steps, and preserve the corrected output. This audit trail is especially important when several team members move files between Windows, a shared folder, and the MINIX VM on submission day.</w:t>
-      </w:r>
-    </w:p>
-    <w:p>
-      <w:r>
-        <w:t>Check 3: Confirm configuration parsing rejects zero quantum, zero frames, and inconsistent hierarchy bits. Passing this item closes a specific path from implementation error to misleading conclusion. Record the command or artifact used as evidence, the observed result, and the person or timestamp responsible. If the item fails, do not merely tick it after an undocumented change; fix the source or procedure, rerun the affected downstream steps, and preserve the corrected output. This audit trail is especially important when several team members move files between Windows, a shared folder, and the MINIX VM on submission day.</w:t>
-      </w:r>
-    </w:p>
-    <w:p>
-      <w:r>
-        <w:t>Check 4: Confirm every scheduler child exits normally and no worker remains after the command finishes. Passing this item closes a specific path from implementation error to misleading conclusion. Record the command or artifact used as evidence, the observed result, and the person or timestamp responsible. If the item fails, do not merely tick it after an undocumented change; fix the source or procedure, rerun the affected downstream steps, and preserve the corrected output. This audit trail is especially important when several team members move files between Windows, a shared folder, and the MINIX VM on submission day.</w:t>
-      </w:r>
-    </w:p>
-    <w:p>
-      <w:r>
-        <w:t>Check 5: Confirm the scheduling CSV has one row per algorithm and process combination. Passing this item closes a specific path from implementation error to misleading conclusion. Record the command or artifact used as evidence, the observed result, and the person or timestamp responsible. If the item fails, do not merely tick it after an undocumented change; fix the source or procedure, rerun the affected downstream steps, and preserve the corrected output. This audit trail is especially important when several team members move files between Windows, a shared folder, and the MINIX VM on submission day.</w:t>
-      </w:r>
-    </w:p>
-    <w:p>
-      <w:r>
-        <w:t>Check 6: Recalculate one turnaround, waiting, and response row manually from arrival, start, and completion. Passing this item closes a specific path from implementation error to misleading conclusion. Record the command or artifact used as evidence, the observed result, and the person or timestamp responsible. If the item fails, do not merely tick it after an undocumented change; fix the source or procedure, rerun the affected downstream steps, and preserve the corrected output. This audit trail is especially important when several team members move files between Windows, a shared folder, and the MINIX VM on submission day.</w:t>
-      </w:r>
-    </w:p>
-    <w:p>
-      <w:r>
-        <w:t>Check 7: Confirm SJF and priority select only processes whose logical arrival is not in the future. Passing this item closes a specific path from implementation error to misleading conclusion. Record the command or artifact used as evidence, the observed result, and the person or timestamp responsible. If the item fails, do not merely tick it after an undocumented change; fix the source or procedure, rerun the affected downstream steps, and preserve the corrected output. This audit trail is especially important when several team members move files between Windows, a shared folder, and the MINIX VM on submission day.</w:t>
-      </w:r>
-    </w:p>
-    <w:p>
-      <w:r>
-        <w:t>Check 8: Confirm MLFQ demotes incomplete work and does not index beyond the third queue. Passing this item closes a specific path from implementation error to misleading conclusion. Record the command or artifact used as evidence, the observed result, and the person or timestamp responsible. If the item fails, do not merely tick it after an undocumented change; fix the source or procedure, rerun the affected downstream steps, and preserve the corrected output. This audit trail is especially important when several team members move files between Windows, a shared folder, and the MINIX VM on submission day.</w:t>
-      </w:r>
-    </w:p>
-    <w:p>
-      <w:r>
-        <w:t>Check 9: Confirm FIFO load stamps do not change on hits while LRU use stamps do. Passing this item closes a specific path from implementation error to misleading conclusion. Record the command or artifact used as evidence, the observed result, and the person or timestamp responsible. If the item fails, do not merely tick it after an undocumented change; fix the source or procedure, rerun the affected downstream steps, and preserve the corrected output. This audit trail is especially important when several team members move files between Windows, a shared folder, and the MINIX VM on submission day.</w:t>
-      </w:r>
-    </w:p>
-    <w:p>
-      <w:r>
-        <w:t>Check 10: Confirm first page fills count as faults but not replacements. Passing this item closes a specific path from implementation error to misleading conclusion. Record the command or artifact used as evidence, the observed result, and the person or timestamp responsible. If the item fails, do not merely tick it after an undocumented change; fix the source or procedure, rerun the affected downstream steps, and preserve the corrected output. This audit trail is especially important when several team members move files between Windows, a shared folder, and the MINIX VM on submission day.</w:t>
-      </w:r>
-    </w:p>
-    <w:p>
-      <w:r>
-        <w:t>Check 11: Confirm empty frames end at max(frames minus distinct resident pages, zero). Passing this item closes a specific path from implementation error to misleading conclusion. Record the command or artifact used as evidence, the observed result, and the person or timestamp responsible. If the item fails, do not merely tick it after an undocumented change; fix the source or procedure, rerun the affected downstream steps, and preserve the corrected output. This audit trail is especially important when several team members move files between Windows, a shared folder, and the MINIX VM on submission day.</w:t>
-      </w:r>
-    </w:p>
-    <w:p>
-      <w:r>
-        <w:t>Check 12: Confirm the same generated byte trace is used when comparing FIFO and LRU. Passing this item closes a specific path from implementation error to misleading conclusion. Record the command or artifact used as evidence, the observed result, and the person or timestamp responsible. If the item fails, do not merely tick it after an undocumented change; fix the source or procedure, rerun the affected downstream steps, and preserve the corrected output. This audit trail is especially important when several team members move files between Windows, a shared folder, and the MINIX VM on submission day.</w:t>
-      </w:r>
-    </w:p>
-    <w:p>
-      <w:r>
-        <w:t>Check 13: Confirm page-size cases represent the same byte working set and reference count. Passing this item closes a specific path from implementation error to misleading conclusion. Record the command or artifact used as evidence, the observed result, and the person or timestamp responsible. If the item fails, do not merely tick it after an undocumented change; fix the source or procedure, rerun the affected downstream steps, and preserve the corrected output. This audit trail is especially important when several team members move files between Windows, a shared folder, and the MINIX VM on submission day.</w:t>
-      </w:r>
-    </w:p>
-    <w:p>
-      <w:r>
-        <w:t>Check 14: Confirm hierarchy index bits plus offset bits equal address width for every case. Passing this item closes a specific path from implementation error to misleading conclusion. Record the command or artifact used as evidence, the observed result, and the person or timestamp responsible. If the item fails, do not merely tick it after an undocumented change; fix the source or procedure, rerun the affected downstream steps, and preserve the corrected output. This audit trail is especially important when several team members move files between Windows, a shared folder, and the MINIX VM on submission day.</w:t>
-      </w:r>
-    </w:p>
-    <w:p>
-      <w:r>
-        <w:t>Check 15: Confirm real MINIX page-size fields are labelled separately from simulated page size. Passing this item closes a specific path from implementation error to misleading conclusion. Record the command or artifact used as evidence, the observed result, and the person or timestamp responsible. If the item fails, do not merely tick it after an undocumented change; fix the source or procedure, rerun the affected downstream steps, and preserve the corrected output. This audit trail is especially important when several team members move files between Windows, a shared folder, and the MINIX VM on submission day.</w:t>
-      </w:r>
-    </w:p>
-    <w:p>
-      <w:r>
-        <w:t>Check 16: Confirm the extent device is a scratch device and is not the mounted root or /usr device. Passing this item closes a specific path from implementation error to misleading conclusion. Record the command or artifact used as evidence, the observed result, and the person or timestamp responsible. If the item fails, do not merely tick it after an undocumented change; fix the source or procedure, rerun the affected downstream steps, and preserve the corrected output. This audit trail is especially important when several team members move files between Windows, a shared folder, and the MINIX VM on submission day.</w:t>
-      </w:r>
-    </w:p>
-    <w:p>
-      <w:r>
-        <w:t>Check 17: Confirm the installed MFS binary was rebuilt from the submitted source before mounting. Passing this item closes a specific path from implementation error to misleading conclusion. Record the command or artifact used as evidence, the observed result, and the person or timestamp responsible. If the item fails, do not merely tick it after an undocumented change; fix the source or procedure, rerun the affected downstream steps, and preserve the corrected output. This audit trail is especially important when several team members move files between Windows, a shared folder, and the MINIX VM on submission day.</w:t>
-      </w:r>
-    </w:p>
-    <w:p>
-      <w:r>
-        <w:t>Check 18: Confirm mfs_extent_size in the mount command equals extent_blocks for each controlled case. Passing this item closes a specific path from implementation error to misleading conclusion. Record the command or artifact used as evidence, the observed result, and the person or timestamp responsible. If the item fails, do not merely tick it after an undocumented change; fix the source or procedure, rerun the affected downstream steps, and preserve the corrected output. This audit trail is especially important when several team members move files between Windows, a shared folder, and the MINIX VM on submission day.</w:t>
-      </w:r>
-    </w:p>
-    <w:p>
-      <w:r>
-        <w:t>Check 19: Confirm the benchmark directory resolves underneath the scratch mount point. Passing this item closes a specific path from implementation error to misleading conclusion. Record the command or artifact used as evidence, the observed result, and the person or timestamp responsible. If the item fails, do not merely tick it after an undocumented change; fix the source or procedure, rerun the affected downstream steps, and preserve the corrected output. This audit trail is especially important when several team members move files between Windows, a shared folder, and the MINIX VM on submission day.</w:t>
-      </w:r>
-    </w:p>
-    <w:p>
-      <w:r>
-        <w:t>Check 20: Confirm the MFS startup log prints the requested allocation preference. Passing this item closes a specific path from implementation error to misleading conclusion. Record the command or artifact used as evidence, the observed result, and the person or timestamp responsible. If the item fails, do not merely tick it after an undocumented change; fix the source or procedure, rerun the affected downstream steps, and preserve the corrected output. This audit trail is especially important when several team members move files between Windows, a shared folder, and the MINIX VM on submission day.</w:t>
-      </w:r>
-    </w:p>
-    <w:p>
-      <w:r>
-        <w:t>Check 21: Confirm unmount prints extent searches, hits, and fallbacks for the completed run. Passing this item closes a specific path from implementation error to misleading conclusion. Record the command or artifact used as evidence, the observed result, and the person or timestamp responsible. If the item fails, do not merely tick it after an undocumented change; fix the source or procedure, rerun the affected downstream steps, and preserve the corrected output. This audit trail is especially important when several team members move files between Windows, a shared folder, and the MINIX VM on submission day.</w:t>
-      </w:r>
-    </w:p>
-    <w:p>
-      <w:r>
-        <w:t>Check 22: Confirm verify_errors is zero in every accepted extent row. Passing this item closes a specific path from implementation error to misleading conclusion. Record the command or artifact used as evidence, the observed result, and the person or timestamp responsible. If the item fails, do not merely tick it after an undocumented change; fix the source or procedure, rerun the affected downstream steps, and preserve the corrected output. This audit trail is especially important when several team members move files between Windows, a shared folder, and the MINIX VM on submission day.</w:t>
-      </w:r>
-    </w:p>
-    <w:p>
-      <w:r>
-        <w:t>Check 23: Confirm repeated extent trials retain the same total byte count and block size. Passing this item closes a specific path from implementation error to misleading conclusion. Record the command or artifact used as evidence, the observed result, and the person or timestamp responsible. If the item fails, do not merely tick it after an undocumented change; fix the source or procedure, rerun the affected downstream steps, and preserve the corrected output. This audit trail is especially important when several team members move files between Windows, a shared folder, and the MINIX VM on submission day.</w:t>
-      </w:r>
-    </w:p>
-    <w:p>
-      <w:r>
-        <w:t>Check 24: Confirm raw CSV files are preserved before graphs or summary calculations are created. Passing this item closes a specific path from implementation error to misleading conclusion. Record the command or artifact used as evidence, the observed result, and the person or timestamp responsible. If the item fails, do not merely tick it after an undocumented change; fix the source or procedure, rerun the affected downstream steps, and preserve the corrected output. This audit trail is especially important when several team members move files between Windows, a shared folder, and the MINIX VM on submission day.</w:t>
-      </w:r>
-    </w:p>
-    <w:p>
-      <w:r>
-        <w:t>Check 25: Confirm expected/oracle tables are not relabelled as measured MINIX results. Passing this item closes a specific path from implementation error to misleading conclusion. Record the command or artifact used as evidence, the observed result, and the person or timestamp responsible. If the item fails, do not merely tick it after an undocumented change; fix the source or procedure, rerun the affected downstream steps, and preserve the corrected output. This audit trail is especially important when several team members move files between Windows, a shared folder, and the MINIX VM on submission day.</w:t>
-      </w:r>
-    </w:p>
-    <w:p>
-      <w:r>
-        <w:t>Check 26: Confirm graphs include units, policy names, controlled settings, and an explanatory caption. Passing this item closes a specific path from implementation error to misleading conclusion. Record the command or artifact used as evidence, the observed result, and the person or timestamp responsible. If the item fails, do not merely tick it after an undocumented change; fix the source or procedure, rerun the affected downstream steps, and preserve the corrected output. This audit trail is especially important when several team members move files between Windows, a shared folder, and the MINIX VM on submission day.</w:t>
-      </w:r>
-    </w:p>
-    <w:p>
-      <w:r>
-        <w:t>Check 27: Confirm failures and outliers remain visible or are excluded only with a recorded reason. Passing this item closes a specific path from implementation error to misleading conclusion. Record the command or artifact used as evidence, the observed result, and the person or timestamp responsible. If the item fails, do not merely tick it after an undocumented change; fix the source or procedure, rerun the affected downstream steps, and preserve the corrected output. This audit trail is especially important when several team members move files between Windows, a shared folder, and the MINIX VM on submission day.</w:t>
-      </w:r>
-    </w:p>
-    <w:p>
-      <w:r>
-        <w:t>Check 28: Confirm the final archive opens and contains README, source, configs, tests, and scripts. Passing this item closes a specific path from implementation error to misleading conclusion. Record the command or artifact used as evidence, the observed result, and the person or timestamp responsible. If the item fails, do not merely tick it after an undocumented change; fix the source or procedure, rerun the affected downstream steps, and preserve the corrected output. This audit trail is especially important when several team members move files between Windows, a shared folder, and the MINIX VM on submission day.</w:t>
-      </w:r>
-    </w:p>
-    <w:p>
-      <w:r>
-        <w:t>Check 29: Confirm the GitHub repository is private until the instructor's publication policy is known. Passing this item closes a specific path from implementation error to misleading conclusion. Record the command or artifact used as evidence, the observed result, and the person or timestamp responsible. If the item fails, do not merely tick it after an undocumented change; fix the source or procedure, rerun the affected downstream steps, and preserve the corrected output. This audit trail is especially important when several team members move files between Windows, a shared folder, and the MINIX VM on submission day.</w:t>
-      </w:r>
-    </w:p>
-    <w:p>
-      <w:r>
-        <w:t>Check 30: Confirm the submitted report, deck, source archive, and repository commit all agree. Passing this item closes a specific path from implementation error to misleading conclusion. Record the command or artifact used as evidence, the observed result, and the person or timestamp responsible. If the item fails, do not merely tick it after an undocumented change; fix the source or procedure, rerun the affected downstream steps, and preserve the corrected output. This audit trail is especially important when several team members move files between Windows, a shared folder, and the MINIX VM on submission day.</w:t>
-      </w:r>
-    </w:p>
-    <w:p>
-      <w:pPr>
-        <w:pStyle w:val="Heading1"/>
-      </w:pPr>
-      <w:r>
-        <w:t>10. Conclusions</w:t>
-      </w:r>
-    </w:p>
-    <w:p>
-      <w:r>
-        <w:t>The project delivers one coherent experimental framework across three operating-system topics. The scheduling command demonstrates how service order changes individual and average latency even when total CPU demand is fixed. The paging command demonstrates how locality, page geometry, frame capacity, hierarchy overhead, and replacement policy interact. The MFS modification demonstrates how a small change at the bitmap allocation boundary can influence physical placement while preserving file-system format and correctness.</w:t>
-      </w:r>
-    </w:p>
-    <w:p>
-      <w:r>
-        <w:t>The strongest engineering choice is explicit separation of model, mechanism, and evidence. Real children execute scheduler work, but logical policy time remains reproducible. Configurable page tables are real software data structures, but the report does not misidentify them as x86 hardware mappings. Extent selection changes actual MFS placement, but it does not pretend to introduce a persistent extent tree. These boundaries make the work explainable, testable, and safer to demonstrate.</w:t>
-      </w:r>
-    </w:p>
-    <w:p>
-      <w:r>
-        <w:t>Final native acceptance is complete. MINIX 3.3.0 built all three commands and the modified MFS server, all smoke tests passed, the repository contains all three raw matrices, every extent verification count is zero, and the captured MFS counters show preferred-run hits without fallbacks for sizes 2 through 32. These artifacts convert the source-complete project into a measured, reproducible submission.</w:t>
-      </w:r>
-    </w:p>
-    <w:p>
-      <w:pPr>
-        <w:pStyle w:val="Heading1"/>
-      </w:pPr>
-      <w:r>
-        <w:t>References</w:t>
-      </w:r>
-    </w:p>
-    <w:p>
-      <w:pPr>
-        <w:pStyle w:val="ListNumber"/>
-      </w:pPr>
-      <w:r>
-        <w:t>A. S. Tanenbaum and H. Bos, Modern Operating Systems, 4th ed. Pearson, 2015.</w:t>
-      </w:r>
-    </w:p>
-    <w:p>
-      <w:pPr>
-        <w:pStyle w:val="ListNumber"/>
-      </w:pPr>
-      <w:r>
-        <w:t>A. S. Tanenbaum and A. S. Woodhull, Operating Systems: Design and Implementation, 3rd ed. Pearson, 2006.</w:t>
-      </w:r>
-    </w:p>
-    <w:p>
-      <w:pPr>
-        <w:pStyle w:val="ListNumber"/>
-      </w:pPr>
-      <w:r>
-        <w:t>L. A. Belady, “A Study of Replacement Algorithms for a Virtual-Storage Computer,” IBM Systems Journal, vol. 5, no. 2, 1966.</w:t>
-      </w:r>
-    </w:p>
-    <w:p>
-      <w:pPr>
-        <w:pStyle w:val="ListNumber"/>
-      </w:pPr>
-      <w:r>
-        <w:t>P. J. Denning, “The Working Set Model for Program Behavior,” Communications of the ACM, vol. 11, no. 5, 1968.</w:t>
-      </w:r>
-    </w:p>
-    <w:p>
-      <w:pPr>
-        <w:pStyle w:val="ListNumber"/>
-      </w:pPr>
-      <w:r>
-        <w:t>F. J. Corbató, M. M. Daggett, and R. C. Daley, “An Experimental Time-Sharing System,” AFIPS Spring Joint Computer Conference, 1962.</w:t>
-      </w:r>
-    </w:p>
-    <w:p>
-      <w:pPr>
-        <w:pStyle w:val="ListNumber"/>
-      </w:pPr>
-      <w:r>
-        <w:t>The MINIX 3 Project, “MINIX 3,” official project website, https://www.minix3.org/ (accessed August 18, 2026).</w:t>
-      </w:r>
-    </w:p>
-    <w:p>
-      <w:pPr>
-        <w:pStyle w:val="ListNumber"/>
-      </w:pPr>
-      <w:r>
-        <w:t>MINIX 3.3.0 source tree, local baseline tag baseline-v3.3.0, especially minix/fs/mfs, minix/servers/vm, minix/servers/sched, and system manual pages.</w:t>
-      </w:r>
-    </w:p>
-    <w:p>
-      <w:pPr>
-        <w:pStyle w:val="ListNumber"/>
-      </w:pPr>
-      <w:r>
-        <w:t>CSE335 Project Summer 2026 specification supplied by the course staff.</w:t>
-      </w:r>
-    </w:p>
-    <w:p>
-      <w:pPr>
-        <w:pStyle w:val="Heading1"/>
-      </w:pPr>
-      <w:r>
-        <w:t>Appendix A — Result capture sheets</w:t>
+        <w:t>Limitations are explicit: scheduler dispatches are experiment events rather than kernel context-switch counters; paging faults are simulated rather than hardware telemetry; and coarse MINIX timing weakens very short throughput measurements. These do not invalidate deterministic correctness or configuration-controlled comparisons.</w:t>
       </w:r>
     </w:p>
     <w:p>
@@ -3260,45 +2760,38 @@
         <w:pStyle w:val="Heading2"/>
       </w:pPr>
       <w:r>
-        <w:t>Scheduling evidence record</w:t>
-      </w:r>
-    </w:p>
-    <w:p>
-      <w:r>
-        <w:t>Record the following fields with the raw artifact: commit; VM version; compiler result; config hash; policy; quantum; average turnaround; average waiting; average response; dispatches; wall time. Store the unedited CSV and console log before calculating any average. State whether the row is measured in MINIX, generated by an independent oracle, or expected from hand calculation. Include enough configuration detail that a reviewer can reproduce the row without guessing a default.</w:t>
+        <w:t>Submission evidence</w:t>
       </w:r>
     </w:p>
     <w:p>
       <w:pPr>
-        <w:pStyle w:val="Heading2"/>
+        <w:pStyle w:val="ListBullet"/>
       </w:pPr>
       <w:r>
-        <w:t>Paging evidence record</w:t>
-      </w:r>
-    </w:p>
-    <w:p>
-      <w:r>
-        <w:t>Record the following fields with the raw artifact: commit; config hash; trace seed; byte workload; page size; levels and bits; frames; policy; faults; replacements; empty frames; hierarchy bytes; real page size. Store the unedited CSV and console log before calculating any average. State whether the row is measured in MINIX, generated by an independent oracle, or expected from hand calculation. Include enough configuration detail that a reviewer can reproduce the row without guessing a default.</w:t>
+        <w:t>Raw results: project-deliverables/native-results/*.csv and native-validation.txt</w:t>
       </w:r>
     </w:p>
     <w:p>
       <w:pPr>
-        <w:pStyle w:val="Heading2"/>
+        <w:pStyle w:val="ListBullet"/>
       </w:pPr>
       <w:r>
-        <w:t>MFS extents evidence record</w:t>
+        <w:t>Source comparison: git diff baseline-v3.3.0..HEAD</w:t>
       </w:r>
     </w:p>
     <w:p>
+      <w:pPr>
+        <w:pStyle w:val="ListBullet"/>
+      </w:pPr>
       <w:r>
-        <w:t>Record the following fields with the raw artifact: commit; scratch device; file-system reset method; mount option; benchmark config; repetition; hit/fallback counters; create/write/read/remove time; throughput; verification errors. Store the unedited CSV and console log before calculating any average. State whether the row is measured in MINIX, generated by an independent oracle, or expected from hand calculation. Include enough configuration detail that a reviewer can reproduce the row without guessing a default.</w:t>
+        <w:t>Report builder: tools/create_cse335_report.py</w:t>
       </w:r>
     </w:p>
     <w:sectPr>
       <w:headerReference w:type="default" r:id="rId9"/>
       <w:footerReference w:type="default" r:id="rId10"/>
       <w:pgSz w:w="12240" w:h="15840"/>
-      <w:pgMar w:top="1440" w:right="1440" w:bottom="1440" w:left="1440" w:header="708" w:footer="708" w:gutter="0"/>
+      <w:pgMar w:top="1037" w:right="1181" w:bottom="1037" w:left="1181" w:header="504" w:footer="504" w:gutter="0"/>
       <w:cols w:space="720"/>
       <w:docGrid w:linePitch="360"/>
     </w:sectPr>
@@ -3330,7 +2823,7 @@
     <w:r>
       <w:rPr>
         <w:color w:val="5F6368"/>
-        <w:sz w:val="18"/>
+        <w:sz w:val="17"/>
       </w:rPr>
       <w:t>CSE335 Operating Systems Project  |  MINIX 3.3.0</w:t>
     </w:r>
@@ -3702,12 +3195,12 @@
     <w:qFormat/>
     <w:rsid w:val="00FC693F"/>
     <w:pPr>
-      <w:spacing w:before="0" w:after="160" w:line="320" w:lineRule="auto"/>
+      <w:spacing w:after="120" w:line="269" w:lineRule="auto"/>
       <w:jc w:val="both"/>
     </w:pPr>
     <w:rPr>
       <w:rFonts w:ascii="Calibri" w:hAnsi="Calibri"/>
-      <w:sz w:val="22"/>
+      <w:sz w:val="20"/>
     </w:rPr>
   </w:style>
   <w:style w:type="paragraph" w:styleId="Header">
@@ -3765,7 +3258,7 @@
     <w:pPr>
       <w:keepNext/>
       <w:keepLines/>
-      <w:spacing w:before="360" w:after="200"/>
+      <w:spacing w:before="300" w:after="140"/>
       <w:outlineLvl w:val="0"/>
     </w:pPr>
     <w:rPr>
@@ -3789,7 +3282,7 @@
     <w:pPr>
       <w:keepNext/>
       <w:keepLines/>
-      <w:spacing w:before="240" w:after="120"/>
+      <w:spacing w:before="200" w:after="100"/>
       <w:outlineLvl w:val="1"/>
     </w:pPr>
     <w:rPr>
@@ -3797,7 +3290,7 @@
       <w:b/>
       <w:bCs/>
       <w:color w:val="2E74B5"/>
-      <w:sz w:val="26"/>
+      <w:sz w:val="25"/>
       <w:szCs w:val="26"/>
     </w:rPr>
   </w:style>
@@ -3813,7 +3306,7 @@
     <w:pPr>
       <w:keepNext/>
       <w:keepLines/>
-      <w:spacing w:before="160" w:after="80"/>
+      <w:spacing w:before="140" w:after="60"/>
       <w:outlineLvl w:val="2"/>
     </w:pPr>
     <w:rPr>
@@ -3821,7 +3314,7 @@
       <w:b/>
       <w:bCs/>
       <w:color w:val="1F4D78"/>
-      <w:sz w:val="24"/>
+      <w:sz w:val="22"/>
     </w:rPr>
   </w:style>
   <w:style w:type="paragraph" w:styleId="Heading4">

</xml_diff>

<commit_message>
docs: finalize report source and generator
</commit_message>
<xml_diff>
--- a/project-deliverables/CSE335_MINIX_Project_Report.docx
+++ b/project-deliverables/CSE335_MINIX_Project_Report.docx
@@ -263,19 +263,6 @@
         </w:tc>
       </w:tr>
     </w:tbl>
-    <w:p>
-      <w:pPr>
-        <w:spacing w:before="140" w:after="0"/>
-        <w:jc w:val="center"/>
-      </w:pPr>
-      <w:r>
-        <w:rPr>
-          <w:i/>
-          <w:sz w:val="18"/>
-        </w:rPr>
-        <w:t>Validated on MINIX 3.3.0 • Oracle VirtualBox</w:t>
-      </w:r>
-    </w:p>
     <w:p>
       <w:r>
         <w:br w:type="page"/>
@@ -2799,14 +2786,6 @@
       </w:pPr>
       <w:r>
         <w:t>Source comparison: git diff baseline-v3.3.0..HEAD</w:t>
-      </w:r>
-    </w:p>
-    <w:p>
-      <w:pPr>
-        <w:pStyle w:val="ListBullet"/>
-      </w:pPr>
-      <w:r>
-        <w:t>Report builder: tools/create_cse335_report.py</w:t>
       </w:r>
     </w:p>
     <w:p>

</xml_diff>

<commit_message>
docs: prepare university submission artifacts
</commit_message>
<xml_diff>
--- a/project-deliverables/CSE335_MINIX_Project_Report.docx
+++ b/project-deliverables/CSE335_MINIX_Project_Report.docx
@@ -273,6 +273,9 @@
         <w:pStyle w:val="Heading1"/>
       </w:pPr>
       <w:r>
+        <w:rPr>
+          <w:rFonts w:ascii="Arial" w:hAnsi="Arial" w:eastAsia="Arial" w:cs="Arial"/>
+        </w:rPr>
         <w:t>1. Project summary</w:t>
       </w:r>
     </w:p>
@@ -479,6 +482,9 @@
         <w:pStyle w:val="Heading2"/>
       </w:pPr>
       <w:r>
+        <w:rPr>
+          <w:rFonts w:ascii="Arial" w:hAnsi="Arial" w:eastAsia="Arial" w:cs="Arial"/>
+        </w:rPr>
         <w:t>Scope and interpretation</w:t>
       </w:r>
     </w:p>
@@ -492,6 +498,9 @@
         <w:pStyle w:val="Heading1"/>
       </w:pPr>
       <w:r>
+        <w:rPr>
+          <w:rFonts w:ascii="Arial" w:hAnsi="Arial" w:eastAsia="Arial" w:cs="Arial"/>
+        </w:rPr>
         <w:t>2. How the project was completed</w:t>
       </w:r>
     </w:p>
@@ -765,7 +774,10 @@
         <w:pStyle w:val="Heading1"/>
       </w:pPr>
       <w:r>
-        <w:t>3. Requirement 1 — scheduling</w:t>
+        <w:rPr>
+          <w:rFonts w:ascii="Arial" w:hAnsi="Arial" w:eastAsia="Arial" w:cs="Arial"/>
+        </w:rPr>
+        <w:t>3. Requirement 1 - scheduling</w:t>
       </w:r>
     </w:p>
     <w:p>
@@ -773,6 +785,9 @@
         <w:pStyle w:val="Heading2"/>
       </w:pPr>
       <w:r>
+        <w:rPr>
+          <w:rFonts w:ascii="Arial" w:hAnsi="Arial" w:eastAsia="Arial" w:cs="Arial"/>
+        </w:rPr>
         <w:t>Implementation</w:t>
       </w:r>
     </w:p>
@@ -826,6 +841,9 @@
         <w:pStyle w:val="Heading2"/>
       </w:pPr>
       <w:r>
+        <w:rPr>
+          <w:rFonts w:ascii="Arial" w:hAnsi="Arial" w:eastAsia="Arial" w:cs="Arial"/>
+        </w:rPr>
         <w:t>Native result</w:t>
       </w:r>
     </w:p>
@@ -1297,7 +1315,10 @@
         <w:pStyle w:val="Heading1"/>
       </w:pPr>
       <w:r>
-        <w:t>4. Requirement 2 — hierarchical paging</w:t>
+        <w:rPr>
+          <w:rFonts w:ascii="Arial" w:hAnsi="Arial" w:eastAsia="Arial" w:cs="Arial"/>
+        </w:rPr>
+        <w:t>4. Requirement 2 - hierarchical paging</w:t>
       </w:r>
     </w:p>
     <w:p>
@@ -1305,6 +1326,9 @@
         <w:pStyle w:val="Heading2"/>
       </w:pPr>
       <w:r>
+        <w:rPr>
+          <w:rFonts w:ascii="Arial" w:hAnsi="Arial" w:eastAsia="Arial" w:cs="Arial"/>
+        </w:rPr>
         <w:t>Implementation</w:t>
       </w:r>
     </w:p>
@@ -1363,6 +1387,9 @@
         <w:pStyle w:val="Heading2"/>
       </w:pPr>
       <w:r>
+        <w:rPr>
+          <w:rFonts w:ascii="Arial" w:hAnsi="Arial" w:eastAsia="Arial" w:cs="Arial"/>
+        </w:rPr>
         <w:t>Native result</w:t>
       </w:r>
     </w:p>
@@ -1690,7 +1717,10 @@
         <w:pStyle w:val="Heading1"/>
       </w:pPr>
       <w:r>
-        <w:t>5. Requirement 3 — extent-aware MFS</w:t>
+        <w:rPr>
+          <w:rFonts w:ascii="Arial" w:hAnsi="Arial" w:eastAsia="Arial" w:cs="Arial"/>
+        </w:rPr>
+        <w:t>5. Requirement 3 - extent-aware MFS</w:t>
       </w:r>
     </w:p>
     <w:p>
@@ -1698,6 +1728,9 @@
         <w:pStyle w:val="Heading2"/>
       </w:pPr>
       <w:r>
+        <w:rPr>
+          <w:rFonts w:ascii="Arial" w:hAnsi="Arial" w:eastAsia="Arial" w:cs="Arial"/>
+        </w:rPr>
         <w:t>Implementation</w:t>
       </w:r>
     </w:p>
@@ -1751,6 +1784,9 @@
         <w:pStyle w:val="Heading2"/>
       </w:pPr>
       <w:r>
+        <w:rPr>
+          <w:rFonts w:ascii="Arial" w:hAnsi="Arial" w:eastAsia="Arial" w:cs="Arial"/>
+        </w:rPr>
         <w:t>Native result</w:t>
       </w:r>
     </w:p>
@@ -2194,6 +2230,9 @@
         <w:pStyle w:val="Heading1"/>
       </w:pPr>
       <w:r>
+        <w:rPr>
+          <w:rFonts w:ascii="Arial" w:hAnsi="Arial" w:eastAsia="Arial" w:cs="Arial"/>
+        </w:rPr>
         <w:t>6. Native MINIX build and test evidence</w:t>
       </w:r>
     </w:p>
@@ -2202,6 +2241,9 @@
         <w:pStyle w:val="Heading2"/>
       </w:pPr>
       <w:r>
+        <w:rPr>
+          <w:rFonts w:ascii="Arial" w:hAnsi="Arial" w:eastAsia="Arial" w:cs="Arial"/>
+        </w:rPr>
         <w:t>Commands executed in the VM</w:t>
       </w:r>
     </w:p>
@@ -2414,6 +2456,9 @@
         <w:pStyle w:val="Heading2"/>
       </w:pPr>
       <w:r>
+        <w:rPr>
+          <w:rFonts w:ascii="Arial" w:hAnsi="Arial" w:eastAsia="Arial" w:cs="Arial"/>
+        </w:rPr>
         <w:t>MFS extent console output</w:t>
       </w:r>
     </w:p>
@@ -2462,6 +2507,9 @@
         <w:pStyle w:val="Heading1"/>
       </w:pPr>
       <w:r>
+        <w:rPr>
+          <w:rFonts w:ascii="Arial" w:hAnsi="Arial" w:eastAsia="Arial" w:cs="Arial"/>
+        </w:rPr>
         <w:t>7. Changed files</w:t>
       </w:r>
     </w:p>
@@ -2751,6 +2799,9 @@
         <w:pStyle w:val="Heading1"/>
       </w:pPr>
       <w:r>
+        <w:rPr>
+          <w:rFonts w:ascii="Arial" w:hAnsi="Arial" w:eastAsia="Arial" w:cs="Arial"/>
+        </w:rPr>
         <w:t>8. Conclusion</w:t>
       </w:r>
     </w:p>
@@ -2769,6 +2820,9 @@
         <w:pStyle w:val="Heading2"/>
       </w:pPr>
       <w:r>
+        <w:rPr>
+          <w:rFonts w:ascii="Arial" w:hAnsi="Arial" w:eastAsia="Arial" w:cs="Arial"/>
+        </w:rPr>
         <w:t>Submission evidence</w:t>
       </w:r>
     </w:p>
@@ -2798,6 +2852,9 @@
         <w:pStyle w:val="Heading1"/>
       </w:pPr>
       <w:r>
+        <w:rPr>
+          <w:rFonts w:ascii="Arial" w:hAnsi="Arial" w:eastAsia="Arial" w:cs="Arial"/>
+        </w:rPr>
         <w:t>9. Research basis and MINIX internal structure</w:t>
       </w:r>
     </w:p>
@@ -2823,10 +2880,42 @@
     </w:p>
     <w:p>
       <w:pPr>
+        <w:pStyle w:val="Heading2"/>
+      </w:pPr>
+      <w:r>
+        <w:rPr>
+          <w:rFonts w:ascii="Arial" w:hAnsi="Arial" w:eastAsia="Arial" w:cs="Arial"/>
+        </w:rPr>
+        <w:t>Experimental validity and interpretation</w:t>
+      </w:r>
+    </w:p>
+    <w:p>
+      <w:pPr/>
+      <w:r>
+        <w:t>The scheduling comparison holds arrival time, demanded service, priority, worker computation, and output definitions constant while changing only the selection policy. Logical time prevents host or VM load from changing the turnaround and waiting calculations, while measured wall time confirms that the child processes performed real work. The 80-row matrix covers four policies, four configured quanta, and five processes. Its most important internal checks are that completion never precedes arrival, waiting equals turnaround minus burst, and every policy completes the same total demanded service. These controls support comparisons within the selected workload; they do not establish that one policy is best for every workload or that the experiment's dispatch count equals a kernel context-switch counter.</w:t>
+      </w:r>
+    </w:p>
+    <w:p>
+      <w:pPr/>
+      <w:r>
+        <w:t>The paging matrix changes page size, hierarchy geometry, frame count, and replacement policy through explicit configuration. A fixed trace seed gives FIFO and LRU the same address sequence, so differences are attributable to replacement decisions rather than random input. Each row is checked against the identities references = hits + faults and replacements &lt;= faults. The parser also rejects a geometry unless the level-index widths plus the page offset equal the configured address width. Consequently, hierarchy memory cost and replacement behavior can be compared without confusing them. The reported faults remain model events generated by the native experiment, not hardware faults raised by the processor for an arbitrary MINIX process.</w:t>
+      </w:r>
+    </w:p>
+    <w:p>
+      <w:pPr/>
+      <w:r>
+        <w:t>The extent experiment separates correctness from timing. A disposable 64 MiB MFS image provides a controlled free-space target, and the mount option and benchmark configuration use the same requested extent size for each case. Every iteration writes a deterministic pattern, flushes it, reads the complete file, compares every byte, removes the file, and records allocator counters. Across 18 rows, verification errors and allocation fallbacks were zero for the tested image state. This establishes correct I/O and successful preferred-run selection for those cases. It does not establish an atomic persistent extent format, because normal MFS zone references and bitmap updates remain in use. Several operations also rounded to zero microseconds under the MINIX timer, so allocator hits and byte verification provide stronger evidence than small throughput differences. Larger files, repeated fresh images, and median timing would be appropriate extensions for a stronger performance study.</w:t>
+      </w:r>
+    </w:p>
+    <w:p>
+      <w:pPr>
         <w:pStyle w:val="Heading1"/>
       </w:pPr>
       <w:r>
-        <w:t>10. Detailed Requirement 1 implementation and discussion manual</w:t>
+        <w:rPr>
+          <w:rFonts w:ascii="Arial" w:hAnsi="Arial" w:eastAsia="Arial" w:cs="Arial"/>
+        </w:rPr>
+        <w:t>10. Detailed Requirement 1 implementation and analysis</w:t>
       </w:r>
     </w:p>
     <w:p>
@@ -2834,7 +2923,10 @@
         <w:pStyle w:val="Heading2"/>
       </w:pPr>
       <w:r>
-        <w:t>Requirement 1 — CPU scheduling discussion guide</w:t>
+        <w:rPr>
+          <w:rFonts w:ascii="Arial" w:hAnsi="Arial" w:eastAsia="Arial" w:cs="Arial"/>
+        </w:rPr>
+        <w:t>Requirement 1 - CPU scheduling</w:t>
       </w:r>
     </w:p>
     <w:p>
@@ -2842,6 +2934,9 @@
         <w:pStyle w:val="Heading3"/>
       </w:pPr>
       <w:r>
+        <w:rPr>
+          <w:rFonts w:ascii="Arial" w:hAnsi="Arial" w:eastAsia="Arial" w:cs="Arial"/>
+        </w:rPr>
         <w:t>What the specification asks for</w:t>
       </w:r>
     </w:p>
@@ -2855,6 +2950,9 @@
         <w:pStyle w:val="Heading3"/>
       </w:pPr>
       <w:r>
+        <w:rPr>
+          <w:rFonts w:ascii="Arial" w:hAnsi="Arial" w:eastAsia="Arial" w:cs="Arial"/>
+        </w:rPr>
         <w:t>What changed from stock MINIX</w:t>
       </w:r>
     </w:p>
@@ -2868,6 +2966,9 @@
         <w:pStyle w:val="Heading3"/>
       </w:pPr>
       <w:r>
+        <w:rPr>
+          <w:rFonts w:ascii="Arial" w:hAnsi="Arial" w:eastAsia="Arial" w:cs="Arial"/>
+        </w:rPr>
         <w:t>End-to-end execution flow</w:t>
       </w:r>
     </w:p>
@@ -3145,9 +3246,13 @@
     <w:p>
       <w:pPr>
         <w:pStyle w:val="Heading3"/>
-      </w:pPr>
-      <w:r>
-        <w:t>30-second explanation</w:t>
+        <w:spacing w:before="200" w:after="80"/>
+      </w:pPr>
+      <w:r>
+        <w:rPr>
+          <w:rFonts w:ascii="Arial" w:hAnsi="Arial" w:eastAsia="Arial" w:cs="Arial"/>
+        </w:rPr>
+        <w:t>Implementation summary</w:t>
       </w:r>
     </w:p>
     <w:p>
@@ -3160,6 +3265,9 @@
         <w:pStyle w:val="Heading3"/>
       </w:pPr>
       <w:r>
+        <w:rPr>
+          <w:rFonts w:ascii="Arial" w:hAnsi="Arial" w:eastAsia="Arial" w:cs="Arial"/>
+        </w:rPr>
         <w:t>Architecture and code map</w:t>
       </w:r>
     </w:p>
@@ -3446,12 +3554,15 @@
         <w:pStyle w:val="Heading3"/>
       </w:pPr>
       <w:r>
-        <w:t>Exact code to study</w:t>
-      </w:r>
-    </w:p>
-    <w:p>
-      <w:r>
-        <w:t>These are the source blocks most likely to be opened during the discussion. Line numbers refer to the submitted commit.</w:t>
+        <w:rPr>
+          <w:rFonts w:ascii="Arial" w:hAnsi="Arial" w:eastAsia="Arial" w:cs="Arial"/>
+        </w:rPr>
+        <w:t>Key implementation excerpts</w:t>
+      </w:r>
+    </w:p>
+    <w:p>
+      <w:r>
+        <w:t>The following source excerpts identify the central implementation points. Line numbers refer to the submitted commit.</w:t>
       </w:r>
     </w:p>
     <w:p>
@@ -3459,6 +3570,9 @@
         <w:pStyle w:val="Heading3"/>
       </w:pPr>
       <w:r>
+        <w:rPr>
+          <w:rFonts w:ascii="Arial" w:hAnsi="Arial" w:eastAsia="Arial" w:cs="Arial"/>
+        </w:rPr>
         <w:t>1. Real process creation — scheduler.c:134-182</w:t>
       </w:r>
     </w:p>
@@ -4239,7 +4353,7 @@
     </w:p>
     <w:p>
       <w:r>
-        <w:t>Likely question: Why close unused pipe ends? To avoid descriptor leaks and, more importantly, to ensure EOF and blocking behavior work correctly; an extra open writer could prevent a reader from ever seeing EOF.</w:t>
+        <w:t>Closing unused pipe ends prevents descriptor leaks and ensures correct EOF and blocking behavior. An extra open writer could prevent a reader from ever observing EOF.</w:t>
       </w:r>
     </w:p>
     <w:p>
@@ -4247,6 +4361,9 @@
         <w:pStyle w:val="Heading3"/>
       </w:pPr>
       <w:r>
+        <w:rPr>
+          <w:rFonts w:ascii="Arial" w:hAnsi="Arial" w:eastAsia="Arial" w:cs="Arial"/>
+        </w:rPr>
         <w:t>2. The four selectors — scheduler.c:211-275</w:t>
       </w:r>
     </w:p>
@@ -4670,7 +4787,7 @@
     </w:p>
     <w:p>
       <w:r>
-        <w:t>Likely question: How are ties made deterministic? SJF and priority use arrival time; MLFQ uses a monotonically increasing queue stamp; RR uses the rotating cursor.</w:t>
+        <w:t>Tie resolution is deterministic: SJF and priority use arrival time, MLFQ uses a monotonically increasing queue stamp, and RR uses the rotating cursor.</w:t>
       </w:r>
     </w:p>
     <w:p>
@@ -4678,6 +4795,9 @@
         <w:pStyle w:val="Heading3"/>
       </w:pPr>
       <w:r>
+        <w:rPr>
+          <w:rFonts w:ascii="Arial" w:hAnsi="Arial" w:eastAsia="Arial" w:cs="Arial"/>
+        </w:rPr>
         <w:t>3. Dispatch, slice selection, and MLFQ demotion — scheduler.c:320-383</w:t>
       </w:r>
     </w:p>
@@ -5210,7 +5330,7 @@
     </w:p>
     <w:p>
       <w:r>
-        <w:t>Likely question: Why do SJF and priority run the entire remainder? Because the implemented versions are explicitly non-preemptive. RR and MLFQ use quanta.</w:t>
+        <w:t>SJF and priority run the entire remaining burst because their implemented forms are non-preemptive. RR and MLFQ instead use configured quanta.</w:t>
       </w:r>
     </w:p>
     <w:p>
@@ -5218,6 +5338,9 @@
         <w:pStyle w:val="Heading3"/>
       </w:pPr>
       <w:r>
+        <w:rPr>
+          <w:rFonts w:ascii="Arial" w:hAnsi="Arial" w:eastAsia="Arial" w:cs="Arial"/>
+        </w:rPr>
         <w:t>4. Metric calculation — scheduler.c:392-408</w:t>
       </w:r>
     </w:p>
@@ -5460,7 +5583,7 @@
     </w:p>
     <w:p>
       <w:r>
-        <w:t>Likely question: Why is waiting turnaround - burst? Turnaround contains both time executing and time not executing; subtracting total CPU burst leaves the logical time spent waiting.</w:t>
+        <w:t>Waiting time equals turnaround minus burst because turnaround includes both execution and non-execution time. Subtracting total CPU service leaves the logical time spent waiting.</w:t>
       </w:r>
     </w:p>
     <w:p>
@@ -5468,7 +5591,10 @@
         <w:pStyle w:val="Heading3"/>
       </w:pPr>
       <w:r>
-        <w:t>Configuration to know</w:t>
+        <w:rPr>
+          <w:rFonts w:ascii="Arial" w:hAnsi="Arial" w:eastAsia="Arial" w:cs="Arial"/>
+        </w:rPr>
+        <w:t>Configuration parameters</w:t>
       </w:r>
     </w:p>
     <w:p>
@@ -5565,6 +5691,9 @@
         <w:pStyle w:val="Heading3"/>
       </w:pPr>
       <w:r>
+        <w:rPr>
+          <w:rFonts w:ascii="Arial" w:hAnsi="Arial" w:eastAsia="Arial" w:cs="Arial"/>
+        </w:rPr>
         <w:t>How each algorithm works here</w:t>
       </w:r>
     </w:p>
@@ -5573,6 +5702,9 @@
         <w:pStyle w:val="Heading3"/>
       </w:pPr>
       <w:r>
+        <w:rPr>
+          <w:rFonts w:ascii="Arial" w:hAnsi="Arial" w:eastAsia="Arial" w:cs="Arial"/>
+        </w:rPr>
         <w:t>Round Robin</w:t>
       </w:r>
     </w:p>
@@ -5586,6 +5718,9 @@
         <w:pStyle w:val="Heading3"/>
       </w:pPr>
       <w:r>
+        <w:rPr>
+          <w:rFonts w:ascii="Arial" w:hAnsi="Arial" w:eastAsia="Arial" w:cs="Arial"/>
+        </w:rPr>
         <w:t>Shortest Job First</w:t>
       </w:r>
     </w:p>
@@ -5599,6 +5734,9 @@
         <w:pStyle w:val="Heading3"/>
       </w:pPr>
       <w:r>
+        <w:rPr>
+          <w:rFonts w:ascii="Arial" w:hAnsi="Arial" w:eastAsia="Arial" w:cs="Arial"/>
+        </w:rPr>
         <w:t>Static priority</w:t>
       </w:r>
     </w:p>
@@ -5612,12 +5750,15 @@
         <w:pStyle w:val="Heading3"/>
       </w:pPr>
       <w:r>
+        <w:rPr>
+          <w:rFonts w:ascii="Arial" w:hAnsi="Arial" w:eastAsia="Arial" w:cs="Arial"/>
+        </w:rPr>
         <w:t>MLFQ</w:t>
       </w:r>
     </w:p>
     <w:p>
       <w:r>
-        <w:t>New jobs begin in queue 0. Queue 0 has the smallest quantum, and lower queues have larger quanta. An unfinished process is demoted after its slice. This gives short or interactive-looking jobs quick service without requiring a supplied burst estimate. The implementation has three queues and no periodic priority boost, which is a limitation to mention.</w:t>
+        <w:t>New jobs begin in queue 0. Queue 0 has the smallest quantum, and lower queues have larger quanta. An unfinished process is demoted after its slice. This gives short or interactive-looking jobs quick service without requiring a supplied burst estimate. The implementation has three queues and no periodic priority boost, which is an explicit limitation of the experiment.</w:t>
       </w:r>
     </w:p>
     <w:p>
@@ -5625,6 +5766,9 @@
         <w:pStyle w:val="Heading3"/>
       </w:pPr>
       <w:r>
+        <w:rPr>
+          <w:rFonts w:ascii="Arial" w:hAnsi="Arial" w:eastAsia="Arial" w:cs="Arial"/>
+        </w:rPr>
         <w:t>Metrics and formulas</w:t>
       </w:r>
     </w:p>
@@ -5685,6 +5829,9 @@
         <w:pStyle w:val="Heading3"/>
       </w:pPr>
       <w:r>
+        <w:rPr>
+          <w:rFonts w:ascii="Arial" w:hAnsi="Arial" w:eastAsia="Arial" w:cs="Arial"/>
+        </w:rPr>
         <w:t>Native known-workload result</w:t>
       </w:r>
     </w:p>
@@ -6151,6 +6298,9 @@
         <w:pStyle w:val="Heading3"/>
       </w:pPr>
       <w:r>
+        <w:rPr>
+          <w:rFonts w:ascii="Arial" w:hAnsi="Arial" w:eastAsia="Arial" w:cs="Arial"/>
+        </w:rPr>
         <w:t>How these results were produced</w:t>
       </w:r>
     </w:p>
@@ -6222,6 +6372,9 @@
         <w:pStyle w:val="Heading3"/>
       </w:pPr>
       <w:r>
+        <w:rPr>
+          <w:rFonts w:ascii="Arial" w:hAnsi="Arial" w:eastAsia="Arial" w:cs="Arial"/>
+        </w:rPr>
         <w:t>One result traced by hand</w:t>
       </w:r>
     </w:p>
@@ -6282,7 +6435,10 @@
         <w:pStyle w:val="Heading3"/>
       </w:pPr>
       <w:r>
-        <w:t>Reproduce from a clean command directory</w:t>
+        <w:rPr>
+          <w:rFonts w:ascii="Arial" w:hAnsi="Arial" w:eastAsia="Arial" w:cs="Arial"/>
+        </w:rPr>
+        <w:t>Build and execution procedure</w:t>
       </w:r>
     </w:p>
     <w:p>
@@ -6390,9 +6546,13 @@
     <w:p>
       <w:pPr>
         <w:pStyle w:val="Heading3"/>
-      </w:pPr>
-      <w:r>
-        <w:t>Troubleshooting</w:t>
+        <w:spacing w:before="200" w:after="80"/>
+      </w:pPr>
+      <w:r>
+        <w:rPr>
+          <w:rFonts w:ascii="Arial" w:hAnsi="Arial" w:eastAsia="Arial" w:cs="Arial"/>
+        </w:rPr>
+        <w:t>Validation considerations</w:t>
       </w:r>
     </w:p>
     <w:p>
@@ -6447,100 +6607,10 @@
         <w:pStyle w:val="Heading3"/>
       </w:pPr>
       <w:r>
-        <w:t>Demo</w:t>
-      </w:r>
-    </w:p>
-    <w:p>
-      <w:pPr>
-        <w:pStyle w:val="NoSpacing"/>
-        <w:spacing w:after="40"/>
-        <w:ind w:left="317"/>
-      </w:pPr>
-      <w:r>
-        <w:rPr>
-          <w:rFonts w:ascii="Consolas" w:hAnsi="Consolas"/>
-          <w:sz w:val="16"/>
-        </w:rPr>
-        <w:t>sed -n '1,100p' /etc/scheduler.conf</w:t>
-      </w:r>
-    </w:p>
-    <w:p>
-      <w:pPr>
-        <w:pStyle w:val="NoSpacing"/>
-        <w:spacing w:after="40"/>
-        <w:ind w:left="317"/>
-      </w:pPr>
-      <w:r>
-        <w:rPr>
-          <w:rFonts w:ascii="Consolas" w:hAnsi="Consolas"/>
-          <w:sz w:val="16"/>
-        </w:rPr>
-        <w:t>schedexperiment -c /etc/scheduler.conf</w:t>
-      </w:r>
-    </w:p>
-    <w:p>
-      <w:pPr>
-        <w:pStyle w:val="NoSpacing"/>
-        <w:spacing w:after="40"/>
-        <w:ind w:left="317"/>
-      </w:pPr>
-      <w:r>
-        <w:rPr>
-          <w:rFonts w:ascii="Consolas" w:hAnsi="Consolas"/>
-          <w:sz w:val="16"/>
-        </w:rPr>
-        <w:t>head -8 /tmp/schedexperiment.csv</w:t>
-      </w:r>
-    </w:p>
-    <w:p>
-      <w:pPr>
-        <w:pStyle w:val="NoSpacing"/>
-        <w:spacing w:after="40"/>
-        <w:ind w:left="317"/>
-      </w:pPr>
-      <w:r>
-        <w:rPr>
-          <w:rFonts w:ascii="Consolas" w:hAnsi="Consolas"/>
-          <w:sz w:val="16"/>
-        </w:rPr>
-      </w:r>
-    </w:p>
-    <w:p>
-      <w:pPr>
-        <w:pStyle w:val="NoSpacing"/>
-        <w:spacing w:after="40"/>
-        <w:ind w:left="317"/>
-      </w:pPr>
-      <w:r>
-        <w:rPr>
-          <w:rFonts w:ascii="Consolas" w:hAnsi="Consolas"/>
-          <w:sz w:val="16"/>
-        </w:rPr>
-        <w:t>cd /usr/src/minix/commands/schedexperiment/tests</w:t>
-      </w:r>
-    </w:p>
-    <w:p>
-      <w:pPr>
-        <w:pStyle w:val="NoSpacing"/>
-        <w:spacing w:after="40"/>
-        <w:ind w:left="317"/>
-      </w:pPr>
-      <w:r>
-        <w:rPr>
-          <w:rFonts w:ascii="Consolas" w:hAnsi="Consolas"/>
-          <w:sz w:val="16"/>
-        </w:rPr>
-        <w:t>sh test_known.sh</w:t>
-      </w:r>
-    </w:p>
-    <w:p>
-      <w:r>
-        <w:t>Expected final line: PASS: known scheduling workload.</w:t>
-      </w:r>
-    </w:p>
-    <w:p>
-      <w:r>
-        <w:t>To demonstrate configurability, change only quantum_ms, rerun RR, and compare dispatch count and response time. Restore the original file afterward.</w:t>
+        <w:rPr>
+          <w:rFonts w:ascii="Arial" w:hAnsi="Arial" w:eastAsia="Arial" w:cs="Arial"/>
+        </w:rPr>
+        <w:t>Design rationale and limitations</w:t>
       </w:r>
     </w:p>
     <w:p>
@@ -6548,7 +6618,15 @@
         <w:pStyle w:val="Heading3"/>
       </w:pPr>
       <w:r>
-        <w:t>Likely questions and model answers</w:t>
+        <w:rPr>
+          <w:rFonts w:ascii="Arial" w:hAnsi="Arial" w:eastAsia="Arial" w:cs="Arial"/>
+        </w:rPr>
+        <w:t>Use of real processes</w:t>
+      </w:r>
+    </w:p>
+    <w:p>
+      <w:r>
+        <w:t>Yes. The parent calls fork() once per job. Children block on command pipes, perform CPU work when dispatched, and acknowledge completion. The policy clock is logical for reproducibility, but the workers are real MINIX processes.</w:t>
       </w:r>
     </w:p>
     <w:p>
@@ -6556,12 +6634,15 @@
         <w:pStyle w:val="Heading3"/>
       </w:pPr>
       <w:r>
-        <w:t>Are these real processes?</w:t>
-      </w:r>
-    </w:p>
-    <w:p>
-      <w:r>
-        <w:t>Yes. The parent calls fork() once per job. Children block on command pipes, perform CPU work when dispatched, and acknowledge completion. The policy clock is logical for reproducibility, but the workers are real MINIX processes.</w:t>
+        <w:rPr>
+          <w:rFonts w:ascii="Arial" w:hAnsi="Arial" w:eastAsia="Arial" w:cs="Arial"/>
+        </w:rPr>
+        <w:t>Relationship to the production MINIX scheduler</w:t>
+      </w:r>
+    </w:p>
+    <w:p>
+      <w:r>
+        <w:t>No. This is a controlled dispatcher compiled and executed inside MINIX. It satisfies real-process execution and policy comparison, but it is not a kernel scheduler replacement.</w:t>
       </w:r>
     </w:p>
     <w:p>
@@ -6569,12 +6650,15 @@
         <w:pStyle w:val="Heading3"/>
       </w:pPr>
       <w:r>
-        <w:t>Did you replace the production MINIX kernel scheduler?</w:t>
-      </w:r>
-    </w:p>
-    <w:p>
-      <w:r>
-        <w:t>No. This is a controlled dispatcher compiled and executed inside MINIX. It satisfies real-process execution and policy comparison, but it is not a kernel scheduler replacement. State this boundary honestly.</w:t>
+        <w:rPr>
+          <w:rFonts w:ascii="Arial" w:hAnsi="Arial" w:eastAsia="Arial" w:cs="Arial"/>
+        </w:rPr>
+        <w:t>Use of logical time</w:t>
+      </w:r>
+    </w:p>
+    <w:p>
+      <w:r>
+        <w:t>VM load and host scheduling make wall time noisy. Logical time makes turnaround, waiting, and response exactly repeatable for a defined workload. Wall time is still recorded to confirm actual work executed.</w:t>
       </w:r>
     </w:p>
     <w:p>
@@ -6582,12 +6666,15 @@
         <w:pStyle w:val="Heading3"/>
       </w:pPr>
       <w:r>
-        <w:t>Why use logical time?</w:t>
-      </w:r>
-    </w:p>
-    <w:p>
-      <w:r>
-        <w:t>VM load and host scheduling make wall time noisy. Logical time makes turnaround, waiting, and response exactly repeatable for a defined workload. Wall time is still recorded to confirm actual work executed.</w:t>
+        <w:rPr>
+          <w:rFonts w:ascii="Arial" w:hAnsi="Arial" w:eastAsia="Arial" w:cs="Arial"/>
+        </w:rPr>
+        <w:t>SJF preemption model</w:t>
+      </w:r>
+    </w:p>
+    <w:p>
+      <w:r>
+        <w:t>No. It is non-preemptive SJF. The preemptive form would be Shortest Remaining Time First and would re-evaluate when a new process arrives.</w:t>
       </w:r>
     </w:p>
     <w:p>
@@ -6595,12 +6682,15 @@
         <w:pStyle w:val="Heading3"/>
       </w:pPr>
       <w:r>
-        <w:t>Is your SJF preemptive?</w:t>
-      </w:r>
-    </w:p>
-    <w:p>
-      <w:r>
-        <w:t>No. It is non-preemptive SJF. The preemptive form would be Shortest Remaining Time First and would re-evaluate when a new process arrives.</w:t>
+        <w:rPr>
+          <w:rFonts w:ascii="Arial" w:hAnsi="Arial" w:eastAsia="Arial" w:cs="Arial"/>
+        </w:rPr>
+        <w:t>Tie-breaking rules</w:t>
+      </w:r>
+    </w:p>
+    <w:p>
+      <w:r>
+        <w:t>Deterministically, using arrival/order information rather than arbitrary array behavior. This ensures identical configuration produces identical logical results.</w:t>
       </w:r>
     </w:p>
     <w:p>
@@ -6608,12 +6698,15 @@
         <w:pStyle w:val="Heading3"/>
       </w:pPr>
       <w:r>
-        <w:t>How are ties resolved?</w:t>
-      </w:r>
-    </w:p>
-    <w:p>
-      <w:r>
-        <w:t>Deterministically, using arrival/order information rather than arbitrary array behavior. This ensures identical configuration produces identical logical results.</w:t>
+        <w:rPr>
+          <w:rFonts w:ascii="Arial" w:hAnsi="Arial" w:eastAsia="Arial" w:cs="Arial"/>
+        </w:rPr>
+        <w:t>MLFQ waiting time compared with SJF</w:t>
+      </w:r>
+    </w:p>
+    <w:p>
+      <w:r>
+        <w:t>MLFQ optimizes responsiveness without knowing future bursts. It repeatedly serves and demotes jobs, which improves first response but may delay completion and increase dispatch overhead. SJF has the unfair advantage of known bursts.</w:t>
       </w:r>
     </w:p>
     <w:p>
@@ -6621,12 +6714,15 @@
         <w:pStyle w:val="Heading3"/>
       </w:pPr>
       <w:r>
-        <w:t>Why can MLFQ have worse average waiting than SJF?</w:t>
-      </w:r>
-    </w:p>
-    <w:p>
-      <w:r>
-        <w:t>MLFQ optimizes responsiveness without knowing future bursts. It repeatedly serves and demotes jobs, which improves first response but may delay completion and increase dispatch overhead. SJF has the unfair advantage of known bursts.</w:t>
+        <w:rPr>
+          <w:rFonts w:ascii="Arial" w:hAnsi="Arial" w:eastAsia="Arial" w:cs="Arial"/>
+        </w:rPr>
+        <w:t>Handling idle intervals</w:t>
+      </w:r>
+    </w:p>
+    <w:p>
+      <w:r>
+        <w:t>The logical clock jumps to the next configured arrival instead of dispatching a future process or busy-waiting.</w:t>
       </w:r>
     </w:p>
     <w:p>
@@ -6634,12 +6730,64 @@
         <w:pStyle w:val="Heading3"/>
       </w:pPr>
       <w:r>
-        <w:t>What happens when no job is ready?</w:t>
-      </w:r>
-    </w:p>
-    <w:p>
-      <w:r>
-        <w:t>The logical clock jumps to the next configured arrival instead of dispatching a future process or busy-waiting.</w:t>
+        <w:rPr>
+          <w:rFonts w:ascii="Arial" w:hAnsi="Arial" w:eastAsia="Arial" w:cs="Arial"/>
+        </w:rPr>
+        <w:t>Scope limitations</w:t>
+      </w:r>
+    </w:p>
+    <w:p>
+      <w:pPr>
+        <w:pStyle w:val="ListBullet"/>
+      </w:pPr>
+      <w:r>
+        <w:t>Dispatch count is an experiment-level metric, not an exact kernel context-switch count.</w:t>
+      </w:r>
+    </w:p>
+    <w:p>
+      <w:pPr>
+        <w:pStyle w:val="ListBullet"/>
+      </w:pPr>
+      <w:r>
+        <w:t>The production MINIX scheduler is not replaced by this experiment.</w:t>
+      </w:r>
+    </w:p>
+    <w:p>
+      <w:pPr>
+        <w:pStyle w:val="ListBullet"/>
+      </w:pPr>
+      <w:r>
+        <w:t>The implemented SJF and priority policies are non-preemptive.</w:t>
+      </w:r>
+    </w:p>
+    <w:p>
+      <w:pPr>
+        <w:pStyle w:val="ListBullet"/>
+      </w:pPr>
+      <w:r>
+        <w:t>Algorithm comparisons are specific to the configured workload.</w:t>
+      </w:r>
+    </w:p>
+    <w:p>
+      <w:pPr>
+        <w:pStyle w:val="Heading1"/>
+      </w:pPr>
+      <w:r>
+        <w:rPr>
+          <w:rFonts w:ascii="Arial" w:hAnsi="Arial" w:eastAsia="Arial" w:cs="Arial"/>
+        </w:rPr>
+        <w:t>11. Detailed Requirement 2 implementation and analysis</w:t>
+      </w:r>
+    </w:p>
+    <w:p>
+      <w:pPr>
+        <w:pStyle w:val="Heading2"/>
+      </w:pPr>
+      <w:r>
+        <w:rPr>
+          <w:rFonts w:ascii="Arial" w:hAnsi="Arial" w:eastAsia="Arial" w:cs="Arial"/>
+        </w:rPr>
+        <w:t>Requirement 2 - hierarchical paging and replacement</w:t>
       </w:r>
     </w:p>
     <w:p>
@@ -6647,55 +6795,15 @@
         <w:pStyle w:val="Heading3"/>
       </w:pPr>
       <w:r>
-        <w:t>Claims to avoid</w:t>
-      </w:r>
-    </w:p>
-    <w:p>
-      <w:pPr>
-        <w:pStyle w:val="ListBullet"/>
-      </w:pPr>
-      <w:r>
-        <w:t>Do not call the dispatch count an exact kernel context-switch count.</w:t>
-      </w:r>
-    </w:p>
-    <w:p>
-      <w:pPr>
-        <w:pStyle w:val="ListBullet"/>
-      </w:pPr>
-      <w:r>
-        <w:t>Do not claim the production MINIX scheduler was replaced.</w:t>
-      </w:r>
-    </w:p>
-    <w:p>
-      <w:pPr>
-        <w:pStyle w:val="ListBullet"/>
-      </w:pPr>
-      <w:r>
-        <w:t>Do not call SJF or priority preemptive.</w:t>
-      </w:r>
-    </w:p>
-    <w:p>
-      <w:pPr>
-        <w:pStyle w:val="ListBullet"/>
-      </w:pPr>
-      <w:r>
-        <w:t>Do not say one algorithm is universally best; the result is workload-specific.</w:t>
-      </w:r>
-    </w:p>
-    <w:p>
-      <w:pPr>
-        <w:pStyle w:val="Heading1"/>
-      </w:pPr>
-      <w:r>
-        <w:t>11. Detailed Requirement 2 implementation and discussion manual</w:t>
-      </w:r>
-    </w:p>
-    <w:p>
-      <w:pPr>
-        <w:pStyle w:val="Heading2"/>
-      </w:pPr>
-      <w:r>
-        <w:t>Requirement 2 — hierarchical paging and replacement discussion guide</w:t>
+        <w:rPr>
+          <w:rFonts w:ascii="Arial" w:hAnsi="Arial" w:eastAsia="Arial" w:cs="Arial"/>
+        </w:rPr>
+        <w:t>What the specification asks for</w:t>
+      </w:r>
+    </w:p>
+    <w:p>
+      <w:r>
+        <w:t>Implement configurable hierarchical paging with user-defined page size, levels, and address format. Implement FIFO and LRU replacement, collect page faults, empty frames, and related metrics while page size and hierarchy depth change, and analyze the results.</w:t>
       </w:r>
     </w:p>
     <w:p>
@@ -6703,12 +6811,15 @@
         <w:pStyle w:val="Heading3"/>
       </w:pPr>
       <w:r>
-        <w:t>What the specification asks for</w:t>
-      </w:r>
-    </w:p>
-    <w:p>
-      <w:r>
-        <w:t>Implement configurable hierarchical paging with user-defined page size, levels, and address format. Implement FIFO and LRU replacement, collect page faults, empty frames, and related metrics while page size and hierarchy depth change, and analyze the results.</w:t>
+        <w:rPr>
+          <w:rFonts w:ascii="Arial" w:hAnsi="Arial" w:eastAsia="Arial" w:cs="Arial"/>
+        </w:rPr>
+        <w:t>What changed from stock MINIX</w:t>
+      </w:r>
+    </w:p>
+    <w:p>
+      <w:r>
+        <w:t>Stock 32-bit MINIX uses architecture-defined paging and cannot accept arbitrary hardware page geometry from a text file. The project therefore adds a native command that constructs the requested hierarchy in software and compares FIFO and LRU over controlled traces. This is separate from the production VM server and preserves the real system's safety.</w:t>
       </w:r>
     </w:p>
     <w:p>
@@ -6716,249 +6827,256 @@
         <w:pStyle w:val="Heading3"/>
       </w:pPr>
       <w:r>
-        <w:t>What changed from stock MINIX</w:t>
-      </w:r>
-    </w:p>
-    <w:p>
-      <w:r>
-        <w:t>Stock 32-bit MINIX uses architecture-defined paging and cannot accept arbitrary hardware page geometry from a text file. The project therefore adds a native command that constructs the requested hierarchy in software and compares FIFO and LRU over controlled traces. This is separate from the production VM server and preserves the real system's safety.</w:t>
+        <w:rPr>
+          <w:rFonts w:ascii="Arial" w:hAnsi="Arial" w:eastAsia="Arial" w:cs="Arial"/>
+        </w:rPr>
+        <w:t>End-to-end execution flow</w:t>
+      </w:r>
+    </w:p>
+    <w:p>
+      <w:pPr>
+        <w:pStyle w:val="NoSpacing"/>
+        <w:spacing w:after="40"/>
+        <w:ind w:left="317"/>
+      </w:pPr>
+      <w:r>
+        <w:rPr>
+          <w:rFonts w:ascii="Consolas" w:hAnsi="Consolas"/>
+          <w:sz w:val="16"/>
+        </w:rPr>
+        <w:t>/etc/paging.conf</w:t>
+      </w:r>
+    </w:p>
+    <w:p>
+      <w:pPr>
+        <w:pStyle w:val="NoSpacing"/>
+        <w:spacing w:after="40"/>
+        <w:ind w:left="317"/>
+      </w:pPr>
+      <w:r>
+        <w:rPr>
+          <w:rFonts w:ascii="Consolas" w:hAnsi="Consolas"/>
+          <w:sz w:val="16"/>
+        </w:rPr>
+        <w:t xml:space="preserve">        |</w:t>
+      </w:r>
+    </w:p>
+    <w:p>
+      <w:pPr>
+        <w:pStyle w:val="NoSpacing"/>
+        <w:spacing w:after="40"/>
+        <w:ind w:left="317"/>
+      </w:pPr>
+      <w:r>
+        <w:rPr>
+          <w:rFonts w:ascii="Consolas" w:hAnsi="Consolas"/>
+          <w:sz w:val="16"/>
+        </w:rPr>
+        <w:t xml:space="preserve">        v</w:t>
+      </w:r>
+    </w:p>
+    <w:p>
+      <w:pPr>
+        <w:pStyle w:val="NoSpacing"/>
+        <w:spacing w:after="40"/>
+        <w:ind w:left="317"/>
+      </w:pPr>
+      <w:r>
+        <w:rPr>
+          <w:rFonts w:ascii="Consolas" w:hAnsi="Consolas"/>
+          <w:sz w:val="16"/>
+        </w:rPr>
+        <w:t>config.c validates page size, levels, index bits, frames, and trace</w:t>
+      </w:r>
+    </w:p>
+    <w:p>
+      <w:pPr>
+        <w:pStyle w:val="NoSpacing"/>
+        <w:spacing w:after="40"/>
+        <w:ind w:left="317"/>
+      </w:pPr>
+      <w:r>
+        <w:rPr>
+          <w:rFonts w:ascii="Consolas" w:hAnsi="Consolas"/>
+          <w:sz w:val="16"/>
+        </w:rPr>
+        <w:t xml:space="preserve">        |</w:t>
+      </w:r>
+    </w:p>
+    <w:p>
+      <w:pPr>
+        <w:pStyle w:val="NoSpacing"/>
+        <w:spacing w:after="40"/>
+        <w:ind w:left="317"/>
+      </w:pPr>
+      <w:r>
+        <w:rPr>
+          <w:rFonts w:ascii="Consolas" w:hAnsi="Consolas"/>
+          <w:sz w:val="16"/>
+        </w:rPr>
+        <w:t xml:space="preserve">        v</w:t>
+      </w:r>
+    </w:p>
+    <w:p>
+      <w:pPr>
+        <w:pStyle w:val="NoSpacing"/>
+        <w:spacing w:after="40"/>
+        <w:ind w:left="317"/>
+      </w:pPr>
+      <w:r>
+        <w:rPr>
+          <w:rFonts w:ascii="Consolas" w:hAnsi="Consolas"/>
+          <w:sz w:val="16"/>
+        </w:rPr>
+        <w:t>simulator.c generates one deterministic byte-address trace</w:t>
+      </w:r>
+    </w:p>
+    <w:p>
+      <w:pPr>
+        <w:pStyle w:val="NoSpacing"/>
+        <w:spacing w:after="40"/>
+        <w:ind w:left="317"/>
+      </w:pPr>
+      <w:r>
+        <w:rPr>
+          <w:rFonts w:ascii="Consolas" w:hAnsi="Consolas"/>
+          <w:sz w:val="16"/>
+        </w:rPr>
+        <w:t xml:space="preserve">        |</w:t>
+      </w:r>
+    </w:p>
+    <w:p>
+      <w:pPr>
+        <w:pStyle w:val="NoSpacing"/>
+        <w:spacing w:after="40"/>
+        <w:ind w:left="317"/>
+      </w:pPr>
+      <w:r>
+        <w:rPr>
+          <w:rFonts w:ascii="Consolas" w:hAnsi="Consolas"/>
+          <w:sz w:val="16"/>
+        </w:rPr>
+        <w:t xml:space="preserve">        v</w:t>
+      </w:r>
+    </w:p>
+    <w:p>
+      <w:pPr>
+        <w:pStyle w:val="NoSpacing"/>
+        <w:spacing w:after="40"/>
+        <w:ind w:left="317"/>
+      </w:pPr>
+      <w:r>
+        <w:rPr>
+          <w:rFonts w:ascii="Consolas" w:hAnsi="Consolas"/>
+          <w:sz w:val="16"/>
+        </w:rPr>
+        <w:t>page_lookup() walks/creates sparse hierarchy paths</w:t>
+      </w:r>
+    </w:p>
+    <w:p>
+      <w:pPr>
+        <w:pStyle w:val="NoSpacing"/>
+        <w:spacing w:after="40"/>
+        <w:ind w:left="317"/>
+      </w:pPr>
+      <w:r>
+        <w:rPr>
+          <w:rFonts w:ascii="Consolas" w:hAnsi="Consolas"/>
+          <w:sz w:val="16"/>
+        </w:rPr>
+        <w:t xml:space="preserve">        |</w:t>
+      </w:r>
+    </w:p>
+    <w:p>
+      <w:pPr>
+        <w:pStyle w:val="NoSpacing"/>
+        <w:spacing w:after="40"/>
+        <w:ind w:left="317"/>
+      </w:pPr>
+      <w:r>
+        <w:rPr>
+          <w:rFonts w:ascii="Consolas" w:hAnsi="Consolas"/>
+          <w:sz w:val="16"/>
+        </w:rPr>
+        <w:t xml:space="preserve">        v</w:t>
+      </w:r>
+    </w:p>
+    <w:p>
+      <w:pPr>
+        <w:pStyle w:val="NoSpacing"/>
+        <w:spacing w:after="40"/>
+        <w:ind w:left="317"/>
+      </w:pPr>
+      <w:r>
+        <w:rPr>
+          <w:rFonts w:ascii="Consolas" w:hAnsi="Consolas"/>
+          <w:sz w:val="16"/>
+        </w:rPr>
+        <w:t>access_page() records hit or fault and select_frame() applies FIFO/LRU</w:t>
+      </w:r>
+    </w:p>
+    <w:p>
+      <w:pPr>
+        <w:pStyle w:val="NoSpacing"/>
+        <w:spacing w:after="40"/>
+        <w:ind w:left="317"/>
+      </w:pPr>
+      <w:r>
+        <w:rPr>
+          <w:rFonts w:ascii="Consolas" w:hAnsi="Consolas"/>
+          <w:sz w:val="16"/>
+        </w:rPr>
+        <w:t xml:space="preserve">        |</w:t>
+      </w:r>
+    </w:p>
+    <w:p>
+      <w:pPr>
+        <w:pStyle w:val="NoSpacing"/>
+        <w:spacing w:after="40"/>
+        <w:ind w:left="317"/>
+      </w:pPr>
+      <w:r>
+        <w:rPr>
+          <w:rFonts w:ascii="Consolas" w:hAnsi="Consolas"/>
+          <w:sz w:val="16"/>
+        </w:rPr>
+        <w:t xml:space="preserve">        v</w:t>
+      </w:r>
+    </w:p>
+    <w:p>
+      <w:pPr>
+        <w:pStyle w:val="NoSpacing"/>
+        <w:spacing w:after="40"/>
+        <w:ind w:left="317"/>
+      </w:pPr>
+      <w:r>
+        <w:rPr>
+          <w:rFonts w:ascii="Consolas" w:hAnsi="Consolas"/>
+          <w:sz w:val="16"/>
+        </w:rPr>
+        <w:t>vmexperiment.c writes policy and hierarchy metrics to CSV</w:t>
+      </w:r>
+    </w:p>
+    <w:p>
+      <w:r>
+        <w:t>FIFO and LRU receive the same address trace. Without this control, a difference in fault counts could come from different input rather than replacement policy.</w:t>
       </w:r>
     </w:p>
     <w:p>
       <w:pPr>
         <w:pStyle w:val="Heading3"/>
-      </w:pPr>
-      <w:r>
-        <w:t>End-to-end execution flow</w:t>
-      </w:r>
-    </w:p>
-    <w:p>
-      <w:pPr>
-        <w:pStyle w:val="NoSpacing"/>
-        <w:spacing w:after="40"/>
-        <w:ind w:left="317"/>
-      </w:pPr>
-      <w:r>
-        <w:rPr>
-          <w:rFonts w:ascii="Consolas" w:hAnsi="Consolas"/>
-          <w:sz w:val="16"/>
-        </w:rPr>
-        <w:t>/etc/paging.conf</w:t>
-      </w:r>
-    </w:p>
-    <w:p>
-      <w:pPr>
-        <w:pStyle w:val="NoSpacing"/>
-        <w:spacing w:after="40"/>
-        <w:ind w:left="317"/>
-      </w:pPr>
-      <w:r>
-        <w:rPr>
-          <w:rFonts w:ascii="Consolas" w:hAnsi="Consolas"/>
-          <w:sz w:val="16"/>
-        </w:rPr>
-        <w:t xml:space="preserve">        |</w:t>
-      </w:r>
-    </w:p>
-    <w:p>
-      <w:pPr>
-        <w:pStyle w:val="NoSpacing"/>
-        <w:spacing w:after="40"/>
-        <w:ind w:left="317"/>
-      </w:pPr>
-      <w:r>
-        <w:rPr>
-          <w:rFonts w:ascii="Consolas" w:hAnsi="Consolas"/>
-          <w:sz w:val="16"/>
-        </w:rPr>
-        <w:t xml:space="preserve">        v</w:t>
-      </w:r>
-    </w:p>
-    <w:p>
-      <w:pPr>
-        <w:pStyle w:val="NoSpacing"/>
-        <w:spacing w:after="40"/>
-        <w:ind w:left="317"/>
-      </w:pPr>
-      <w:r>
-        <w:rPr>
-          <w:rFonts w:ascii="Consolas" w:hAnsi="Consolas"/>
-          <w:sz w:val="16"/>
-        </w:rPr>
-        <w:t>config.c validates page size, levels, index bits, frames, and trace</w:t>
-      </w:r>
-    </w:p>
-    <w:p>
-      <w:pPr>
-        <w:pStyle w:val="NoSpacing"/>
-        <w:spacing w:after="40"/>
-        <w:ind w:left="317"/>
-      </w:pPr>
-      <w:r>
-        <w:rPr>
-          <w:rFonts w:ascii="Consolas" w:hAnsi="Consolas"/>
-          <w:sz w:val="16"/>
-        </w:rPr>
-        <w:t xml:space="preserve">        |</w:t>
-      </w:r>
-    </w:p>
-    <w:p>
-      <w:pPr>
-        <w:pStyle w:val="NoSpacing"/>
-        <w:spacing w:after="40"/>
-        <w:ind w:left="317"/>
-      </w:pPr>
-      <w:r>
-        <w:rPr>
-          <w:rFonts w:ascii="Consolas" w:hAnsi="Consolas"/>
-          <w:sz w:val="16"/>
-        </w:rPr>
-        <w:t xml:space="preserve">        v</w:t>
-      </w:r>
-    </w:p>
-    <w:p>
-      <w:pPr>
-        <w:pStyle w:val="NoSpacing"/>
-        <w:spacing w:after="40"/>
-        <w:ind w:left="317"/>
-      </w:pPr>
-      <w:r>
-        <w:rPr>
-          <w:rFonts w:ascii="Consolas" w:hAnsi="Consolas"/>
-          <w:sz w:val="16"/>
-        </w:rPr>
-        <w:t>simulator.c generates one deterministic byte-address trace</w:t>
-      </w:r>
-    </w:p>
-    <w:p>
-      <w:pPr>
-        <w:pStyle w:val="NoSpacing"/>
-        <w:spacing w:after="40"/>
-        <w:ind w:left="317"/>
-      </w:pPr>
-      <w:r>
-        <w:rPr>
-          <w:rFonts w:ascii="Consolas" w:hAnsi="Consolas"/>
-          <w:sz w:val="16"/>
-        </w:rPr>
-        <w:t xml:space="preserve">        |</w:t>
-      </w:r>
-    </w:p>
-    <w:p>
-      <w:pPr>
-        <w:pStyle w:val="NoSpacing"/>
-        <w:spacing w:after="40"/>
-        <w:ind w:left="317"/>
-      </w:pPr>
-      <w:r>
-        <w:rPr>
-          <w:rFonts w:ascii="Consolas" w:hAnsi="Consolas"/>
-          <w:sz w:val="16"/>
-        </w:rPr>
-        <w:t xml:space="preserve">        v</w:t>
-      </w:r>
-    </w:p>
-    <w:p>
-      <w:pPr>
-        <w:pStyle w:val="NoSpacing"/>
-        <w:spacing w:after="40"/>
-        <w:ind w:left="317"/>
-      </w:pPr>
-      <w:r>
-        <w:rPr>
-          <w:rFonts w:ascii="Consolas" w:hAnsi="Consolas"/>
-          <w:sz w:val="16"/>
-        </w:rPr>
-        <w:t>page_lookup() walks/creates sparse hierarchy paths</w:t>
-      </w:r>
-    </w:p>
-    <w:p>
-      <w:pPr>
-        <w:pStyle w:val="NoSpacing"/>
-        <w:spacing w:after="40"/>
-        <w:ind w:left="317"/>
-      </w:pPr>
-      <w:r>
-        <w:rPr>
-          <w:rFonts w:ascii="Consolas" w:hAnsi="Consolas"/>
-          <w:sz w:val="16"/>
-        </w:rPr>
-        <w:t xml:space="preserve">        |</w:t>
-      </w:r>
-    </w:p>
-    <w:p>
-      <w:pPr>
-        <w:pStyle w:val="NoSpacing"/>
-        <w:spacing w:after="40"/>
-        <w:ind w:left="317"/>
-      </w:pPr>
-      <w:r>
-        <w:rPr>
-          <w:rFonts w:ascii="Consolas" w:hAnsi="Consolas"/>
-          <w:sz w:val="16"/>
-        </w:rPr>
-        <w:t xml:space="preserve">        v</w:t>
-      </w:r>
-    </w:p>
-    <w:p>
-      <w:pPr>
-        <w:pStyle w:val="NoSpacing"/>
-        <w:spacing w:after="40"/>
-        <w:ind w:left="317"/>
-      </w:pPr>
-      <w:r>
-        <w:rPr>
-          <w:rFonts w:ascii="Consolas" w:hAnsi="Consolas"/>
-          <w:sz w:val="16"/>
-        </w:rPr>
-        <w:t>access_page() records hit or fault and select_frame() applies FIFO/LRU</w:t>
-      </w:r>
-    </w:p>
-    <w:p>
-      <w:pPr>
-        <w:pStyle w:val="NoSpacing"/>
-        <w:spacing w:after="40"/>
-        <w:ind w:left="317"/>
-      </w:pPr>
-      <w:r>
-        <w:rPr>
-          <w:rFonts w:ascii="Consolas" w:hAnsi="Consolas"/>
-          <w:sz w:val="16"/>
-        </w:rPr>
-        <w:t xml:space="preserve">        |</w:t>
-      </w:r>
-    </w:p>
-    <w:p>
-      <w:pPr>
-        <w:pStyle w:val="NoSpacing"/>
-        <w:spacing w:after="40"/>
-        <w:ind w:left="317"/>
-      </w:pPr>
-      <w:r>
-        <w:rPr>
-          <w:rFonts w:ascii="Consolas" w:hAnsi="Consolas"/>
-          <w:sz w:val="16"/>
-        </w:rPr>
-        <w:t xml:space="preserve">        v</w:t>
-      </w:r>
-    </w:p>
-    <w:p>
-      <w:pPr>
-        <w:pStyle w:val="NoSpacing"/>
-        <w:spacing w:after="40"/>
-        <w:ind w:left="317"/>
-      </w:pPr>
-      <w:r>
-        <w:rPr>
-          <w:rFonts w:ascii="Consolas" w:hAnsi="Consolas"/>
-          <w:sz w:val="16"/>
-        </w:rPr>
-        <w:t>vmexperiment.c writes policy and hierarchy metrics to CSV</w:t>
-      </w:r>
-    </w:p>
-    <w:p>
-      <w:r>
-        <w:t>FIFO and LRU receive the same address trace. Without this control, a difference in fault counts could come from different input rather than replacement policy.</w:t>
+        <w:spacing w:before="200" w:after="80"/>
+      </w:pPr>
+      <w:r>
+        <w:rPr>
+          <w:rFonts w:ascii="Arial" w:hAnsi="Arial" w:eastAsia="Arial" w:cs="Arial"/>
+        </w:rPr>
+        <w:t>Implementation summary</w:t>
+      </w:r>
+    </w:p>
+    <w:p>
+      <w:r>
+        <w:t>vmexperiment is compiled and run natively in MINIX. It validates a configurable virtual-address split, constructs a sparse multi-level page-table structure, generates a deterministic byte-address trace, and sends the same trace through FIFO and exact LRU frame replacement. It records hits, faults, replacements, empty frames, and hierarchy memory in CSV. It is an OS experiment model; it does not claim to reprogram the fixed x86 MMU.</w:t>
       </w:r>
     </w:p>
     <w:p>
@@ -6966,19 +7084,9 @@
         <w:pStyle w:val="Heading3"/>
       </w:pPr>
       <w:r>
-        <w:t>30-second explanation</w:t>
-      </w:r>
-    </w:p>
-    <w:p>
-      <w:r>
-        <w:t>vmexperiment is compiled and run natively in MINIX. It validates a configurable virtual-address split, constructs a sparse multi-level page-table structure, generates a deterministic byte-address trace, and sends the same trace through FIFO and exact LRU frame replacement. It records hits, faults, replacements, empty frames, and hierarchy memory in CSV. It is an OS experiment model; it does not claim to reprogram the fixed x86 MMU.</w:t>
-      </w:r>
-    </w:p>
-    <w:p>
-      <w:pPr>
-        <w:pStyle w:val="Heading3"/>
-      </w:pPr>
-      <w:r>
+        <w:rPr>
+          <w:rFonts w:ascii="Arial" w:hAnsi="Arial" w:eastAsia="Arial" w:cs="Arial"/>
+        </w:rPr>
         <w:t>Architecture and code map</w:t>
       </w:r>
     </w:p>
@@ -7249,7 +7357,10 @@
         <w:pStyle w:val="Heading3"/>
       </w:pPr>
       <w:r>
-        <w:t>Exact code to study</w:t>
+        <w:rPr>
+          <w:rFonts w:ascii="Arial" w:hAnsi="Arial" w:eastAsia="Arial" w:cs="Arial"/>
+        </w:rPr>
+        <w:t>Key implementation excerpts</w:t>
       </w:r>
     </w:p>
     <w:p>
@@ -7257,6 +7368,9 @@
         <w:pStyle w:val="Heading3"/>
       </w:pPr>
       <w:r>
+        <w:rPr>
+          <w:rFonts w:ascii="Arial" w:hAnsi="Arial" w:eastAsia="Arial" w:cs="Arial"/>
+        </w:rPr>
         <w:t>1. Configuration geometry gate — config.c:271-278</w:t>
       </w:r>
     </w:p>
@@ -7393,7 +7507,7 @@
     </w:p>
     <w:p>
       <w:r>
-        <w:t>Likely question: Why must the sum be exact? Every address bit must belong to exactly one level index or the page offset. Missing or overlapping bits would make translation ambiguous.</w:t>
+        <w:t>The geometry sum must be exact because every address bit belongs to one level index or to the page offset. Missing or overlapping bits would make translation ambiguous.</w:t>
       </w:r>
     </w:p>
     <w:p>
@@ -7401,6 +7515,9 @@
         <w:pStyle w:val="Heading3"/>
       </w:pPr>
       <w:r>
+        <w:rPr>
+          <w:rFonts w:ascii="Arial" w:hAnsi="Arial" w:eastAsia="Arial" w:cs="Arial"/>
+        </w:rPr>
         <w:t>2. Extracting a hierarchy index — simulator.c:212-223</w:t>
       </w:r>
     </w:p>
@@ -7602,7 +7719,7 @@
     </w:p>
     <w:p>
       <w:r>
-        <w:t>Likely question: Why pass a virtual page rather than a byte address? Page offset bits are removed first by dividing the byte address by page size.</w:t>
+        <w:t>The hierarchy receives a virtual page rather than a byte address because division by page size removes the offset bits before index extraction.</w:t>
       </w:r>
     </w:p>
     <w:p>
@@ -7610,6 +7727,9 @@
         <w:pStyle w:val="Heading3"/>
       </w:pPr>
       <w:r>
+        <w:rPr>
+          <w:rFonts w:ascii="Arial" w:hAnsi="Arial" w:eastAsia="Arial" w:cs="Arial"/>
+        </w:rPr>
         <w:t>3. Sparse hierarchy creation — simulator.c:236-262</w:t>
       </w:r>
     </w:p>
@@ -8065,7 +8185,7 @@
     </w:p>
     <w:p>
       <w:r>
-        <w:t>Likely question: Why call it sparse? slot_create() and node_create() are called only after a referenced index is missing; untouched address regions consume no lower-level nodes.</w:t>
+        <w:t>The hierarchy is sparse because slot_create() and node_create() run only when a referenced index is missing; untouched address regions consume no lower-level nodes.</w:t>
       </w:r>
     </w:p>
     <w:p>
@@ -8073,6 +8193,9 @@
         <w:pStyle w:val="Heading3"/>
       </w:pPr>
       <w:r>
+        <w:rPr>
+          <w:rFonts w:ascii="Arial" w:hAnsi="Arial" w:eastAsia="Arial" w:cs="Arial"/>
+        </w:rPr>
         <w:t>4. FIFO/LRU victim selection — simulator.c:274-292</w:t>
       </w:r>
     </w:p>
@@ -8356,7 +8479,7 @@
     </w:p>
     <w:p>
       <w:r>
-        <w:t>Likely question: What is the only policy-dependent line? The timestamp: FIFO compares loaded_at; LRU compares last_access. Both first use empty frames before evicting anything.</w:t>
+        <w:t>Victim selection differs only in the timestamp comparison: FIFO uses loaded_at, whereas LRU uses last_access. Both policies use empty frames before evicting a resident page.</w:t>
       </w:r>
     </w:p>
     <w:p>
@@ -8364,6 +8487,9 @@
         <w:pStyle w:val="Heading3"/>
       </w:pPr>
       <w:r>
+        <w:rPr>
+          <w:rFonts w:ascii="Arial" w:hAnsi="Arial" w:eastAsia="Arial" w:cs="Arial"/>
+        </w:rPr>
         <w:t>5. Hit, fault, and replacement accounting — simulator.c:303-325</w:t>
       </w:r>
     </w:p>
@@ -8697,7 +8823,7 @@
     </w:p>
     <w:p>
       <w:r>
-        <w:t>Likely question: Why is every replacement a fault but not every fault a replacement? An initial load into an empty frame faults without evicting a resident page.</w:t>
+        <w:t>Every replacement is caused by a fault, but an initial load into an empty frame faults without replacing a resident page.</w:t>
       </w:r>
     </w:p>
     <w:p>
@@ -8705,6 +8831,9 @@
         <w:pStyle w:val="Heading3"/>
       </w:pPr>
       <w:r>
+        <w:rPr>
+          <w:rFonts w:ascii="Arial" w:hAnsi="Arial" w:eastAsia="Arial" w:cs="Arial"/>
+        </w:rPr>
         <w:t>Address geometry</w:t>
       </w:r>
     </w:p>
@@ -8742,7 +8871,10 @@
         <w:pStyle w:val="Heading3"/>
       </w:pPr>
       <w:r>
-        <w:t>Configuration to know</w:t>
+        <w:rPr>
+          <w:rFonts w:ascii="Arial" w:hAnsi="Arial" w:eastAsia="Arial" w:cs="Arial"/>
+        </w:rPr>
+        <w:t>Configuration parameters</w:t>
       </w:r>
     </w:p>
     <w:p>
@@ -8923,6 +9055,9 @@
         <w:pStyle w:val="Heading3"/>
       </w:pPr>
       <w:r>
+        <w:rPr>
+          <w:rFonts w:ascii="Arial" w:hAnsi="Arial" w:eastAsia="Arial" w:cs="Arial"/>
+        </w:rPr>
         <w:t>FIFO and LRU</w:t>
       </w:r>
     </w:p>
@@ -8941,6 +9076,9 @@
         <w:pStyle w:val="Heading3"/>
       </w:pPr>
       <w:r>
+        <w:rPr>
+          <w:rFonts w:ascii="Arial" w:hAnsi="Arial" w:eastAsia="Arial" w:cs="Arial"/>
+        </w:rPr>
         <w:t>Metrics and invariants</w:t>
       </w:r>
     </w:p>
@@ -9029,6 +9167,9 @@
         <w:pStyle w:val="Heading3"/>
       </w:pPr>
       <w:r>
+        <w:rPr>
+          <w:rFonts w:ascii="Arial" w:hAnsi="Arial" w:eastAsia="Arial" w:cs="Arial"/>
+        </w:rPr>
         <w:t>Native results</w:t>
       </w:r>
     </w:p>
@@ -9289,6 +9430,9 @@
         <w:pStyle w:val="Heading3"/>
       </w:pPr>
       <w:r>
+        <w:rPr>
+          <w:rFonts w:ascii="Arial" w:hAnsi="Arial" w:eastAsia="Arial" w:cs="Arial"/>
+        </w:rPr>
         <w:t>How these results were produced</w:t>
       </w:r>
     </w:p>
@@ -9336,7 +9480,7 @@
     </w:p>
     <w:p>
       <w:r>
-        <w:t>The result table in this manual selects the two-level, 64-frame rows. Faults fall with larger pages because the byte workload is fixed; each resident page covers more bytes. LRU beats FIFO on these locality rows because hot-page hits refresh last_access, while FIFO never changes loaded_at on a hit.</w:t>
+        <w:t>The result table selects the two-level, 64-frame rows. Faults fall with larger pages because the byte workload is fixed; each resident page covers more bytes. LRU beats FIFO on these locality rows because hot-page hits refresh last_access, while FIFO never changes loaded_at on a hit.</w:t>
       </w:r>
     </w:p>
     <w:p>
@@ -9344,6 +9488,9 @@
         <w:pStyle w:val="Heading3"/>
       </w:pPr>
       <w:r>
+        <w:rPr>
+          <w:rFonts w:ascii="Arial" w:hAnsi="Arial" w:eastAsia="Arial" w:cs="Arial"/>
+        </w:rPr>
         <w:t>Why hierarchy depth did not change those fault counts</w:t>
       </w:r>
     </w:p>
@@ -9357,7 +9504,10 @@
         <w:pStyle w:val="Heading3"/>
       </w:pPr>
       <w:r>
-        <w:t>Reproduce from a clean command directory</w:t>
+        <w:rPr>
+          <w:rFonts w:ascii="Arial" w:hAnsi="Arial" w:eastAsia="Arial" w:cs="Arial"/>
+        </w:rPr>
+        <w:t>Build and execution procedure</w:t>
       </w:r>
     </w:p>
     <w:p>
@@ -9470,9 +9620,13 @@
     <w:p>
       <w:pPr>
         <w:pStyle w:val="Heading3"/>
-      </w:pPr>
-      <w:r>
-        <w:t>Troubleshooting</w:t>
+        <w:spacing w:before="200" w:after="80"/>
+      </w:pPr>
+      <w:r>
+        <w:rPr>
+          <w:rFonts w:ascii="Arial" w:hAnsi="Arial" w:eastAsia="Arial" w:cs="Arial"/>
+        </w:rPr>
+        <w:t>Validation considerations</w:t>
       </w:r>
     </w:p>
     <w:p>
@@ -9527,6 +9681,9 @@
         <w:pStyle w:val="Heading3"/>
       </w:pPr>
       <w:r>
+        <w:rPr>
+          <w:rFonts w:ascii="Arial" w:hAnsi="Arial" w:eastAsia="Arial" w:cs="Arial"/>
+        </w:rPr>
         <w:t>Known-answer test</w:t>
       </w:r>
     </w:p>
@@ -9565,7 +9722,7 @@
     </w:p>
     <w:p>
       <w:r>
-        <w:t>This is a useful discussion point: LRU is not guaranteed to beat FIFO on every individual reference string. Its advantage appears for workloads with useful temporal locality.</w:t>
+        <w:t>LRU is not guaranteed to beat FIFO on every individual reference string. Its advantage appears for workloads with useful temporal locality.</w:t>
       </w:r>
     </w:p>
     <w:p>
@@ -9573,100 +9730,10 @@
         <w:pStyle w:val="Heading3"/>
       </w:pPr>
       <w:r>
-        <w:t>Demo</w:t>
-      </w:r>
-    </w:p>
-    <w:p>
-      <w:pPr>
-        <w:pStyle w:val="NoSpacing"/>
-        <w:spacing w:after="40"/>
-        <w:ind w:left="317"/>
-      </w:pPr>
-      <w:r>
-        <w:rPr>
-          <w:rFonts w:ascii="Consolas" w:hAnsi="Consolas"/>
-          <w:sz w:val="16"/>
-        </w:rPr>
-        <w:t>sed -n '1,120p' /etc/paging.conf</w:t>
-      </w:r>
-    </w:p>
-    <w:p>
-      <w:pPr>
-        <w:pStyle w:val="NoSpacing"/>
-        <w:spacing w:after="40"/>
-        <w:ind w:left="317"/>
-      </w:pPr>
-      <w:r>
-        <w:rPr>
-          <w:rFonts w:ascii="Consolas" w:hAnsi="Consolas"/>
-          <w:sz w:val="16"/>
-        </w:rPr>
-        <w:t>vmexperiment -c /etc/paging.conf</w:t>
-      </w:r>
-    </w:p>
-    <w:p>
-      <w:pPr>
-        <w:pStyle w:val="NoSpacing"/>
-        <w:spacing w:after="40"/>
-        <w:ind w:left="317"/>
-      </w:pPr>
-      <w:r>
-        <w:rPr>
-          <w:rFonts w:ascii="Consolas" w:hAnsi="Consolas"/>
-          <w:sz w:val="16"/>
-        </w:rPr>
-        <w:t>head -5 /tmp/vmexperiment.csv</w:t>
-      </w:r>
-    </w:p>
-    <w:p>
-      <w:pPr>
-        <w:pStyle w:val="NoSpacing"/>
-        <w:spacing w:after="40"/>
-        <w:ind w:left="317"/>
-      </w:pPr>
-      <w:r>
-        <w:rPr>
-          <w:rFonts w:ascii="Consolas" w:hAnsi="Consolas"/>
-          <w:sz w:val="16"/>
-        </w:rPr>
-      </w:r>
-    </w:p>
-    <w:p>
-      <w:pPr>
-        <w:pStyle w:val="NoSpacing"/>
-        <w:spacing w:after="40"/>
-        <w:ind w:left="317"/>
-      </w:pPr>
-      <w:r>
-        <w:rPr>
-          <w:rFonts w:ascii="Consolas" w:hAnsi="Consolas"/>
-          <w:sz w:val="16"/>
-        </w:rPr>
-        <w:t>cd /usr/src/minix/commands/vmexperiment/tests</w:t>
-      </w:r>
-    </w:p>
-    <w:p>
-      <w:pPr>
-        <w:pStyle w:val="NoSpacing"/>
-        <w:spacing w:after="40"/>
-        <w:ind w:left="317"/>
-      </w:pPr>
-      <w:r>
-        <w:rPr>
-          <w:rFonts w:ascii="Consolas" w:hAnsi="Consolas"/>
-          <w:sz w:val="16"/>
-        </w:rPr>
-        <w:t>sh test_known.sh</w:t>
-      </w:r>
-    </w:p>
-    <w:p>
-      <w:r>
-        <w:t>Expected final line: PASS: known FIFO/LRU reference string.</w:t>
-      </w:r>
-    </w:p>
-    <w:p>
-      <w:r>
-        <w:t>For a quick configuration demonstration, change frames, run the same seeded trace, and compare faults. Do not change multiple variables at once if you want to explain causation.</w:t>
+        <w:rPr>
+          <w:rFonts w:ascii="Arial" w:hAnsi="Arial" w:eastAsia="Arial" w:cs="Arial"/>
+        </w:rPr>
+        <w:t>Design rationale and limitations</w:t>
       </w:r>
     </w:p>
     <w:p>
@@ -9674,7 +9741,15 @@
         <w:pStyle w:val="Heading3"/>
       </w:pPr>
       <w:r>
-        <w:t>Likely questions and model answers</w:t>
+        <w:rPr>
+          <w:rFonts w:ascii="Arial" w:hAnsi="Arial" w:eastAsia="Arial" w:cs="Arial"/>
+        </w:rPr>
+        <w:t>Relationship to the hardware page table</w:t>
+      </w:r>
+    </w:p>
+    <w:p>
+      <w:r>
+        <w:t>No. It is a configurable hierarchy and replacement experiment running inside MINIX. The x86 hardware page format is fixed and cannot be changed arbitrarily from a text file. The final CSV leaves unreliable real VM telemetry fields as NA rather than mislabelling simulator results as hardware faults.</w:t>
       </w:r>
     </w:p>
     <w:p>
@@ -9682,12 +9757,15 @@
         <w:pStyle w:val="Heading3"/>
       </w:pPr>
       <w:r>
-        <w:t>Is this the hardware page table used by the CPU?</w:t>
-      </w:r>
-    </w:p>
-    <w:p>
-      <w:r>
-        <w:t>No. It is a configurable hierarchy and replacement experiment running inside MINIX. The x86 hardware page format is fixed and cannot be changed arbitrarily from a text file. The final CSV leaves unreliable real VM telemetry fields as NA rather than mislabelling simulator results as hardware faults.</w:t>
+        <w:rPr>
+          <w:rFonts w:ascii="Arial" w:hAnsi="Arial" w:eastAsia="Arial" w:cs="Arial"/>
+        </w:rPr>
+        <w:t>Purpose of hierarchical paging</w:t>
+      </w:r>
+    </w:p>
+    <w:p>
+      <w:r>
+        <w:t>A flat table needs space for all virtual pages. A hierarchy allocates lower levels only for used address regions, trading extra lookups for potentially much lower metadata memory on sparse address spaces.</w:t>
       </w:r>
     </w:p>
     <w:p>
@@ -9695,12 +9773,15 @@
         <w:pStyle w:val="Heading3"/>
       </w:pPr>
       <w:r>
-        <w:t>Why hierarchical paging?</w:t>
-      </w:r>
-    </w:p>
-    <w:p>
-      <w:r>
-        <w:t>A flat table needs space for all virtual pages. A hierarchy allocates lower levels only for used address regions, trading extra lookups for potentially much lower metadata memory on sparse address spaces.</w:t>
+        <w:rPr>
+          <w:rFonts w:ascii="Arial" w:hAnsi="Arial" w:eastAsia="Arial" w:cs="Arial"/>
+        </w:rPr>
+        <w:t>Hierarchy depth and page-fault frequency</w:t>
+      </w:r>
+    </w:p>
+    <w:p>
+      <w:r>
+        <w:t>Not by itself. Replacement faults depend on the page-reference sequence, page size, frames, and policy. More levels primarily change translation structure and metadata overhead.</w:t>
       </w:r>
     </w:p>
     <w:p>
@@ -9708,12 +9789,15 @@
         <w:pStyle w:val="Heading3"/>
       </w:pPr>
       <w:r>
-        <w:t>Does increasing levels reduce faults?</w:t>
-      </w:r>
-    </w:p>
-    <w:p>
-      <w:r>
-        <w:t>Not by itself. Replacement faults depend on the page-reference sequence, page size, frames, and policy. More levels primarily change translation structure and metadata overhead.</w:t>
+        <w:rPr>
+          <w:rFonts w:ascii="Arial" w:hAnsi="Arial" w:eastAsia="Arial" w:cs="Arial"/>
+        </w:rPr>
+        <w:t>Effect of page size in the collected results</w:t>
+      </w:r>
+    </w:p>
+    <w:p>
+      <w:r>
+        <w:t>The trace represents a fixed number of bytes. A larger page brings more of that working set into each frame, so fewer distinct pages are needed. The trade-off is possible fragmentation and unnecessary data transfer.</w:t>
       </w:r>
     </w:p>
     <w:p>
@@ -9721,12 +9805,15 @@
         <w:pStyle w:val="Heading3"/>
       </w:pPr>
       <w:r>
-        <w:t>Why do larger pages reduce faults in your results?</w:t>
-      </w:r>
-    </w:p>
-    <w:p>
-      <w:r>
-        <w:t>The trace represents a fixed number of bytes. A larger page brings more of that working set into each frame, so fewer distinct pages are needed. The trade-off is possible fragmentation and unnecessary data transfer.</w:t>
+        <w:rPr>
+          <w:rFonts w:ascii="Arial" w:hAnsi="Arial" w:eastAsia="Arial" w:cs="Arial"/>
+        </w:rPr>
+        <w:t>Known-test comparison of LRU and FIFO</w:t>
+      </w:r>
+    </w:p>
+    <w:p>
+      <w:r>
+        <w:t>Policy quality depends on the trace. The known string happens to favor FIFO. LRU's stack property prevents Belady's anomaly but does not mean it wins against every different algorithm on every trace.</w:t>
       </w:r>
     </w:p>
     <w:p>
@@ -9734,12 +9821,15 @@
         <w:pStyle w:val="Heading3"/>
       </w:pPr>
       <w:r>
-        <w:t>Why can LRU have 10 faults when FIFO has 9 in the known test?</w:t>
-      </w:r>
-    </w:p>
-    <w:p>
-      <w:r>
-        <w:t>Policy quality depends on the trace. The known string happens to favor FIFO. LRU's stack property prevents Belady's anomaly but does not mean it wins against every different algorithm on every trace.</w:t>
+        <w:rPr>
+          <w:rFonts w:ascii="Arial" w:hAnsi="Arial" w:eastAsia="Arial" w:cs="Arial"/>
+        </w:rPr>
+        <w:t>Belady's anomaly</w:t>
+      </w:r>
+    </w:p>
+    <w:p>
+      <w:r>
+        <w:t>For FIFO, increasing the number of frames can sometimes increase faults. Exact LRU cannot exhibit this for a fixed reference string because its resident sets have the stack property.</w:t>
       </w:r>
     </w:p>
     <w:p>
@@ -9747,12 +9837,15 @@
         <w:pStyle w:val="Heading3"/>
       </w:pPr>
       <w:r>
-        <w:t>What is Belady's anomaly?</w:t>
-      </w:r>
-    </w:p>
-    <w:p>
-      <w:r>
-        <w:t>For FIFO, increasing the number of frames can sometimes increase faults. Exact LRU cannot exhibit this for a fixed reference string because its resident sets have the stack property.</w:t>
+        <w:rPr>
+          <w:rFonts w:ascii="Arial" w:hAnsi="Arial" w:eastAsia="Arial" w:cs="Arial"/>
+        </w:rPr>
+        <w:t>Use of a fixed trace seed</w:t>
+      </w:r>
+    </w:p>
+    <w:p>
+      <w:r>
+        <w:t>It produces identical traces across policies and configurations, so observed differences come from the intended independent variable rather than random input changes.</w:t>
       </w:r>
     </w:p>
     <w:p>
@@ -9760,12 +9853,64 @@
         <w:pStyle w:val="Heading3"/>
       </w:pPr>
       <w:r>
-        <w:t>Why use a fixed seed?</w:t>
-      </w:r>
-    </w:p>
-    <w:p>
-      <w:r>
-        <w:t>It produces identical traces across policies and configurations, so observed differences come from the intended independent variable rather than random input changes.</w:t>
+        <w:rPr>
+          <w:rFonts w:ascii="Arial" w:hAnsi="Arial" w:eastAsia="Arial" w:cs="Arial"/>
+        </w:rPr>
+        <w:t>Scope limitations</w:t>
+      </w:r>
+    </w:p>
+    <w:p>
+      <w:pPr>
+        <w:pStyle w:val="ListBullet"/>
+      </w:pPr>
+      <w:r>
+        <w:t>The experiment does not change the CPU's hardware page size.</w:t>
+      </w:r>
+    </w:p>
+    <w:p>
+      <w:pPr>
+        <w:pStyle w:val="ListBullet"/>
+      </w:pPr>
+      <w:r>
+        <w:t>Simulator faults are distinct from hardware faults generated by a real process.</w:t>
+      </w:r>
+    </w:p>
+    <w:p>
+      <w:pPr>
+        <w:pStyle w:val="ListBullet"/>
+      </w:pPr>
+      <w:r>
+        <w:t>Increasing hierarchy depth does not automatically reduce page faults.</w:t>
+      </w:r>
+    </w:p>
+    <w:p>
+      <w:pPr>
+        <w:pStyle w:val="ListBullet"/>
+      </w:pPr>
+      <w:r>
+        <w:t>LRU is not guaranteed to produce fewer faults than FIFO for every trace.</w:t>
+      </w:r>
+    </w:p>
+    <w:p>
+      <w:pPr>
+        <w:pStyle w:val="Heading1"/>
+      </w:pPr>
+      <w:r>
+        <w:rPr>
+          <w:rFonts w:ascii="Arial" w:hAnsi="Arial" w:eastAsia="Arial" w:cs="Arial"/>
+        </w:rPr>
+        <w:t>12. Detailed Requirement 3 implementation and analysis</w:t>
+      </w:r>
+    </w:p>
+    <w:p>
+      <w:pPr>
+        <w:pStyle w:val="Heading2"/>
+      </w:pPr>
+      <w:r>
+        <w:rPr>
+          <w:rFonts w:ascii="Arial" w:hAnsi="Arial" w:eastAsia="Arial" w:cs="Arial"/>
+        </w:rPr>
+        <w:t>Requirement 3 - MFS extent allocation</w:t>
       </w:r>
     </w:p>
     <w:p>
@@ -9773,7 +9918,271 @@
         <w:pStyle w:val="Heading3"/>
       </w:pPr>
       <w:r>
-        <w:t>Claims to avoid</w:t>
+        <w:rPr>
+          <w:rFonts w:ascii="Arial" w:hAnsi="Arial" w:eastAsia="Arial" w:cs="Arial"/>
+        </w:rPr>
+        <w:t>What the specification asks for</w:t>
+      </w:r>
+    </w:p>
+    <w:p>
+      <w:r>
+        <w:t>Explain how MINIX manages free disk space, modify allocation to use a user-defined extent size, configure it from a file or service option, compare performance as extent blocks change, and understand how MINIX creates, reads, writes, and removes files and directories.</w:t>
+      </w:r>
+    </w:p>
+    <w:p>
+      <w:pPr>
+        <w:pStyle w:val="Heading3"/>
+      </w:pPr>
+      <w:r>
+        <w:rPr>
+          <w:rFonts w:ascii="Arial" w:hAnsi="Arial" w:eastAsia="Arial" w:cs="Arial"/>
+        </w:rPr>
+        <w:t>What changed from stock MINIX</w:t>
+      </w:r>
+    </w:p>
+    <w:p>
+      <w:r>
+        <w:t>Stock MFS begins bitmap allocation near a preferred zone but does not first require a user-selected free-run length. The project adds a read-only run scan, an exact first-bit origin, a bounded service option, counters, and a native I/O benchmark. The inode format, direct/indirect zone references, and freeing logic remain unchanged.</w:t>
+      </w:r>
+    </w:p>
+    <w:p>
+      <w:pPr>
+        <w:pStyle w:val="Heading3"/>
+      </w:pPr>
+      <w:r>
+        <w:rPr>
+          <w:rFonts w:ascii="Arial" w:hAnsi="Arial" w:eastAsia="Arial" w:cs="Arial"/>
+        </w:rPr>
+        <w:t>End-to-end execution flow</w:t>
+      </w:r>
+    </w:p>
+    <w:p>
+      <w:pPr>
+        <w:pStyle w:val="NoSpacing"/>
+        <w:spacing w:after="40"/>
+        <w:ind w:left="317"/>
+      </w:pPr>
+      <w:r>
+        <w:rPr>
+          <w:rFonts w:ascii="Consolas" w:hAnsi="Consolas"/>
+          <w:sz w:val="16"/>
+        </w:rPr>
+        <w:t>mount option mfs_extent_size=N       /etc/extent.conf</w:t>
+      </w:r>
+    </w:p>
+    <w:p>
+      <w:pPr>
+        <w:pStyle w:val="NoSpacing"/>
+        <w:spacing w:after="40"/>
+        <w:ind w:left="317"/>
+      </w:pPr>
+      <w:r>
+        <w:rPr>
+          <w:rFonts w:ascii="Consolas" w:hAnsi="Consolas"/>
+          <w:sz w:val="16"/>
+        </w:rPr>
+        <w:t xml:space="preserve">              |                              |</w:t>
+      </w:r>
+    </w:p>
+    <w:p>
+      <w:pPr>
+        <w:pStyle w:val="NoSpacing"/>
+        <w:spacing w:after="40"/>
+        <w:ind w:left="317"/>
+      </w:pPr>
+      <w:r>
+        <w:rPr>
+          <w:rFonts w:ascii="Consolas" w:hAnsi="Consolas"/>
+          <w:sz w:val="16"/>
+        </w:rPr>
+        <w:t xml:space="preserve">              v                              v</w:t>
+      </w:r>
+    </w:p>
+    <w:p>
+      <w:pPr>
+        <w:pStyle w:val="NoSpacing"/>
+        <w:spacing w:after="40"/>
+        <w:ind w:left="317"/>
+      </w:pPr>
+      <w:r>
+        <w:rPr>
+          <w:rFonts w:ascii="Consolas" w:hAnsi="Consolas"/>
+          <w:sz w:val="16"/>
+        </w:rPr>
+        <w:t>MFS main.c reads placement policy    benchmark parses I/O parameters</w:t>
+      </w:r>
+    </w:p>
+    <w:p>
+      <w:pPr>
+        <w:pStyle w:val="NoSpacing"/>
+        <w:spacing w:after="40"/>
+        <w:ind w:left="317"/>
+      </w:pPr>
+      <w:r>
+        <w:rPr>
+          <w:rFonts w:ascii="Consolas" w:hAnsi="Consolas"/>
+          <w:sz w:val="16"/>
+        </w:rPr>
+        <w:t xml:space="preserve">              |                              |</w:t>
+      </w:r>
+    </w:p>
+    <w:p>
+      <w:pPr>
+        <w:pStyle w:val="NoSpacing"/>
+        <w:spacing w:after="40"/>
+        <w:ind w:left="317"/>
+      </w:pPr>
+      <w:r>
+        <w:rPr>
+          <w:rFonts w:ascii="Consolas" w:hAnsi="Consolas"/>
+          <w:sz w:val="16"/>
+        </w:rPr>
+        <w:t xml:space="preserve">              v                              v</w:t>
+      </w:r>
+    </w:p>
+    <w:p>
+      <w:pPr>
+        <w:pStyle w:val="NoSpacing"/>
+        <w:spacing w:after="40"/>
+        <w:ind w:left="317"/>
+      </w:pPr>
+      <w:r>
+        <w:rPr>
+          <w:rFonts w:ascii="Consolas" w:hAnsi="Consolas"/>
+          <w:sz w:val="16"/>
+        </w:rPr>
+        <w:t>alloc_zone() scans for a free run    create directory and data.bin</w:t>
+      </w:r>
+    </w:p>
+    <w:p>
+      <w:pPr>
+        <w:pStyle w:val="NoSpacing"/>
+        <w:spacing w:after="40"/>
+        <w:ind w:left="317"/>
+      </w:pPr>
+      <w:r>
+        <w:rPr>
+          <w:rFonts w:ascii="Consolas" w:hAnsi="Consolas"/>
+          <w:sz w:val="16"/>
+        </w:rPr>
+        <w:t xml:space="preserve">              |                              |</w:t>
+      </w:r>
+    </w:p>
+    <w:p>
+      <w:pPr>
+        <w:pStyle w:val="NoSpacing"/>
+        <w:spacing w:after="40"/>
+        <w:ind w:left="317"/>
+      </w:pPr>
+      <w:r>
+        <w:rPr>
+          <w:rFonts w:ascii="Consolas" w:hAnsi="Consolas"/>
+          <w:sz w:val="16"/>
+        </w:rPr>
+        <w:t xml:space="preserve">              v                              v</w:t>
+      </w:r>
+    </w:p>
+    <w:p>
+      <w:pPr>
+        <w:pStyle w:val="NoSpacing"/>
+        <w:spacing w:after="40"/>
+        <w:ind w:left="317"/>
+      </w:pPr>
+      <w:r>
+        <w:rPr>
+          <w:rFonts w:ascii="Consolas" w:hAnsi="Consolas"/>
+          <w:sz w:val="16"/>
+        </w:rPr>
+        <w:t>alloc_bit() marks each assigned zone write -&gt; fsync -&gt; read -&gt; verify</w:t>
+      </w:r>
+    </w:p>
+    <w:p>
+      <w:pPr>
+        <w:pStyle w:val="NoSpacing"/>
+        <w:spacing w:after="40"/>
+        <w:ind w:left="317"/>
+      </w:pPr>
+      <w:r>
+        <w:rPr>
+          <w:rFonts w:ascii="Consolas" w:hAnsi="Consolas"/>
+          <w:sz w:val="16"/>
+        </w:rPr>
+        <w:t xml:space="preserve">              |                              |</w:t>
+      </w:r>
+    </w:p>
+    <w:p>
+      <w:pPr>
+        <w:pStyle w:val="NoSpacing"/>
+        <w:spacing w:after="40"/>
+        <w:ind w:left="317"/>
+      </w:pPr>
+      <w:r>
+        <w:rPr>
+          <w:rFonts w:ascii="Consolas" w:hAnsi="Consolas"/>
+          <w:sz w:val="16"/>
+        </w:rPr>
+        <w:t xml:space="preserve">              +--------------+---------------+</w:t>
+      </w:r>
+    </w:p>
+    <w:p>
+      <w:pPr>
+        <w:pStyle w:val="NoSpacing"/>
+        <w:spacing w:after="40"/>
+        <w:ind w:left="317"/>
+      </w:pPr>
+      <w:r>
+        <w:rPr>
+          <w:rFonts w:ascii="Consolas" w:hAnsi="Consolas"/>
+          <w:sz w:val="16"/>
+        </w:rPr>
+        <w:t xml:space="preserve">                             v</w:t>
+      </w:r>
+    </w:p>
+    <w:p>
+      <w:pPr>
+        <w:pStyle w:val="NoSpacing"/>
+        <w:spacing w:after="40"/>
+        <w:ind w:left="317"/>
+      </w:pPr>
+      <w:r>
+        <w:rPr>
+          <w:rFonts w:ascii="Consolas" w:hAnsi="Consolas"/>
+          <w:sz w:val="16"/>
+        </w:rPr>
+        <w:t xml:space="preserve">               CSV timings/errors + MFS counters</w:t>
+      </w:r>
+    </w:p>
+    <w:p>
+      <w:r>
+        <w:t>There are two controls because placement belongs to the MFS server, while file size, chunking, repetitions, and output belong to the benchmark process.</w:t>
+      </w:r>
+    </w:p>
+    <w:p>
+      <w:pPr>
+        <w:pStyle w:val="Heading3"/>
+        <w:spacing w:before="200" w:after="80"/>
+      </w:pPr>
+      <w:r>
+        <w:rPr>
+          <w:rFonts w:ascii="Arial" w:hAnsi="Arial" w:eastAsia="Arial" w:cs="Arial"/>
+        </w:rPr>
+        <w:t>Implementation summary</w:t>
+      </w:r>
+    </w:p>
+    <w:p>
+      <w:r>
+        <w:t>MFS manages free inodes and data zones with bitmaps. The project modifies the real MFS allocation path so the first zone allocation can search for a free run of mfs_extent_size zones and start normal bitmap allocation at the exact run origin. If no run exists, MFS safely falls back to stock allocation. A native benchmark performs real directory creation, file creation, deterministic writes, fsync, reads with byte verification, unlink, and directory removal on a disposable MFS image.</w:t>
+      </w:r>
+    </w:p>
+    <w:p>
+      <w:pPr>
+        <w:pStyle w:val="Heading3"/>
+      </w:pPr>
+      <w:r>
+        <w:rPr>
+          <w:rFonts w:ascii="Arial" w:hAnsi="Arial" w:eastAsia="Arial" w:cs="Arial"/>
+        </w:rPr>
+        <w:t>Blocks, zones, inodes, and bitmaps</w:t>
       </w:r>
     </w:p>
     <w:p>
@@ -9781,7 +10190,7 @@
         <w:pStyle w:val="ListBullet"/>
       </w:pPr>
       <w:r>
-        <w:t>Do not say the experiment changed the CPU's hardware page size.</w:t>
+        <w:t>A block is a unit of device/file-system I/O.</w:t>
       </w:r>
     </w:p>
     <w:p>
@@ -9789,7 +10198,12 @@
         <w:pStyle w:val="ListBullet"/>
       </w:pPr>
       <w:r>
-        <w:t>Do not call simulator faults real process hardware faults.</w:t>
+        <w:t>An MFS zone is the allocation unit referenced by file inodes. Depending on</w:t>
+      </w:r>
+    </w:p>
+    <w:p>
+      <w:r>
+        <w:t>file-system geometry, a zone can contain one or more blocks.</w:t>
       </w:r>
     </w:p>
     <w:p>
@@ -9797,7 +10211,7 @@
         <w:pStyle w:val="ListBullet"/>
       </w:pPr>
       <w:r>
-        <w:t>Do not say more hierarchy levels automatically reduce page faults.</w:t>
+        <w:t>An inode stores file metadata and direct/indirect zone references.</w:t>
       </w:r>
     </w:p>
     <w:p>
@@ -9805,23 +10219,28 @@
         <w:pStyle w:val="ListBullet"/>
       </w:pPr>
       <w:r>
-        <w:t>Do not say LRU always produces fewer faults than FIFO.</w:t>
-      </w:r>
-    </w:p>
-    <w:p>
-      <w:pPr>
-        <w:pStyle w:val="Heading1"/>
-      </w:pPr>
-      <w:r>
-        <w:t>12. Detailed Requirement 3 implementation and discussion manual</w:t>
-      </w:r>
-    </w:p>
-    <w:p>
-      <w:pPr>
-        <w:pStyle w:val="Heading2"/>
-      </w:pPr>
-      <w:r>
-        <w:t>Requirement 3 — MFS extent allocation discussion guide</w:t>
+        <w:t>The inode bitmap tracks free/used inodes.</w:t>
+      </w:r>
+    </w:p>
+    <w:p>
+      <w:pPr>
+        <w:pStyle w:val="ListBullet"/>
+      </w:pPr>
+      <w:r>
+        <w:t>The zone bitmap tracks free/used data zones. A zero bit is free; allocation</w:t>
+      </w:r>
+    </w:p>
+    <w:p>
+      <w:r>
+        <w:t>sets it and freeing clears it.</w:t>
+      </w:r>
+    </w:p>
+    <w:p>
+      <w:pPr>
+        <w:pStyle w:val="ListBullet"/>
+      </w:pPr>
+      <w:r>
+        <w:t>A directory is a special file containing name-to-inode mappings.</w:t>
       </w:r>
     </w:p>
     <w:p>
@@ -9829,320 +10248,9 @@
         <w:pStyle w:val="Heading3"/>
       </w:pPr>
       <w:r>
-        <w:t>What the specification asks for</w:t>
-      </w:r>
-    </w:p>
-    <w:p>
-      <w:r>
-        <w:t>Explain how MINIX manages free disk space, modify allocation to use a user-defined extent size, configure it from a file or service option, compare performance as extent blocks change, and understand how MINIX creates, reads, writes, and removes files and directories.</w:t>
-      </w:r>
-    </w:p>
-    <w:p>
-      <w:pPr>
-        <w:pStyle w:val="Heading3"/>
-      </w:pPr>
-      <w:r>
-        <w:t>What changed from stock MINIX</w:t>
-      </w:r>
-    </w:p>
-    <w:p>
-      <w:r>
-        <w:t>Stock MFS begins bitmap allocation near a preferred zone but does not first require a user-selected free-run length. The project adds a read-only run scan, an exact first-bit origin, a bounded service option, counters, and a native I/O benchmark. The inode format, direct/indirect zone references, and freeing logic remain unchanged.</w:t>
-      </w:r>
-    </w:p>
-    <w:p>
-      <w:pPr>
-        <w:pStyle w:val="Heading3"/>
-      </w:pPr>
-      <w:r>
-        <w:t>End-to-end execution flow</w:t>
-      </w:r>
-    </w:p>
-    <w:p>
-      <w:pPr>
-        <w:pStyle w:val="NoSpacing"/>
-        <w:spacing w:after="40"/>
-        <w:ind w:left="317"/>
-      </w:pPr>
-      <w:r>
-        <w:rPr>
-          <w:rFonts w:ascii="Consolas" w:hAnsi="Consolas"/>
-          <w:sz w:val="16"/>
-        </w:rPr>
-        <w:t>mount option mfs_extent_size=N       /etc/extent.conf</w:t>
-      </w:r>
-    </w:p>
-    <w:p>
-      <w:pPr>
-        <w:pStyle w:val="NoSpacing"/>
-        <w:spacing w:after="40"/>
-        <w:ind w:left="317"/>
-      </w:pPr>
-      <w:r>
-        <w:rPr>
-          <w:rFonts w:ascii="Consolas" w:hAnsi="Consolas"/>
-          <w:sz w:val="16"/>
-        </w:rPr>
-        <w:t xml:space="preserve">              |                              |</w:t>
-      </w:r>
-    </w:p>
-    <w:p>
-      <w:pPr>
-        <w:pStyle w:val="NoSpacing"/>
-        <w:spacing w:after="40"/>
-        <w:ind w:left="317"/>
-      </w:pPr>
-      <w:r>
-        <w:rPr>
-          <w:rFonts w:ascii="Consolas" w:hAnsi="Consolas"/>
-          <w:sz w:val="16"/>
-        </w:rPr>
-        <w:t xml:space="preserve">              v                              v</w:t>
-      </w:r>
-    </w:p>
-    <w:p>
-      <w:pPr>
-        <w:pStyle w:val="NoSpacing"/>
-        <w:spacing w:after="40"/>
-        <w:ind w:left="317"/>
-      </w:pPr>
-      <w:r>
-        <w:rPr>
-          <w:rFonts w:ascii="Consolas" w:hAnsi="Consolas"/>
-          <w:sz w:val="16"/>
-        </w:rPr>
-        <w:t>MFS main.c reads placement policy    benchmark parses I/O parameters</w:t>
-      </w:r>
-    </w:p>
-    <w:p>
-      <w:pPr>
-        <w:pStyle w:val="NoSpacing"/>
-        <w:spacing w:after="40"/>
-        <w:ind w:left="317"/>
-      </w:pPr>
-      <w:r>
-        <w:rPr>
-          <w:rFonts w:ascii="Consolas" w:hAnsi="Consolas"/>
-          <w:sz w:val="16"/>
-        </w:rPr>
-        <w:t xml:space="preserve">              |                              |</w:t>
-      </w:r>
-    </w:p>
-    <w:p>
-      <w:pPr>
-        <w:pStyle w:val="NoSpacing"/>
-        <w:spacing w:after="40"/>
-        <w:ind w:left="317"/>
-      </w:pPr>
-      <w:r>
-        <w:rPr>
-          <w:rFonts w:ascii="Consolas" w:hAnsi="Consolas"/>
-          <w:sz w:val="16"/>
-        </w:rPr>
-        <w:t xml:space="preserve">              v                              v</w:t>
-      </w:r>
-    </w:p>
-    <w:p>
-      <w:pPr>
-        <w:pStyle w:val="NoSpacing"/>
-        <w:spacing w:after="40"/>
-        <w:ind w:left="317"/>
-      </w:pPr>
-      <w:r>
-        <w:rPr>
-          <w:rFonts w:ascii="Consolas" w:hAnsi="Consolas"/>
-          <w:sz w:val="16"/>
-        </w:rPr>
-        <w:t>alloc_zone() scans for a free run    create directory and data.bin</w:t>
-      </w:r>
-    </w:p>
-    <w:p>
-      <w:pPr>
-        <w:pStyle w:val="NoSpacing"/>
-        <w:spacing w:after="40"/>
-        <w:ind w:left="317"/>
-      </w:pPr>
-      <w:r>
-        <w:rPr>
-          <w:rFonts w:ascii="Consolas" w:hAnsi="Consolas"/>
-          <w:sz w:val="16"/>
-        </w:rPr>
-        <w:t xml:space="preserve">              |                              |</w:t>
-      </w:r>
-    </w:p>
-    <w:p>
-      <w:pPr>
-        <w:pStyle w:val="NoSpacing"/>
-        <w:spacing w:after="40"/>
-        <w:ind w:left="317"/>
-      </w:pPr>
-      <w:r>
-        <w:rPr>
-          <w:rFonts w:ascii="Consolas" w:hAnsi="Consolas"/>
-          <w:sz w:val="16"/>
-        </w:rPr>
-        <w:t xml:space="preserve">              v                              v</w:t>
-      </w:r>
-    </w:p>
-    <w:p>
-      <w:pPr>
-        <w:pStyle w:val="NoSpacing"/>
-        <w:spacing w:after="40"/>
-        <w:ind w:left="317"/>
-      </w:pPr>
-      <w:r>
-        <w:rPr>
-          <w:rFonts w:ascii="Consolas" w:hAnsi="Consolas"/>
-          <w:sz w:val="16"/>
-        </w:rPr>
-        <w:t>alloc_bit() marks each assigned zone write -&gt; fsync -&gt; read -&gt; verify</w:t>
-      </w:r>
-    </w:p>
-    <w:p>
-      <w:pPr>
-        <w:pStyle w:val="NoSpacing"/>
-        <w:spacing w:after="40"/>
-        <w:ind w:left="317"/>
-      </w:pPr>
-      <w:r>
-        <w:rPr>
-          <w:rFonts w:ascii="Consolas" w:hAnsi="Consolas"/>
-          <w:sz w:val="16"/>
-        </w:rPr>
-        <w:t xml:space="preserve">              |                              |</w:t>
-      </w:r>
-    </w:p>
-    <w:p>
-      <w:pPr>
-        <w:pStyle w:val="NoSpacing"/>
-        <w:spacing w:after="40"/>
-        <w:ind w:left="317"/>
-      </w:pPr>
-      <w:r>
-        <w:rPr>
-          <w:rFonts w:ascii="Consolas" w:hAnsi="Consolas"/>
-          <w:sz w:val="16"/>
-        </w:rPr>
-        <w:t xml:space="preserve">              +--------------+---------------+</w:t>
-      </w:r>
-    </w:p>
-    <w:p>
-      <w:pPr>
-        <w:pStyle w:val="NoSpacing"/>
-        <w:spacing w:after="40"/>
-        <w:ind w:left="317"/>
-      </w:pPr>
-      <w:r>
-        <w:rPr>
-          <w:rFonts w:ascii="Consolas" w:hAnsi="Consolas"/>
-          <w:sz w:val="16"/>
-        </w:rPr>
-        <w:t xml:space="preserve">                             v</w:t>
-      </w:r>
-    </w:p>
-    <w:p>
-      <w:pPr>
-        <w:pStyle w:val="NoSpacing"/>
-        <w:spacing w:after="40"/>
-        <w:ind w:left="317"/>
-      </w:pPr>
-      <w:r>
-        <w:rPr>
-          <w:rFonts w:ascii="Consolas" w:hAnsi="Consolas"/>
-          <w:sz w:val="16"/>
-        </w:rPr>
-        <w:t xml:space="preserve">               CSV timings/errors + MFS counters</w:t>
-      </w:r>
-    </w:p>
-    <w:p>
-      <w:r>
-        <w:t>There are two controls because placement belongs to the MFS server, while file size, chunking, repetitions, and output belong to the benchmark process.</w:t>
-      </w:r>
-    </w:p>
-    <w:p>
-      <w:pPr>
-        <w:pStyle w:val="Heading3"/>
-      </w:pPr>
-      <w:r>
-        <w:t>30-second explanation</w:t>
-      </w:r>
-    </w:p>
-    <w:p>
-      <w:r>
-        <w:t>MFS manages free inodes and data zones with bitmaps. The project modifies the real MFS allocation path so the first zone allocation can search for a free run of mfs_extent_size zones and start normal bitmap allocation at the exact run origin. If no run exists, MFS safely falls back to stock allocation. A native benchmark performs real directory creation, file creation, deterministic writes, fsync, reads with byte verification, unlink, and directory removal on a disposable MFS image.</w:t>
-      </w:r>
-    </w:p>
-    <w:p>
-      <w:pPr>
-        <w:pStyle w:val="Heading3"/>
-      </w:pPr>
-      <w:r>
-        <w:t>Blocks, zones, inodes, and bitmaps</w:t>
-      </w:r>
-    </w:p>
-    <w:p>
-      <w:pPr>
-        <w:pStyle w:val="ListBullet"/>
-      </w:pPr>
-      <w:r>
-        <w:t>A block is a unit of device/file-system I/O.</w:t>
-      </w:r>
-    </w:p>
-    <w:p>
-      <w:pPr>
-        <w:pStyle w:val="ListBullet"/>
-      </w:pPr>
-      <w:r>
-        <w:t>An MFS zone is the allocation unit referenced by file inodes. Depending on</w:t>
-      </w:r>
-    </w:p>
-    <w:p>
-      <w:r>
-        <w:t>file-system geometry, a zone can contain one or more blocks.</w:t>
-      </w:r>
-    </w:p>
-    <w:p>
-      <w:pPr>
-        <w:pStyle w:val="ListBullet"/>
-      </w:pPr>
-      <w:r>
-        <w:t>An inode stores file metadata and direct/indirect zone references.</w:t>
-      </w:r>
-    </w:p>
-    <w:p>
-      <w:pPr>
-        <w:pStyle w:val="ListBullet"/>
-      </w:pPr>
-      <w:r>
-        <w:t>The inode bitmap tracks free/used inodes.</w:t>
-      </w:r>
-    </w:p>
-    <w:p>
-      <w:pPr>
-        <w:pStyle w:val="ListBullet"/>
-      </w:pPr>
-      <w:r>
-        <w:t>The zone bitmap tracks free/used data zones. A zero bit is free; allocation</w:t>
-      </w:r>
-    </w:p>
-    <w:p>
-      <w:r>
-        <w:t>sets it and freeing clears it.</w:t>
-      </w:r>
-    </w:p>
-    <w:p>
-      <w:pPr>
-        <w:pStyle w:val="ListBullet"/>
-      </w:pPr>
-      <w:r>
-        <w:t>A directory is a special file containing name-to-inode mappings.</w:t>
-      </w:r>
-    </w:p>
-    <w:p>
-      <w:pPr>
-        <w:pStyle w:val="Heading3"/>
-      </w:pPr>
-      <w:r>
+        <w:rPr>
+          <w:rFonts w:ascii="Arial" w:hAnsi="Arial" w:eastAsia="Arial" w:cs="Arial"/>
+        </w:rPr>
         <w:t>Architecture and code map</w:t>
       </w:r>
     </w:p>
@@ -10436,7 +10544,10 @@
         <w:pStyle w:val="Heading3"/>
       </w:pPr>
       <w:r>
-        <w:t>Exact code to study</w:t>
+        <w:rPr>
+          <w:rFonts w:ascii="Arial" w:hAnsi="Arial" w:eastAsia="Arial" w:cs="Arial"/>
+        </w:rPr>
+        <w:t>Key implementation excerpts</w:t>
       </w:r>
     </w:p>
     <w:p>
@@ -10444,6 +10555,9 @@
         <w:pStyle w:val="Heading3"/>
       </w:pPr>
       <w:r>
+        <w:rPr>
+          <w:rFonts w:ascii="Arial" w:hAnsi="Arial" w:eastAsia="Arial" w:cs="Arial"/>
+        </w:rPr>
         <w:t>1. Finding consecutive free zone bits — cache.c:47-75</w:t>
       </w:r>
     </w:p>
@@ -10873,7 +10987,7 @@
     </w:p>
     <w:p>
       <w:r>
-        <w:t>Likely question: How does the scan wrap? It first searches from the normal origin to the end; if unsuccessful, it searches from bit 1 back to the origin.</w:t>
+        <w:t>The run scan wraps by searching from the normal origin to the bitmap end and, if unsuccessful, from bit 1 back to the origin.</w:t>
       </w:r>
     </w:p>
     <w:p>
@@ -10881,6 +10995,9 @@
         <w:pStyle w:val="Heading3"/>
       </w:pPr>
       <w:r>
+        <w:rPr>
+          <w:rFonts w:ascii="Arial" w:hAnsi="Arial" w:eastAsia="Arial" w:cs="Arial"/>
+        </w:rPr>
         <w:t>2. Connecting the run to normal allocation — cache.c:101-119</w:t>
       </w:r>
     </w:p>
@@ -11153,7 +11270,7 @@
     </w:p>
     <w:p>
       <w:r>
-        <w:t>Likely question: Where is the safe fallback? If find_zone_run() returns NO_BIT, bit is not replaced, and alloc_bit() receives the original search origin.</w:t>
+        <w:t>The fallback remains safe because a NO_BIT result leaves the original search origin unchanged before alloc_bit() is called.</w:t>
       </w:r>
     </w:p>
     <w:p>
@@ -11161,6 +11278,9 @@
         <w:pStyle w:val="Heading3"/>
       </w:pPr>
       <w:r>
+        <w:rPr>
+          <w:rFonts w:ascii="Arial" w:hAnsi="Arial" w:eastAsia="Arial" w:cs="Arial"/>
+        </w:rPr>
         <w:t>3. Honoring the exact origin bit — super.c:64-108</w:t>
       </w:r>
     </w:p>
@@ -11622,7 +11742,7 @@
     </w:p>
     <w:p>
       <w:r>
-        <w:t>Likely question: Why reset first_bit to zero? The offset applies only to the first bitmap word. Every later word must be scanned from its first bit.</w:t>
+        <w:t>The first_bit offset applies only to the initial bitmap word; every later word is scanned from bit zero.</w:t>
       </w:r>
     </w:p>
     <w:p>
@@ -11630,6 +11750,9 @@
         <w:pStyle w:val="Heading3"/>
       </w:pPr>
       <w:r>
+        <w:rPr>
+          <w:rFonts w:ascii="Arial" w:hAnsi="Arial" w:eastAsia="Arial" w:cs="Arial"/>
+        </w:rPr>
         <w:t>4. Reading the MFS service option — main.c:35-43</w:t>
       </w:r>
     </w:p>
@@ -11749,7 +11872,7 @@
     </w:p>
     <w:p>
       <w:r>
-        <w:t>Likely question: What happens without the option? The default is one zone, which bypasses the run search and preserves ordinary behavior.</w:t>
+        <w:t>Without the service option, the default is one zone, so the run search is bypassed and ordinary allocation behavior is preserved.</w:t>
       </w:r>
     </w:p>
     <w:p>
@@ -11757,6 +11880,9 @@
         <w:pStyle w:val="Heading3"/>
       </w:pPr>
       <w:r>
+        <w:rPr>
+          <w:rFonts w:ascii="Arial" w:hAnsi="Arial" w:eastAsia="Arial" w:cs="Arial"/>
+        </w:rPr>
         <w:t>5. Real read-back verification — extentexperiment.c:176-223</w:t>
       </w:r>
     </w:p>
@@ -12147,7 +12273,7 @@
     </w:p>
     <w:p>
       <w:r>
-        <w:t>Likely question: Why is byte verification more important than throughput? A fast write/read result is meaningless if the returned data is corrupted.</w:t>
+        <w:t>Byte verification is evaluated before throughput because a fast write/read result is invalid when the returned data is corrupted.</w:t>
       </w:r>
     </w:p>
     <w:p>
@@ -12155,6 +12281,9 @@
         <w:pStyle w:val="Heading3"/>
       </w:pPr>
       <w:r>
+        <w:rPr>
+          <w:rFonts w:ascii="Arial" w:hAnsi="Arial" w:eastAsia="Arial" w:cs="Arial"/>
+        </w:rPr>
         <w:t>What changed in the allocator</w:t>
       </w:r>
     </w:p>
@@ -12213,6 +12342,9 @@
         <w:pStyle w:val="Heading3"/>
       </w:pPr>
       <w:r>
+        <w:rPr>
+          <w:rFonts w:ascii="Arial" w:hAnsi="Arial" w:eastAsia="Arial" w:cs="Arial"/>
+        </w:rPr>
         <w:t>Why this is safe</w:t>
       </w:r>
     </w:p>
@@ -12231,6 +12363,9 @@
         <w:pStyle w:val="Heading3"/>
       </w:pPr>
       <w:r>
+        <w:rPr>
+          <w:rFonts w:ascii="Arial" w:hAnsi="Arial" w:eastAsia="Arial" w:cs="Arial"/>
+        </w:rPr>
         <w:t>Two configuration layers</w:t>
       </w:r>
     </w:p>
@@ -12352,6 +12487,9 @@
         <w:pStyle w:val="Heading3"/>
       </w:pPr>
       <w:r>
+        <w:rPr>
+          <w:rFonts w:ascii="Arial" w:hAnsi="Arial" w:eastAsia="Arial" w:cs="Arial"/>
+        </w:rPr>
         <w:t>File and directory benchmark path</w:t>
       </w:r>
     </w:p>
@@ -12434,6 +12572,9 @@
         <w:pStyle w:val="Heading3"/>
       </w:pPr>
       <w:r>
+        <w:rPr>
+          <w:rFonts w:ascii="Arial" w:hAnsi="Arial" w:eastAsia="Arial" w:cs="Arial"/>
+        </w:rPr>
         <w:t>Metrics and native results</w:t>
       </w:r>
     </w:p>
@@ -12882,6 +13023,9 @@
         <w:pStyle w:val="Heading3"/>
       </w:pPr>
       <w:r>
+        <w:rPr>
+          <w:rFonts w:ascii="Arial" w:hAnsi="Arial" w:eastAsia="Arial" w:cs="Arial"/>
+        </w:rPr>
         <w:t>How these results were produced</w:t>
       </w:r>
     </w:p>
@@ -12961,6 +13105,9 @@
         <w:pStyle w:val="Heading3"/>
       </w:pPr>
       <w:r>
+        <w:rPr>
+          <w:rFonts w:ascii="Arial" w:hAnsi="Arial" w:eastAsia="Arial" w:cs="Arial"/>
+        </w:rPr>
         <w:t>Interpreting performance responsibly</w:t>
       </w:r>
     </w:p>
@@ -12974,7 +13121,10 @@
         <w:pStyle w:val="Heading3"/>
       </w:pPr>
       <w:r>
-        <w:t>Reproduce from clean source</w:t>
+        <w:rPr>
+          <w:rFonts w:ascii="Arial" w:hAnsi="Arial" w:eastAsia="Arial" w:cs="Arial"/>
+        </w:rPr>
+        <w:t>Build and execution procedure</w:t>
       </w:r>
     </w:p>
     <w:p>
@@ -13177,9 +13327,13 @@
     <w:p>
       <w:pPr>
         <w:pStyle w:val="Heading3"/>
-      </w:pPr>
-      <w:r>
-        <w:t>Troubleshooting</w:t>
+        <w:spacing w:before="200" w:after="80"/>
+      </w:pPr>
+      <w:r>
+        <w:rPr>
+          <w:rFonts w:ascii="Arial" w:hAnsi="Arial" w:eastAsia="Arial" w:cs="Arial"/>
+        </w:rPr>
+        <w:t>Validation considerations</w:t>
       </w:r>
     </w:p>
     <w:p>
@@ -13242,125 +13396,10 @@
         <w:pStyle w:val="Heading3"/>
       </w:pPr>
       <w:r>
-        <w:t>Demo</w:t>
-      </w:r>
-    </w:p>
-    <w:p>
-      <w:r>
-        <w:t>Safe correctness demo:</w:t>
-      </w:r>
-    </w:p>
-    <w:p>
-      <w:pPr>
-        <w:pStyle w:val="NoSpacing"/>
-        <w:spacing w:after="40"/>
-        <w:ind w:left="317"/>
-      </w:pPr>
-      <w:r>
-        <w:rPr>
-          <w:rFonts w:ascii="Consolas" w:hAnsi="Consolas"/>
-          <w:sz w:val="16"/>
-        </w:rPr>
-        <w:t>sed -n '1,100p' /etc/extent.conf</w:t>
-      </w:r>
-    </w:p>
-    <w:p>
-      <w:pPr>
-        <w:pStyle w:val="NoSpacing"/>
-        <w:spacing w:after="40"/>
-        <w:ind w:left="317"/>
-      </w:pPr>
-      <w:r>
-        <w:rPr>
-          <w:rFonts w:ascii="Consolas" w:hAnsi="Consolas"/>
-          <w:sz w:val="16"/>
-        </w:rPr>
-        <w:t>cd /usr/src/minix/commands/extentexperiment/tests</w:t>
-      </w:r>
-    </w:p>
-    <w:p>
-      <w:pPr>
-        <w:pStyle w:val="NoSpacing"/>
-        <w:spacing w:after="40"/>
-        <w:ind w:left="317"/>
-      </w:pPr>
-      <w:r>
-        <w:rPr>
-          <w:rFonts w:ascii="Consolas" w:hAnsi="Consolas"/>
-          <w:sz w:val="16"/>
-        </w:rPr>
-        <w:t>sh test_known.sh</w:t>
-      </w:r>
-    </w:p>
-    <w:p>
-      <w:pPr>
-        <w:pStyle w:val="NoSpacing"/>
-        <w:spacing w:after="40"/>
-        <w:ind w:left="317"/>
-      </w:pPr>
-      <w:r>
-        <w:rPr>
-          <w:rFonts w:ascii="Consolas" w:hAnsi="Consolas"/>
-          <w:sz w:val="16"/>
-        </w:rPr>
-        <w:t>tail -16 /root/native-validation.txt</w:t>
-      </w:r>
-    </w:p>
-    <w:p>
-      <w:r>
-        <w:t>Expected final line: PASS: extent file/directory I/O and data verification.</w:t>
-      </w:r>
-    </w:p>
-    <w:p>
-      <w:r>
-        <w:t>Only perform a live mount demo if /dev/vnd0 is confirmed as the disposable image:</w:t>
-      </w:r>
-    </w:p>
-    <w:p>
-      <w:pPr>
-        <w:pStyle w:val="NoSpacing"/>
-        <w:spacing w:after="40"/>
-        <w:ind w:left="317"/>
-      </w:pPr>
-      <w:r>
-        <w:rPr>
-          <w:rFonts w:ascii="Consolas" w:hAnsi="Consolas"/>
-          <w:sz w:val="16"/>
-        </w:rPr>
-        <w:t>mount -t mfs -o mfs_extent_size=8 /dev/vnd0 /mnt/extenttest</w:t>
-      </w:r>
-    </w:p>
-    <w:p>
-      <w:pPr>
-        <w:pStyle w:val="NoSpacing"/>
-        <w:spacing w:after="40"/>
-        <w:ind w:left="317"/>
-      </w:pPr>
-      <w:r>
-        <w:rPr>
-          <w:rFonts w:ascii="Consolas" w:hAnsi="Consolas"/>
-          <w:sz w:val="16"/>
-        </w:rPr>
-        <w:t>extentexperiment -c /etc/extent.conf</w:t>
-      </w:r>
-    </w:p>
-    <w:p>
-      <w:pPr>
-        <w:pStyle w:val="NoSpacing"/>
-        <w:spacing w:after="40"/>
-        <w:ind w:left="317"/>
-      </w:pPr>
-      <w:r>
-        <w:rPr>
-          <w:rFonts w:ascii="Consolas" w:hAnsi="Consolas"/>
-          <w:sz w:val="16"/>
-        </w:rPr>
-        <w:t>umount /mnt/extenttest</w:t>
-      </w:r>
-    </w:p>
-    <w:p>
-      <w:r>
-        <w:t>Unmounting prints the MFS extent statistics. Never substitute the root or /usr device.</w:t>
+        <w:rPr>
+          <w:rFonts w:ascii="Arial" w:hAnsi="Arial" w:eastAsia="Arial" w:cs="Arial"/>
+        </w:rPr>
+        <w:t>Design rationale and limitations</w:t>
       </w:r>
     </w:p>
     <w:p>
@@ -13368,7 +13407,15 @@
         <w:pStyle w:val="Heading3"/>
       </w:pPr>
       <w:r>
-        <w:t>Likely questions and model answers</w:t>
+        <w:rPr>
+          <w:rFonts w:ascii="Arial" w:hAnsi="Arial" w:eastAsia="Arial" w:cs="Arial"/>
+        </w:rPr>
+        <w:t>Stock MFS free-space allocation</w:t>
+      </w:r>
+    </w:p>
+    <w:p>
+      <w:r>
+        <w:t>It uses inode and zone bitmaps. alloc_zone() converts a preferred zone to a bitmap origin, and alloc_bit() scans for a zero bit, sets it, marks the bitmap buffer dirty, and updates accounting.</w:t>
       </w:r>
     </w:p>
     <w:p>
@@ -13376,12 +13423,15 @@
         <w:pStyle w:val="Heading3"/>
       </w:pPr>
       <w:r>
-        <w:t>How does stock MFS find free space?</w:t>
-      </w:r>
-    </w:p>
-    <w:p>
-      <w:r>
-        <w:t>It uses inode and zone bitmaps. alloc_zone() converts a preferred zone to a bitmap origin, and alloc_bit() scans for a zero bit, sets it, marks the bitmap buffer dirty, and updates accounting.</w:t>
+        <w:rPr>
+          <w:rFonts w:ascii="Arial" w:hAnsi="Arial" w:eastAsia="Arial" w:cs="Arial"/>
+        </w:rPr>
+        <w:t>Roles of cache.c and super.c</w:t>
+      </w:r>
+    </w:p>
+    <w:p>
+      <w:r>
+        <w:t>cache.c finds the start of a sufficiently long free run. super.c must honor that exact bit inside the first bitmap word. Otherwise the allocator may start at an earlier zero bit and defeat the run selection.</w:t>
       </w:r>
     </w:p>
     <w:p>
@@ -13389,12 +13439,15 @@
         <w:pStyle w:val="Heading3"/>
       </w:pPr>
       <w:r>
-        <w:t>Why modify both cache.c and super.c?</w:t>
-      </w:r>
-    </w:p>
-    <w:p>
-      <w:r>
-        <w:t>cache.c finds the start of a sufficiently long free run. super.c must honor that exact bit inside the first bitmap word. Otherwise the allocator may start at an earlier zero bit and defeat the run selection.</w:t>
+        <w:rPr>
+          <w:rFonts w:ascii="Arial" w:hAnsi="Arial" w:eastAsia="Arial" w:cs="Arial"/>
+        </w:rPr>
+        <w:t>Extent reservation behavior</w:t>
+      </w:r>
+    </w:p>
+    <w:p>
+      <w:r>
+        <w:t>No. Reserving zones without inode references could leak space after a crash and would require new metadata and recovery rules. Existing bitmap allocation marks each zone only when it is assigned.</w:t>
       </w:r>
     </w:p>
     <w:p>
@@ -13402,12 +13455,15 @@
         <w:pStyle w:val="Heading3"/>
       </w:pPr>
       <w:r>
-        <w:t>Do you reserve the whole extent immediately?</w:t>
-      </w:r>
-    </w:p>
-    <w:p>
-      <w:r>
-        <w:t>No. Reserving zones without inode references could leak space after a crash and would require new metadata and recovery rules. Existing bitmap allocation marks each zone only when it is assigned.</w:t>
+        <w:rPr>
+          <w:rFonts w:ascii="Arial" w:hAnsi="Arial" w:eastAsia="Arial" w:cs="Arial"/>
+        </w:rPr>
+        <w:t>On-disk format compatibility</w:t>
+      </w:r>
+    </w:p>
+    <w:p>
+      <w:r>
+        <w:t>No. Inodes still use the normal direct and indirect zone references. The change is an extent-biased placement policy and instrumentation, preserving format compatibility.</w:t>
       </w:r>
     </w:p>
     <w:p>
@@ -13415,12 +13471,15 @@
         <w:pStyle w:val="Heading3"/>
       </w:pPr>
       <w:r>
-        <w:t>Is this a new on-disk extent-based file format?</w:t>
-      </w:r>
-    </w:p>
-    <w:p>
-      <w:r>
-        <w:t>No. Inodes still use the normal direct and indirect zone references. The change is an extent-biased placement policy and instrumentation, preserving format compatibility.</w:t>
+        <w:rPr>
+          <w:rFonts w:ascii="Arial" w:hAnsi="Arial" w:eastAsia="Arial" w:cs="Arial"/>
+        </w:rPr>
+        <w:t>Behavior under free-space fragmentation</w:t>
+      </w:r>
+    </w:p>
+    <w:p>
+      <w:r>
+        <w:t>If no run of the requested size exists, MFS increments the fallback counter and uses the original allocation search. Correctness is preserved, but contiguity is not guaranteed.</w:t>
       </w:r>
     </w:p>
     <w:p>
@@ -13428,12 +13487,15 @@
         <w:pStyle w:val="Heading3"/>
       </w:pPr>
       <w:r>
-        <w:t>What happens on fragmented free space?</w:t>
-      </w:r>
-    </w:p>
-    <w:p>
-      <w:r>
-        <w:t>If no run of the requested size exists, MFS increments the fallback counter and uses the original allocation search. Correctness is preserved, but contiguity is not guaranteed.</w:t>
+        <w:rPr>
+          <w:rFonts w:ascii="Arial" w:hAnsi="Arial" w:eastAsia="Arial" w:cs="Arial"/>
+        </w:rPr>
+        <w:t>Use of a disposable MFS image</w:t>
+      </w:r>
+    </w:p>
+    <w:p>
+      <w:r>
+        <w:t>Rebuilding and remounting a file-system server or formatting the wrong device can destroy the VM. A secondary image isolates the experiment and can be reset between cases for comparable free-space conditions.</w:t>
       </w:r>
     </w:p>
     <w:p>
@@ -13441,12 +13503,15 @@
         <w:pStyle w:val="Heading3"/>
       </w:pPr>
       <w:r>
-        <w:t>Why use a disposable image?</w:t>
-      </w:r>
-    </w:p>
-    <w:p>
-      <w:r>
-        <w:t>Rebuilding and remounting a file-system server or formatting the wrong device can destroy the VM. A secondary image isolates the experiment and can be reset between cases for comparable free-space conditions.</w:t>
+        <w:rPr>
+          <w:rFonts w:ascii="Arial" w:hAnsi="Arial" w:eastAsia="Arial" w:cs="Arial"/>
+        </w:rPr>
+        <w:t>Relationship between searches and CSV rows</w:t>
+      </w:r>
+    </w:p>
+    <w:p>
+      <w:r>
+        <w:t>Each of the three iterations creates a new subdirectory and a new data file. Both need a first-zone allocation, so MFS performs two preferred-run searches per iteration: six searches in total. Every search hit and none fell back.</w:t>
       </w:r>
     </w:p>
     <w:p>
@@ -13454,12 +13519,15 @@
         <w:pStyle w:val="Heading3"/>
       </w:pPr>
       <w:r>
-        <w:t>Why are there six searches per extent size but only three CSV rows?</w:t>
-      </w:r>
-    </w:p>
-    <w:p>
-      <w:r>
-        <w:t>Each of the three iterations creates a new subdirectory and a new data file. Both need a first-zone allocation, so MFS performs two preferred-run searches per iteration: six searches in total. Every search hit and none fell back.</w:t>
+        <w:rPr>
+          <w:rFonts w:ascii="Arial" w:hAnsi="Arial" w:eastAsia="Arial" w:cs="Arial"/>
+        </w:rPr>
+        <w:t>Comparison with a persistent extent implementation</w:t>
+      </w:r>
+    </w:p>
+    <w:p>
+      <w:r>
+        <w:t>It would require persistent metadata describing extent start and length, atomic reservation, freeing and truncation rules, crash recovery, and updates to tools such as fsck. This project deliberately avoids changing the on-disk format.</w:t>
       </w:r>
     </w:p>
     <w:p>
@@ -13467,20 +13535,10 @@
         <w:pStyle w:val="Heading3"/>
       </w:pPr>
       <w:r>
-        <w:t>How would a hard extent implementation differ?</w:t>
-      </w:r>
-    </w:p>
-    <w:p>
-      <w:r>
-        <w:t>It would require persistent metadata describing extent start and length, atomic reservation, freeing and truncation rules, crash recovery, and updates to tools such as fsck. This project deliberately avoids changing the on-disk format.</w:t>
-      </w:r>
-    </w:p>
-    <w:p>
-      <w:pPr>
-        <w:pStyle w:val="Heading3"/>
-      </w:pPr>
-      <w:r>
-        <w:t>Claims to avoid</w:t>
+        <w:rPr>
+          <w:rFonts w:ascii="Arial" w:hAnsi="Arial" w:eastAsia="Arial" w:cs="Arial"/>
+        </w:rPr>
+        <w:t>Scope limitations</w:t>
       </w:r>
     </w:p>
     <w:p>
@@ -13488,7 +13546,7 @@
         <w:pStyle w:val="ListBullet"/>
       </w:pPr>
       <w:r>
-        <w:t>Do not claim the entire run is atomically reserved.</w:t>
+        <w:t>The entire preferred run is not reserved atomically.</w:t>
       </w:r>
     </w:p>
     <w:p>
@@ -13496,7 +13554,7 @@
         <w:pStyle w:val="ListBullet"/>
       </w:pPr>
       <w:r>
-        <w:t>Do not claim MFS now stores files in a new persistent extent tree.</w:t>
+        <w:t>MFS continues to use its existing zone references rather than a persistent extent tree.</w:t>
       </w:r>
     </w:p>
     <w:p>
@@ -13504,7 +13562,7 @@
         <w:pStyle w:val="ListBullet"/>
       </w:pPr>
       <w:r>
-        <w:t>Do not claim zero-microsecond rows mean infinite throughput.</w:t>
+        <w:t>Zero-microsecond rows reflect timer resolution and do not indicate infinite throughput.</w:t>
       </w:r>
     </w:p>
     <w:p>
@@ -13512,7 +13570,7 @@
         <w:pStyle w:val="ListBullet"/>
       </w:pPr>
       <w:r>
-        <w:t>Do not perform a live format or mount until the disposable device is verified.</w:t>
+        <w:t>Formatting or mounting is restricted to a verified disposable device.</w:t>
       </w:r>
     </w:p>
     <w:p>
@@ -13520,780 +13578,10 @@
         <w:pStyle w:val="Heading1"/>
       </w:pPr>
       <w:r>
-        <w:t>13. Installation, configuration, validation and demonstration runbook</w:t>
-      </w:r>
-    </w:p>
-    <w:p>
-      <w:pPr>
-        <w:pStyle w:val="Heading2"/>
-      </w:pPr>
-      <w:r>
-        <w:t>CSE335 demo and discussion guide</w:t>
-      </w:r>
-    </w:p>
-    <w:p>
-      <w:r>
-        <w:t>For the full implementation and result-production workflow, begin with the project manual.</w:t>
-      </w:r>
-    </w:p>
-    <w:p>
-      <w:r>
-        <w:t>Use this folder to divide preparation between the team. Each owner should read the guide for their requirement, inspect the named source files, and practice the short explanation and demo before the discussion.</w:t>
-      </w:r>
-    </w:p>
-    <w:tbl>
-      <w:tblPr>
-        <w:tblStyle w:val="TableGrid"/>
-        <w:tblW w:type="auto" w:w="0"/>
-        <w:jc w:val="left"/>
-        <w:tblLayout w:type="fixed"/>
-        <w:tblLook w:firstColumn="1" w:firstRow="1" w:lastColumn="0" w:lastRow="0" w:noHBand="0" w:noVBand="1" w:val="04A0"/>
-      </w:tblPr>
-      <w:tblGrid>
-        <w:gridCol w:w="3293"/>
-        <w:gridCol w:w="3293"/>
-        <w:gridCol w:w="3293"/>
-      </w:tblGrid>
-      <w:tr>
-        <w:tc>
-          <w:tcPr>
-            <w:tcW w:type="dxa" w:w="3133"/>
-            <w:shd w:fill="F2F4F7"/>
-          </w:tcPr>
-          <w:p>
-            <w:r>
-              <w:rPr>
-                <w:b/>
-                <w:sz w:val="17"/>
-              </w:rPr>
-              <w:t>Requirement</w:t>
-            </w:r>
-          </w:p>
-        </w:tc>
-        <w:tc>
-          <w:tcPr>
-            <w:tcW w:type="dxa" w:w="3133"/>
-            <w:shd w:fill="F2F4F7"/>
-          </w:tcPr>
-          <w:p>
-            <w:r>
-              <w:rPr>
-                <w:b/>
-                <w:sz w:val="17"/>
-              </w:rPr>
-              <w:t>Guide</w:t>
-            </w:r>
-          </w:p>
-        </w:tc>
-        <w:tc>
-          <w:tcPr>
-            <w:tcW w:type="dxa" w:w="3133"/>
-            <w:shd w:fill="F2F4F7"/>
-          </w:tcPr>
-          <w:p>
-            <w:r>
-              <w:rPr>
-                <w:b/>
-                <w:sz w:val="17"/>
-              </w:rPr>
-              <w:t>What the owner must be able to explain</w:t>
-            </w:r>
-          </w:p>
-        </w:tc>
-      </w:tr>
-      <w:tr>
-        <w:tc>
-          <w:tcPr>
-            <w:tcW w:type="dxa" w:w="3133"/>
-            <w:vAlign w:val="center"/>
-          </w:tcPr>
-          <w:p>
-            <w:r>
-              <w:rPr>
-                <w:sz w:val="17"/>
-              </w:rPr>
-              <w:t>1 — scheduling</w:t>
-            </w:r>
-          </w:p>
-        </w:tc>
-        <w:tc>
-          <w:tcPr>
-            <w:tcW w:type="dxa" w:w="3133"/>
-            <w:vAlign w:val="center"/>
-          </w:tcPr>
-          <w:p>
-            <w:r>
-              <w:rPr>
-                <w:sz w:val="17"/>
-              </w:rPr>
-              <w:t>requirement-1-scheduling.md</w:t>
-            </w:r>
-          </w:p>
-        </w:tc>
-        <w:tc>
-          <w:tcPr>
-            <w:tcW w:type="dxa" w:w="3133"/>
-            <w:vAlign w:val="center"/>
-          </w:tcPr>
-          <w:p>
-            <w:r>
-              <w:rPr>
-                <w:sz w:val="17"/>
-              </w:rPr>
-              <w:t>RR, SJF, priority, MLFQ, real workers, metrics, and results</w:t>
-            </w:r>
-          </w:p>
-        </w:tc>
-      </w:tr>
-      <w:tr>
-        <w:tc>
-          <w:tcPr>
-            <w:tcW w:type="dxa" w:w="3133"/>
-            <w:vAlign w:val="center"/>
-          </w:tcPr>
-          <w:p>
-            <w:r>
-              <w:rPr>
-                <w:sz w:val="17"/>
-              </w:rPr>
-              <w:t>2 — paging</w:t>
-            </w:r>
-          </w:p>
-        </w:tc>
-        <w:tc>
-          <w:tcPr>
-            <w:tcW w:type="dxa" w:w="3133"/>
-            <w:vAlign w:val="center"/>
-          </w:tcPr>
-          <w:p>
-            <w:r>
-              <w:rPr>
-                <w:sz w:val="17"/>
-              </w:rPr>
-              <w:t>requirement-2-paging.md</w:t>
-            </w:r>
-          </w:p>
-        </w:tc>
-        <w:tc>
-          <w:tcPr>
-            <w:tcW w:type="dxa" w:w="3133"/>
-            <w:vAlign w:val="center"/>
-          </w:tcPr>
-          <w:p>
-            <w:r>
-              <w:rPr>
-                <w:sz w:val="17"/>
-              </w:rPr>
-              <w:t>hierarchy geometry, FIFO/LRU, trace control, faults, and limitations</w:t>
-            </w:r>
-          </w:p>
-        </w:tc>
-      </w:tr>
-      <w:tr>
-        <w:tc>
-          <w:tcPr>
-            <w:tcW w:type="dxa" w:w="3133"/>
-            <w:vAlign w:val="center"/>
-          </w:tcPr>
-          <w:p>
-            <w:r>
-              <w:rPr>
-                <w:sz w:val="17"/>
-              </w:rPr>
-              <w:t>3 — MFS extents</w:t>
-            </w:r>
-          </w:p>
-        </w:tc>
-        <w:tc>
-          <w:tcPr>
-            <w:tcW w:type="dxa" w:w="3133"/>
-            <w:vAlign w:val="center"/>
-          </w:tcPr>
-          <w:p>
-            <w:r>
-              <w:rPr>
-                <w:sz w:val="17"/>
-              </w:rPr>
-              <w:t>requirement-3-mfs-extents.md</w:t>
-            </w:r>
-          </w:p>
-        </w:tc>
-        <w:tc>
-          <w:tcPr>
-            <w:tcW w:type="dxa" w:w="3133"/>
-            <w:vAlign w:val="center"/>
-          </w:tcPr>
-          <w:p>
-            <w:r>
-              <w:rPr>
-                <w:sz w:val="17"/>
-              </w:rPr>
-              <w:t>MFS bitmaps, free-run preference, safe fallback, real I/O, and results</w:t>
-            </w:r>
-          </w:p>
-        </w:tc>
-      </w:tr>
-    </w:tbl>
-    <w:p>
-      <w:pPr>
-        <w:pStyle w:val="Heading3"/>
-      </w:pPr>
-      <w:r>
-        <w:t>Five-minute team demo order</w:t>
-      </w:r>
-    </w:p>
-    <w:p>
-      <w:pPr>
-        <w:pStyle w:val="ListNumber"/>
-      </w:pPr>
-      <w:r>
-        <w:t>Prove the platform: uname -a and explain that compilation and execution</w:t>
-      </w:r>
-    </w:p>
-    <w:p>
-      <w:r>
-        <w:t>were performed inside MINIX 3.3.0.</w:t>
-      </w:r>
-    </w:p>
-    <w:p>
-      <w:pPr>
-        <w:pStyle w:val="ListNumber"/>
-      </w:pPr>
-      <w:r>
-        <w:t>Show the three configuration files under /etc.</w:t>
-      </w:r>
-    </w:p>
-    <w:p>
-      <w:pPr>
-        <w:pStyle w:val="ListNumber"/>
-      </w:pPr>
-      <w:r>
-        <w:t>Run the three deterministic tests. These are the fastest correctness proof.</w:t>
-      </w:r>
-    </w:p>
-    <w:p>
-      <w:pPr>
-        <w:pStyle w:val="ListNumber"/>
-      </w:pPr>
-      <w:r>
-        <w:t>Show one CSV result from each requirement and explain one important row.</w:t>
-      </w:r>
-    </w:p>
-    <w:p>
-      <w:pPr>
-        <w:pStyle w:val="ListNumber"/>
-      </w:pPr>
-      <w:r>
-        <w:t>Show /root/native-validation.txt for the complete PASS summary, row counts,</w:t>
-      </w:r>
-    </w:p>
-    <w:p>
-      <w:r>
-        <w:t>checksums, and MFS counters.</w:t>
-      </w:r>
-    </w:p>
-    <w:p>
-      <w:pPr>
-        <w:pStyle w:val="NoSpacing"/>
-        <w:spacing w:after="40"/>
-        <w:ind w:left="317"/>
-      </w:pPr>
-      <w:r>
-        <w:rPr>
-          <w:rFonts w:ascii="Consolas" w:hAnsi="Consolas"/>
-          <w:sz w:val="16"/>
-        </w:rPr>
-        <w:t>uname -a</w:t>
-      </w:r>
-    </w:p>
-    <w:p>
-      <w:pPr>
-        <w:pStyle w:val="NoSpacing"/>
-        <w:spacing w:after="40"/>
-        <w:ind w:left="317"/>
-      </w:pPr>
-      <w:r>
-        <w:rPr>
-          <w:rFonts w:ascii="Consolas" w:hAnsi="Consolas"/>
-          <w:sz w:val="16"/>
-        </w:rPr>
-      </w:r>
-    </w:p>
-    <w:p>
-      <w:pPr>
-        <w:pStyle w:val="NoSpacing"/>
-        <w:spacing w:after="40"/>
-        <w:ind w:left="317"/>
-      </w:pPr>
-      <w:r>
-        <w:rPr>
-          <w:rFonts w:ascii="Consolas" w:hAnsi="Consolas"/>
-          <w:sz w:val="16"/>
-        </w:rPr>
-        <w:t>cd /usr/src/minix/commands/schedexperiment/tests &amp;&amp; sh test_known.sh</w:t>
-      </w:r>
-    </w:p>
-    <w:p>
-      <w:pPr>
-        <w:pStyle w:val="NoSpacing"/>
-        <w:spacing w:after="40"/>
-        <w:ind w:left="317"/>
-      </w:pPr>
-      <w:r>
-        <w:rPr>
-          <w:rFonts w:ascii="Consolas" w:hAnsi="Consolas"/>
-          <w:sz w:val="16"/>
-        </w:rPr>
-        <w:t>cd /usr/src/minix/commands/vmexperiment/tests &amp;&amp; sh test_known.sh</w:t>
-      </w:r>
-    </w:p>
-    <w:p>
-      <w:pPr>
-        <w:pStyle w:val="NoSpacing"/>
-        <w:spacing w:after="40"/>
-        <w:ind w:left="317"/>
-      </w:pPr>
-      <w:r>
-        <w:rPr>
-          <w:rFonts w:ascii="Consolas" w:hAnsi="Consolas"/>
-          <w:sz w:val="16"/>
-        </w:rPr>
-        <w:t>cd /usr/src/minix/commands/extentexperiment/tests &amp;&amp; sh test_known.sh</w:t>
-      </w:r>
-    </w:p>
-    <w:p>
-      <w:pPr>
-        <w:pStyle w:val="NoSpacing"/>
-        <w:spacing w:after="40"/>
-        <w:ind w:left="317"/>
-      </w:pPr>
-      <w:r>
-        <w:rPr>
-          <w:rFonts w:ascii="Consolas" w:hAnsi="Consolas"/>
-          <w:sz w:val="16"/>
-        </w:rPr>
-      </w:r>
-    </w:p>
-    <w:p>
-      <w:pPr>
-        <w:pStyle w:val="NoSpacing"/>
-        <w:spacing w:after="40"/>
-        <w:ind w:left="317"/>
-      </w:pPr>
-      <w:r>
-        <w:rPr>
-          <w:rFonts w:ascii="Consolas" w:hAnsi="Consolas"/>
-          <w:sz w:val="16"/>
-        </w:rPr>
-        <w:t>sed -n '1,80p' /etc/scheduler.conf</w:t>
-      </w:r>
-    </w:p>
-    <w:p>
-      <w:pPr>
-        <w:pStyle w:val="NoSpacing"/>
-        <w:spacing w:after="40"/>
-        <w:ind w:left="317"/>
-      </w:pPr>
-      <w:r>
-        <w:rPr>
-          <w:rFonts w:ascii="Consolas" w:hAnsi="Consolas"/>
-          <w:sz w:val="16"/>
-        </w:rPr>
-        <w:t>sed -n '1,80p' /etc/paging.conf</w:t>
-      </w:r>
-    </w:p>
-    <w:p>
-      <w:pPr>
-        <w:pStyle w:val="NoSpacing"/>
-        <w:spacing w:after="40"/>
-        <w:ind w:left="317"/>
-      </w:pPr>
-      <w:r>
-        <w:rPr>
-          <w:rFonts w:ascii="Consolas" w:hAnsi="Consolas"/>
-          <w:sz w:val="16"/>
-        </w:rPr>
-        <w:t>sed -n '1,80p' /etc/extent.conf</w:t>
-      </w:r>
-    </w:p>
-    <w:p>
-      <w:pPr>
-        <w:pStyle w:val="NoSpacing"/>
-        <w:spacing w:after="40"/>
-        <w:ind w:left="317"/>
-      </w:pPr>
-      <w:r>
-        <w:rPr>
-          <w:rFonts w:ascii="Consolas" w:hAnsi="Consolas"/>
-          <w:sz w:val="16"/>
-        </w:rPr>
-      </w:r>
-    </w:p>
-    <w:p>
-      <w:pPr>
-        <w:pStyle w:val="NoSpacing"/>
-        <w:spacing w:after="40"/>
-        <w:ind w:left="317"/>
-      </w:pPr>
-      <w:r>
-        <w:rPr>
-          <w:rFonts w:ascii="Consolas" w:hAnsi="Consolas"/>
-          <w:sz w:val="16"/>
-        </w:rPr>
-        <w:t>sed -n '1,30p' /root/native-validation.txt</w:t>
-      </w:r>
-    </w:p>
-    <w:p>
-      <w:r>
-        <w:t>Expected test output:</w:t>
-      </w:r>
-    </w:p>
-    <w:p>
-      <w:pPr>
-        <w:pStyle w:val="NoSpacing"/>
-        <w:spacing w:after="40"/>
-        <w:ind w:left="317"/>
-      </w:pPr>
-      <w:r>
-        <w:rPr>
-          <w:rFonts w:ascii="Consolas" w:hAnsi="Consolas"/>
-          <w:sz w:val="16"/>
-        </w:rPr>
-        <w:t>PASS: known scheduling workload</w:t>
-      </w:r>
-    </w:p>
-    <w:p>
-      <w:pPr>
-        <w:pStyle w:val="NoSpacing"/>
-        <w:spacing w:after="40"/>
-        <w:ind w:left="317"/>
-      </w:pPr>
-      <w:r>
-        <w:rPr>
-          <w:rFonts w:ascii="Consolas" w:hAnsi="Consolas"/>
-          <w:sz w:val="16"/>
-        </w:rPr>
-        <w:t>PASS: known FIFO/LRU reference string</w:t>
-      </w:r>
-    </w:p>
-    <w:p>
-      <w:pPr>
-        <w:pStyle w:val="NoSpacing"/>
-        <w:spacing w:after="40"/>
-        <w:ind w:left="317"/>
-      </w:pPr>
-      <w:r>
-        <w:rPr>
-          <w:rFonts w:ascii="Consolas" w:hAnsi="Consolas"/>
-          <w:sz w:val="16"/>
-        </w:rPr>
-        <w:t>PASS: extent file/directory I/O and data verification</w:t>
-      </w:r>
-    </w:p>
-    <w:p>
-      <w:pPr>
-        <w:pStyle w:val="Heading3"/>
-      </w:pPr>
-      <w:r>
-        <w:t>Facts every team member should know</w:t>
-      </w:r>
-    </w:p>
-    <w:p>
-      <w:pPr>
-        <w:pStyle w:val="ListBullet"/>
-      </w:pPr>
-      <w:r>
-        <w:t>The baseline is the official MINIX 3.3.0 source, tagged</w:t>
-      </w:r>
-    </w:p>
-    <w:p>
-      <w:r>
-        <w:t>baseline-v3.3.0 in Git.</w:t>
-      </w:r>
-    </w:p>
-    <w:p>
-      <w:pPr>
-        <w:pStyle w:val="ListBullet"/>
-      </w:pPr>
-      <w:r>
-        <w:t>Requirement 1 is a controlled user-space dispatcher running real MINIX child</w:t>
-      </w:r>
-    </w:p>
-    <w:p>
-      <w:r>
-        <w:t>processes. It does not replace the production kernel scheduler.</w:t>
-      </w:r>
-    </w:p>
-    <w:p>
-      <w:pPr>
-        <w:pStyle w:val="ListBullet"/>
-      </w:pPr>
-      <w:r>
-        <w:t>Requirement 2 is a configurable paging and replacement model compiled and</w:t>
-      </w:r>
-    </w:p>
-    <w:p>
-      <w:r>
-        <w:t>run natively in MINIX. It does not reconfigure the x86 MMU.</w:t>
-      </w:r>
-    </w:p>
-    <w:p>
-      <w:pPr>
-        <w:pStyle w:val="ListBullet"/>
-      </w:pPr>
-      <w:r>
-        <w:t>Requirement 3 modifies the real MFS zone-allocation path.</w:t>
-      </w:r>
-    </w:p>
-    <w:p>
-      <w:pPr>
-        <w:pStyle w:val="ListBullet"/>
-      </w:pPr>
-      <w:r>
-        <w:t>Every experiment reads a text configuration and writes CSV evidence.</w:t>
-      </w:r>
-    </w:p>
-    <w:p>
-      <w:pPr>
-        <w:pStyle w:val="ListBullet"/>
-      </w:pPr>
-      <w:r>
-        <w:t>Native evidence contains 80 scheduling rows, 72 paging rows, and 18 extent</w:t>
-      </w:r>
-    </w:p>
-    <w:p>
-      <w:r>
-        <w:t>rows. The validation file has 173 total CSV lines because it includes three headers.</w:t>
-      </w:r>
-    </w:p>
-    <w:p>
-      <w:pPr>
-        <w:pStyle w:val="ListBullet"/>
-      </w:pPr>
-      <w:r>
-        <w:t>The extent benchmark reported zero verification errors. MFS found every</w:t>
-      </w:r>
-    </w:p>
-    <w:p>
-      <w:r>
-        <w:t>requested run from 2 through 32 zones with zero fallbacks in the native run.</w:t>
-      </w:r>
-    </w:p>
-    <w:p>
-      <w:pPr>
-        <w:pStyle w:val="Heading3"/>
-      </w:pPr>
-      <w:r>
-        <w:t>Questions likely to be asked to the whole group</w:t>
-      </w:r>
-    </w:p>
-    <w:p>
-      <w:pPr>
-        <w:pStyle w:val="Heading3"/>
-      </w:pPr>
-      <w:r>
-        <w:t>Why did you start from MINIX 3.3.0 rather than the current GitHub branch?</w:t>
-      </w:r>
-    </w:p>
-    <w:p>
-      <w:r>
-        <w:t>The VM and course project target MINIX 3.3.0. A newer source tree can have different headers, server interfaces, and build files. Matching the source to the running image prevents version-mismatch errors.</w:t>
-      </w:r>
-    </w:p>
-    <w:p>
-      <w:pPr>
-        <w:pStyle w:val="Heading3"/>
-      </w:pPr>
-      <w:r>
-        <w:t>How do you prove the results were not invented on Windows?</w:t>
-      </w:r>
-    </w:p>
-    <w:p>
-      <w:r>
-        <w:t>The commands and modified MFS server were built with the native MINIX toolchain. The repository contains the raw CSV files, native test output, OS identity, matrix checksums, and VirtualBox console screenshots.</w:t>
-      </w:r>
-    </w:p>
-    <w:p>
-      <w:pPr>
-        <w:pStyle w:val="Heading3"/>
-      </w:pPr>
-      <w:r>
-        <w:t>What is the difference between correctness and performance tests?</w:t>
-      </w:r>
-    </w:p>
-    <w:p>
-      <w:r>
-        <w:t>The known tests have exact expected answers or byte verification and must pass first. The matrices then vary configuration values and collect performance metrics. A fast run with a wrong expected result is still a failure.</w:t>
-      </w:r>
-    </w:p>
-    <w:p>
-      <w:pPr>
-        <w:pStyle w:val="Heading3"/>
-      </w:pPr>
-      <w:r>
-        <w:t>What would you improve with more time?</w:t>
-      </w:r>
-    </w:p>
-    <w:p>
-      <w:pPr>
-        <w:pStyle w:val="ListBullet"/>
-      </w:pPr>
-      <w:r>
-        <w:t>Repeat wall-clock measurements and report medians and ranges.</w:t>
-      </w:r>
-    </w:p>
-    <w:p>
-      <w:pPr>
-        <w:pStyle w:val="ListBullet"/>
-      </w:pPr>
-      <w:r>
-        <w:t>Add larger and more varied workloads.</w:t>
-      </w:r>
-    </w:p>
-    <w:p>
-      <w:pPr>
-        <w:pStyle w:val="ListBullet"/>
-      </w:pPr>
-      <w:r>
-        <w:t>Integrate scheduling policies into the production scheduling server.</w:t>
-      </w:r>
-    </w:p>
-    <w:p>
-      <w:pPr>
-        <w:pStyle w:val="ListBullet"/>
-      </w:pPr>
-      <w:r>
-        <w:t>Add a real swap-backed VM replacement path for process pages.</w:t>
-      </w:r>
-    </w:p>
-    <w:p>
-      <w:pPr>
-        <w:pStyle w:val="ListBullet"/>
-      </w:pPr>
-      <w:r>
-        <w:t>Add persistent extent metadata if hard extent guarantees are required.</w:t>
-      </w:r>
-    </w:p>
-    <w:p>
-      <w:pPr>
-        <w:pStyle w:val="Heading3"/>
-      </w:pPr>
-      <w:r>
-        <w:t>Demo safety</w:t>
-      </w:r>
-    </w:p>
-    <w:p>
-      <w:pPr>
-        <w:pStyle w:val="ListBullet"/>
-      </w:pPr>
-      <w:r>
-        <w:t>Take a VM snapshot before replacing or remounting MFS.</w:t>
-      </w:r>
-    </w:p>
-    <w:p>
-      <w:pPr>
-        <w:pStyle w:val="ListBullet"/>
-      </w:pPr>
-      <w:r>
-        <w:t>Never format the root or /usr device.</w:t>
-      </w:r>
-    </w:p>
-    <w:p>
-      <w:pPr>
-        <w:pStyle w:val="ListBullet"/>
-      </w:pPr>
-      <w:r>
-        <w:t>Requirement 3 should use only the disposable /dev/vnd0 image.</w:t>
-      </w:r>
-    </w:p>
-    <w:p>
-      <w:pPr>
-        <w:pStyle w:val="ListBullet"/>
-      </w:pPr>
-      <w:r>
-        <w:t>If time is short, show the archived native validation instead of rebuilding</w:t>
-      </w:r>
-    </w:p>
-    <w:p>
-      <w:r>
-        <w:t>MFS live.</w:t>
-      </w:r>
-    </w:p>
-    <w:p>
-      <w:pPr>
-        <w:pStyle w:val="ListBullet"/>
-      </w:pPr>
-      <w:r>
-        <w:t>Do not say a simulated page fault is a hardware page fault, a logical</w:t>
-      </w:r>
-    </w:p>
-    <w:p>
-      <w:r>
-        <w:t>dispatch is a kernel context switch, or an allocation preference is a new persistent extent file format.</w:t>
-      </w:r>
-    </w:p>
-    <w:p>
-      <w:pPr>
-        <w:pStyle w:val="Heading3"/>
-      </w:pPr>
-      <w:r>
-        <w:t>Last-minute checklist</w:t>
-      </w:r>
-    </w:p>
-    <w:p>
-      <w:pPr>
-        <w:pStyle w:val="ListBullet"/>
-      </w:pPr>
-      <w:r>
-        <w:t>[ ] Each owner can explain their requirement without reading the report.</w:t>
-      </w:r>
-    </w:p>
-    <w:p>
-      <w:pPr>
-        <w:pStyle w:val="ListBullet"/>
-      </w:pPr>
-      <w:r>
-        <w:t>[ ] Each owner can point to the main source function and configuration file.</w:t>
-      </w:r>
-    </w:p>
-    <w:p>
-      <w:pPr>
-        <w:pStyle w:val="ListBullet"/>
-      </w:pPr>
-      <w:r>
-        <w:t>[ ] Each owner can explain one result and one limitation.</w:t>
-      </w:r>
-    </w:p>
-    <w:p>
-      <w:pPr>
-        <w:pStyle w:val="ListBullet"/>
-      </w:pPr>
-      <w:r>
-        <w:t>[ ] The VM boots and the three known tests are available.</w:t>
-      </w:r>
-    </w:p>
-    <w:p>
-      <w:pPr>
-        <w:pStyle w:val="ListBullet"/>
-      </w:pPr>
-      <w:r>
-        <w:t>[ ] Native CSV files and native-validation.txt are easy to locate.</w:t>
-      </w:r>
-    </w:p>
-    <w:p>
-      <w:pPr>
-        <w:pStyle w:val="ListBullet"/>
-      </w:pPr>
-      <w:r>
-        <w:t>[ ] The team knows who will control the VM during the demonstration.</w:t>
-      </w:r>
-    </w:p>
-    <w:p>
-      <w:pPr>
-        <w:pStyle w:val="Heading1"/>
-      </w:pPr>
-      <w:r>
-        <w:t>14. References</w:t>
+        <w:rPr>
+          <w:rFonts w:ascii="Arial" w:hAnsi="Arial" w:eastAsia="Arial" w:cs="Arial"/>
+        </w:rPr>
+        <w:t>13. References</w:t>
       </w:r>
     </w:p>
     <w:p>

</xml_diff>

<commit_message>
docs: add Rodina to submission team
</commit_message>
<xml_diff>
--- a/project-deliverables/CSE335_MINIX_Project_Report.docx
+++ b/project-deliverables/CSE335_MINIX_Project_Report.docx
@@ -258,6 +258,36 @@
                 <w:sz w:val="17"/>
               </w:rPr>
               <w:t>2300672</w:t>
+            </w:r>
+          </w:p>
+        </w:tc>
+      </w:tr>
+      <w:tr>
+        <w:tc>
+          <w:tcPr>
+            <w:tcW w:type="dxa" w:w="6600"/>
+            <w:vAlign w:val="center"/>
+          </w:tcPr>
+          <w:p>
+            <w:r>
+              <w:rPr>
+                <w:sz w:val="17"/>
+              </w:rPr>
+              <w:t>Rodina Mohamed</w:t>
+            </w:r>
+          </w:p>
+        </w:tc>
+        <w:tc>
+          <w:tcPr>
+            <w:tcW w:type="dxa" w:w="2700"/>
+            <w:vAlign w:val="center"/>
+          </w:tcPr>
+          <w:p>
+            <w:r>
+              <w:rPr>
+                <w:sz w:val="17"/>
+              </w:rPr>
+              <w:t>23P0191</w:t>
             </w:r>
           </w:p>
         </w:tc>

</xml_diff>